<commit_message>
Corrige extensao das imagens e sombreamento das tabelas nos docx
</commit_message>
<xml_diff>
--- a/reports/relatorio_executivo_olist.docx
+++ b/reports/relatorio_executivo_olist.docx
@@ -210,7 +210,7 @@
       <w:tr>
         <w:tc>
           <w:tcPr>
-            <w:shd w:fill="1F4E79"/>
+            <w:shd w:fill="1F4E79" w:color="auto" w:val="clear"/>
             <w:tcMar>
               <w:top w:type="dxa" w:w="60"/>
               <w:left w:type="dxa" w:w="110"/>
@@ -237,7 +237,7 @@
         </w:tc>
         <w:tc>
           <w:tcPr>
-            <w:shd w:fill="1F4E79"/>
+            <w:shd w:fill="1F4E79" w:color="auto" w:val="clear"/>
             <w:tcMar>
               <w:top w:type="dxa" w:w="60"/>
               <w:left w:type="dxa" w:w="110"/>
@@ -1036,7 +1036,7 @@
       <w:tr>
         <w:tc>
           <w:tcPr>
-            <w:shd w:fill="1F4E79"/>
+            <w:shd w:fill="1F4E79" w:color="auto" w:val="clear"/>
             <w:tcMar>
               <w:top w:type="dxa" w:w="60"/>
               <w:left w:type="dxa" w:w="110"/>
@@ -1063,7 +1063,7 @@
         </w:tc>
         <w:tc>
           <w:tcPr>
-            <w:shd w:fill="1F4E79"/>
+            <w:shd w:fill="1F4E79" w:color="auto" w:val="clear"/>
             <w:tcMar>
               <w:top w:type="dxa" w:w="60"/>
               <w:left w:type="dxa" w:w="110"/>
@@ -1542,7 +1542,7 @@
       <w:r>
         <w:drawing>
           <wp:inline distT="0" distB="0" distL="0" distR="0">
-            <wp:extent cx="5143500" cy="2828925"/>
+            <wp:extent cx="5143500" cy="2571750"/>
             <wp:effectExtent t="0" r="0" b="0" l="0"/>
             <wp:docPr id="1" name="" descr="" title=""/>
             <wp:cNvGraphicFramePr>
@@ -1567,7 +1567,7 @@
                   <pic:spPr bwMode="auto">
                     <a:xfrm>
                       <a:off x="0" y="0"/>
-                      <a:ext cx="5143500" cy="2828925"/>
+                      <a:ext cx="5143500" cy="2571750"/>
                     </a:xfrm>
                     <a:prstGeom prst="rect">
                       <a:avLst/>
@@ -1697,7 +1697,7 @@
       <w:r>
         <w:drawing>
           <wp:inline distT="0" distB="0" distL="0" distR="0">
-            <wp:extent cx="5143500" cy="2828925"/>
+            <wp:extent cx="5143500" cy="2057400"/>
             <wp:effectExtent t="0" r="0" b="0" l="0"/>
             <wp:docPr id="1" name="" descr="" title=""/>
             <wp:cNvGraphicFramePr>
@@ -1722,7 +1722,7 @@
                   <pic:spPr bwMode="auto">
                     <a:xfrm>
                       <a:off x="0" y="0"/>
-                      <a:ext cx="5143500" cy="2828925"/>
+                      <a:ext cx="5143500" cy="2057400"/>
                     </a:xfrm>
                     <a:prstGeom prst="rect">
                       <a:avLst/>
@@ -1826,7 +1826,7 @@
       <w:r>
         <w:drawing>
           <wp:inline distT="0" distB="0" distL="0" distR="0">
-            <wp:extent cx="5143500" cy="2828925"/>
+            <wp:extent cx="5143500" cy="2571750"/>
             <wp:effectExtent t="0" r="0" b="0" l="0"/>
             <wp:docPr id="1" name="" descr="" title=""/>
             <wp:cNvGraphicFramePr>
@@ -1851,7 +1851,7 @@
                   <pic:spPr bwMode="auto">
                     <a:xfrm>
                       <a:off x="0" y="0"/>
-                      <a:ext cx="5143500" cy="2828925"/>
+                      <a:ext cx="5143500" cy="2571750"/>
                     </a:xfrm>
                     <a:prstGeom prst="rect">
                       <a:avLst/>
@@ -1910,7 +1910,7 @@
       <w:tr>
         <w:tc>
           <w:tcPr>
-            <w:shd w:fill="1F4E79"/>
+            <w:shd w:fill="1F4E79" w:color="auto" w:val="clear"/>
             <w:tcMar>
               <w:top w:type="dxa" w:w="60"/>
               <w:left w:type="dxa" w:w="110"/>
@@ -1937,7 +1937,7 @@
         </w:tc>
         <w:tc>
           <w:tcPr>
-            <w:shd w:fill="1F4E79"/>
+            <w:shd w:fill="1F4E79" w:color="auto" w:val="clear"/>
             <w:tcMar>
               <w:top w:type="dxa" w:w="60"/>
               <w:left w:type="dxa" w:w="110"/>
@@ -1964,7 +1964,7 @@
         </w:tc>
         <w:tc>
           <w:tcPr>
-            <w:shd w:fill="1F4E79"/>
+            <w:shd w:fill="1F4E79" w:color="auto" w:val="clear"/>
             <w:tcMar>
               <w:top w:type="dxa" w:w="60"/>
               <w:left w:type="dxa" w:w="110"/>
@@ -1991,7 +1991,7 @@
         </w:tc>
         <w:tc>
           <w:tcPr>
-            <w:shd w:fill="1F4E79"/>
+            <w:shd w:fill="1F4E79" w:color="auto" w:val="clear"/>
             <w:tcMar>
               <w:top w:type="dxa" w:w="60"/>
               <w:left w:type="dxa" w:w="110"/>
@@ -2428,7 +2428,7 @@
       <w:r>
         <w:drawing>
           <wp:inline distT="0" distB="0" distL="0" distR="0">
-            <wp:extent cx="5334000" cy="2933700"/>
+            <wp:extent cx="5334000" cy="1905000"/>
             <wp:effectExtent t="0" r="0" b="0" l="0"/>
             <wp:docPr id="1" name="" descr="" title=""/>
             <wp:cNvGraphicFramePr>
@@ -2453,7 +2453,7 @@
                   <pic:spPr bwMode="auto">
                     <a:xfrm>
                       <a:off x="0" y="0"/>
-                      <a:ext cx="5334000" cy="2933700"/>
+                      <a:ext cx="5334000" cy="1905000"/>
                     </a:xfrm>
                     <a:prstGeom prst="rect">
                       <a:avLst/>
@@ -2527,7 +2527,7 @@
       <w:r>
         <w:drawing>
           <wp:inline distT="0" distB="0" distL="0" distR="0">
-            <wp:extent cx="4572000" cy="2514600"/>
+            <wp:extent cx="4572000" cy="3048000"/>
             <wp:effectExtent t="0" r="0" b="0" l="0"/>
             <wp:docPr id="1" name="" descr="" title=""/>
             <wp:cNvGraphicFramePr>
@@ -2552,7 +2552,7 @@
                   <pic:spPr bwMode="auto">
                     <a:xfrm>
                       <a:off x="0" y="0"/>
-                      <a:ext cx="4572000" cy="2514600"/>
+                      <a:ext cx="4572000" cy="3048000"/>
                     </a:xfrm>
                     <a:prstGeom prst="rect">
                       <a:avLst/>
@@ -2651,7 +2651,7 @@
       <w:r>
         <w:drawing>
           <wp:inline distT="0" distB="0" distL="0" distR="0">
-            <wp:extent cx="4953000" cy="2724150"/>
+            <wp:extent cx="4953000" cy="2476500"/>
             <wp:effectExtent t="0" r="0" b="0" l="0"/>
             <wp:docPr id="1" name="" descr="" title=""/>
             <wp:cNvGraphicFramePr>
@@ -2676,7 +2676,7 @@
                   <pic:spPr bwMode="auto">
                     <a:xfrm>
                       <a:off x="0" y="0"/>
-                      <a:ext cx="4953000" cy="2724150"/>
+                      <a:ext cx="4953000" cy="2476500"/>
                     </a:xfrm>
                     <a:prstGeom prst="rect">
                       <a:avLst/>
@@ -2775,7 +2775,7 @@
       <w:r>
         <w:drawing>
           <wp:inline distT="0" distB="0" distL="0" distR="0">
-            <wp:extent cx="3429000" cy="1885950"/>
+            <wp:extent cx="3429000" cy="2857500"/>
             <wp:effectExtent t="0" r="0" b="0" l="0"/>
             <wp:docPr id="1" name="" descr="" title=""/>
             <wp:cNvGraphicFramePr>
@@ -2800,7 +2800,7 @@
                   <pic:spPr bwMode="auto">
                     <a:xfrm>
                       <a:off x="0" y="0"/>
-                      <a:ext cx="3429000" cy="1885950"/>
+                      <a:ext cx="3429000" cy="2857500"/>
                     </a:xfrm>
                     <a:prstGeom prst="rect">
                       <a:avLst/>
@@ -2919,7 +2919,7 @@
       <w:r>
         <w:drawing>
           <wp:inline distT="0" distB="0" distL="0" distR="0">
-            <wp:extent cx="5143500" cy="2828925"/>
+            <wp:extent cx="5143500" cy="2333625"/>
             <wp:effectExtent t="0" r="0" b="0" l="0"/>
             <wp:docPr id="1" name="" descr="" title=""/>
             <wp:cNvGraphicFramePr>
@@ -2944,7 +2944,7 @@
                   <pic:spPr bwMode="auto">
                     <a:xfrm>
                       <a:off x="0" y="0"/>
-                      <a:ext cx="5143500" cy="2828925"/>
+                      <a:ext cx="5143500" cy="2333625"/>
                     </a:xfrm>
                     <a:prstGeom prst="rect">
                       <a:avLst/>

</xml_diff>

<commit_message>
Adiciona capa com ficha tecnica, sumario paginado e cabecalho de pagina
</commit_message>
<xml_diff>
--- a/reports/relatorio_executivo_olist.docx
+++ b/reports/relatorio_executivo_olist.docx
@@ -4,7 +4,7 @@
   <w:body>
     <w:p>
       <w:pPr>
-        <w:spacing w:after="2400"/>
+        <w:spacing w:after="2000"/>
       </w:pPr>
       <w:r>
         <w:t xml:space="preserve"/>
@@ -12,7 +12,7 @@
     </w:p>
     <w:p>
       <w:pPr>
-        <w:spacing w:after="160"/>
+        <w:spacing w:after="120"/>
         <w:jc w:val="center"/>
       </w:pPr>
       <w:r>
@@ -21,15 +21,15 @@
           <w:b/>
           <w:bCs/>
           <w:color w:val="1F4E79"/>
-          <w:sz w:val="52"/>
-          <w:szCs w:val="52"/>
-        </w:rPr>
-        <w:t xml:space="preserve">Relatório Executivo</w:t>
-      </w:r>
-    </w:p>
-    <w:p>
-      <w:pPr>
-        <w:spacing w:after="700"/>
+          <w:sz w:val="48"/>
+          <w:szCs w:val="48"/>
+        </w:rPr>
+        <w:t xml:space="preserve">RELATÓRIO EXECUTIVO</w:t>
+      </w:r>
+    </w:p>
+    <w:p>
+      <w:pPr>
+        <w:spacing w:after="240"/>
         <w:jc w:val="center"/>
       </w:pPr>
       <w:r>
@@ -44,49 +44,295 @@
     </w:p>
     <w:p>
       <w:pPr>
-        <w:spacing w:after="100"/>
+        <w:pBdr>
+          <w:bottom w:val="single" w:color="1F4E79" w:sz="12" w:space="1"/>
+        </w:pBdr>
+        <w:spacing w:after="300"/>
         <w:jc w:val="center"/>
       </w:pPr>
       <w:r>
         <w:rPr>
-          <w:rFonts w:ascii="Calibri" w:cs="Calibri" w:eastAsia="Calibri" w:hAnsi="Calibri"/>
+          <w:sz w:val="2"/>
+          <w:szCs w:val="2"/>
+        </w:rPr>
+        <w:t xml:space="preserve"/>
+      </w:r>
+    </w:p>
+    <w:p>
+      <w:pPr>
+        <w:spacing w:after="1400"/>
+        <w:jc w:val="center"/>
+      </w:pPr>
+      <w:r>
+        <w:rPr>
+          <w:rFonts w:ascii="Calibri" w:cs="Calibri" w:eastAsia="Calibri" w:hAnsi="Calibri"/>
+          <w:i/>
+          <w:iCs/>
           <w:color w:val="777777"/>
           <w:sz w:val="22"/>
           <w:szCs w:val="22"/>
         </w:rPr>
-        <w:t xml:space="preserve">Análise de desempenho comercial e recomendações</w:t>
-      </w:r>
-    </w:p>
-    <w:p>
-      <w:pPr>
-        <w:spacing w:after="900"/>
+        <w:t xml:space="preserve">Análise de desempenho comercial e recomendações para decisão de investimento</w:t>
+      </w:r>
+    </w:p>
+    <w:tbl>
+      <w:tblPr>
+        <w:tblW w:type="pct" w:w="78%"/>
         <w:jc w:val="center"/>
-      </w:pPr>
-      <w:r>
-        <w:rPr>
-          <w:rFonts w:ascii="Calibri" w:cs="Calibri" w:eastAsia="Calibri" w:hAnsi="Calibri"/>
-          <w:color w:val="777777"/>
-          <w:sz w:val="22"/>
-          <w:szCs w:val="22"/>
-        </w:rPr>
-        <w:t xml:space="preserve">para decisão de investimento</w:t>
-      </w:r>
-    </w:p>
-    <w:p>
-      <w:pPr>
-        <w:spacing w:after="100"/>
-        <w:jc w:val="center"/>
-      </w:pPr>
-      <w:r>
-        <w:rPr>
-          <w:rFonts w:ascii="Calibri" w:cs="Calibri" w:eastAsia="Calibri" w:hAnsi="Calibri"/>
-          <w:color w:val="555555"/>
-          <w:sz w:val="22"/>
-          <w:szCs w:val="22"/>
-        </w:rPr>
-        <w:t xml:space="preserve">Tech Challenge | Fase 1 | POSTECH Data Analytics</w:t>
-      </w:r>
-    </w:p>
+        <w:tblBorders>
+          <w:top w:val="none"/>
+          <w:left w:val="none"/>
+          <w:bottom w:val="none"/>
+          <w:right w:val="none"/>
+          <w:insideH w:val="single" w:color="E3E3E3" w:sz="2"/>
+          <w:insideV w:val="none"/>
+        </w:tblBorders>
+      </w:tblPr>
+      <w:tblGrid>
+        <w:gridCol w:w="100"/>
+        <w:gridCol w:w="100"/>
+      </w:tblGrid>
+      <w:tr>
+        <w:tc>
+          <w:tcPr>
+            <w:tcMar>
+              <w:left w:type="dxa" w:w="60"/>
+              <w:right w:type="dxa" w:w="60"/>
+            </w:tcMar>
+          </w:tcPr>
+          <w:p>
+            <w:pPr>
+              <w:spacing w:after="80" w:before="80"/>
+            </w:pPr>
+            <w:r>
+              <w:rPr>
+                <w:rFonts w:ascii="Calibri" w:cs="Calibri" w:eastAsia="Calibri" w:hAnsi="Calibri"/>
+                <w:color w:val="888888"/>
+                <w:sz w:val="19"/>
+                <w:szCs w:val="19"/>
+              </w:rPr>
+              <w:t xml:space="preserve">Base de dados</w:t>
+            </w:r>
+          </w:p>
+        </w:tc>
+        <w:tc>
+          <w:tcPr>
+            <w:tcMar>
+              <w:left w:type="dxa" w:w="60"/>
+              <w:right w:type="dxa" w:w="60"/>
+            </w:tcMar>
+          </w:tcPr>
+          <w:p>
+            <w:pPr>
+              <w:spacing w:after="80" w:before="80"/>
+            </w:pPr>
+            <w:r>
+              <w:rPr>
+                <w:rFonts w:ascii="Calibri" w:cs="Calibri" w:eastAsia="Calibri" w:hAnsi="Calibri"/>
+                <w:b/>
+                <w:bCs/>
+                <w:color w:val="444444"/>
+                <w:sz w:val="19"/>
+                <w:szCs w:val="19"/>
+              </w:rPr>
+              <w:t xml:space="preserve">Brazilian E-Commerce Public Dataset by Olist</w:t>
+            </w:r>
+          </w:p>
+        </w:tc>
+      </w:tr>
+      <w:tr>
+        <w:tc>
+          <w:tcPr>
+            <w:tcMar>
+              <w:left w:type="dxa" w:w="60"/>
+              <w:right w:type="dxa" w:w="60"/>
+            </w:tcMar>
+          </w:tcPr>
+          <w:p>
+            <w:pPr>
+              <w:spacing w:after="80" w:before="80"/>
+            </w:pPr>
+            <w:r>
+              <w:rPr>
+                <w:rFonts w:ascii="Calibri" w:cs="Calibri" w:eastAsia="Calibri" w:hAnsi="Calibri"/>
+                <w:color w:val="888888"/>
+                <w:sz w:val="19"/>
+                <w:szCs w:val="19"/>
+              </w:rPr>
+              <w:t xml:space="preserve">Período analisado</w:t>
+            </w:r>
+          </w:p>
+        </w:tc>
+        <w:tc>
+          <w:tcPr>
+            <w:tcMar>
+              <w:left w:type="dxa" w:w="60"/>
+              <w:right w:type="dxa" w:w="60"/>
+            </w:tcMar>
+          </w:tcPr>
+          <w:p>
+            <w:pPr>
+              <w:spacing w:after="80" w:before="80"/>
+            </w:pPr>
+            <w:r>
+              <w:rPr>
+                <w:rFonts w:ascii="Calibri" w:cs="Calibri" w:eastAsia="Calibri" w:hAnsi="Calibri"/>
+                <w:b/>
+                <w:bCs/>
+                <w:color w:val="444444"/>
+                <w:sz w:val="19"/>
+                <w:szCs w:val="19"/>
+              </w:rPr>
+              <w:t xml:space="preserve">Janeiro de 2017 a agosto de 2018</w:t>
+            </w:r>
+          </w:p>
+        </w:tc>
+      </w:tr>
+      <w:tr>
+        <w:tc>
+          <w:tcPr>
+            <w:tcMar>
+              <w:left w:type="dxa" w:w="60"/>
+              <w:right w:type="dxa" w:w="60"/>
+            </w:tcMar>
+          </w:tcPr>
+          <w:p>
+            <w:pPr>
+              <w:spacing w:after="80" w:before="80"/>
+            </w:pPr>
+            <w:r>
+              <w:rPr>
+                <w:rFonts w:ascii="Calibri" w:cs="Calibri" w:eastAsia="Calibri" w:hAnsi="Calibri"/>
+                <w:color w:val="888888"/>
+                <w:sz w:val="19"/>
+                <w:szCs w:val="19"/>
+              </w:rPr>
+              <w:t xml:space="preserve">Volume</w:t>
+            </w:r>
+          </w:p>
+        </w:tc>
+        <w:tc>
+          <w:tcPr>
+            <w:tcMar>
+              <w:left w:type="dxa" w:w="60"/>
+              <w:right w:type="dxa" w:w="60"/>
+            </w:tcMar>
+          </w:tcPr>
+          <w:p>
+            <w:pPr>
+              <w:spacing w:after="80" w:before="80"/>
+            </w:pPr>
+            <w:r>
+              <w:rPr>
+                <w:rFonts w:ascii="Calibri" w:cs="Calibri" w:eastAsia="Calibri" w:hAnsi="Calibri"/>
+                <w:b/>
+                <w:bCs/>
+                <w:color w:val="444444"/>
+                <w:sz w:val="19"/>
+                <w:szCs w:val="19"/>
+              </w:rPr>
+              <w:t xml:space="preserve">97.905 pedidos e R$ 15,68 milhões</w:t>
+            </w:r>
+          </w:p>
+        </w:tc>
+      </w:tr>
+      <w:tr>
+        <w:tc>
+          <w:tcPr>
+            <w:tcMar>
+              <w:left w:type="dxa" w:w="60"/>
+              <w:right w:type="dxa" w:w="60"/>
+            </w:tcMar>
+          </w:tcPr>
+          <w:p>
+            <w:pPr>
+              <w:spacing w:after="80" w:before="80"/>
+            </w:pPr>
+            <w:r>
+              <w:rPr>
+                <w:rFonts w:ascii="Calibri" w:cs="Calibri" w:eastAsia="Calibri" w:hAnsi="Calibri"/>
+                <w:color w:val="888888"/>
+                <w:sz w:val="19"/>
+                <w:szCs w:val="19"/>
+              </w:rPr>
+              <w:t xml:space="preserve">Entrega</w:t>
+            </w:r>
+          </w:p>
+        </w:tc>
+        <w:tc>
+          <w:tcPr>
+            <w:tcMar>
+              <w:left w:type="dxa" w:w="60"/>
+              <w:right w:type="dxa" w:w="60"/>
+            </w:tcMar>
+          </w:tcPr>
+          <w:p>
+            <w:pPr>
+              <w:spacing w:after="80" w:before="80"/>
+            </w:pPr>
+            <w:r>
+              <w:rPr>
+                <w:rFonts w:ascii="Calibri" w:cs="Calibri" w:eastAsia="Calibri" w:hAnsi="Calibri"/>
+                <w:b/>
+                <w:bCs/>
+                <w:color w:val="444444"/>
+                <w:sz w:val="19"/>
+                <w:szCs w:val="19"/>
+              </w:rPr>
+              <w:t xml:space="preserve">Tech Challenge, Fase 1</w:t>
+            </w:r>
+          </w:p>
+        </w:tc>
+      </w:tr>
+      <w:tr>
+        <w:tc>
+          <w:tcPr>
+            <w:tcMar>
+              <w:left w:type="dxa" w:w="60"/>
+              <w:right w:type="dxa" w:w="60"/>
+            </w:tcMar>
+          </w:tcPr>
+          <w:p>
+            <w:pPr>
+              <w:spacing w:after="80" w:before="80"/>
+            </w:pPr>
+            <w:r>
+              <w:rPr>
+                <w:rFonts w:ascii="Calibri" w:cs="Calibri" w:eastAsia="Calibri" w:hAnsi="Calibri"/>
+                <w:color w:val="888888"/>
+                <w:sz w:val="19"/>
+                <w:szCs w:val="19"/>
+              </w:rPr>
+              <w:t xml:space="preserve">Programa</w:t>
+            </w:r>
+          </w:p>
+        </w:tc>
+        <w:tc>
+          <w:tcPr>
+            <w:tcMar>
+              <w:left w:type="dxa" w:w="60"/>
+              <w:right w:type="dxa" w:w="60"/>
+            </w:tcMar>
+          </w:tcPr>
+          <w:p>
+            <w:pPr>
+              <w:spacing w:after="80" w:before="80"/>
+            </w:pPr>
+            <w:r>
+              <w:rPr>
+                <w:rFonts w:ascii="Calibri" w:cs="Calibri" w:eastAsia="Calibri" w:hAnsi="Calibri"/>
+                <w:b/>
+                <w:bCs/>
+                <w:color w:val="444444"/>
+                <w:sz w:val="19"/>
+                <w:szCs w:val="19"/>
+              </w:rPr>
+              <w:t xml:space="preserve">POSTECH Data Analytics</w:t>
+            </w:r>
+          </w:p>
+        </w:tc>
+      </w:tr>
+    </w:tbl>
     <w:p>
       <w:r>
         <w:br w:type="page"/>
@@ -94,6 +340,651 @@
     </w:p>
     <w:p>
       <w:pPr>
+        <w:keepNext/>
+        <w:pBdr>
+          <w:bottom w:val="single" w:color="D9D9D9" w:sz="6" w:space="6"/>
+        </w:pBdr>
+        <w:spacing w:after="180" w:before="360"/>
+      </w:pPr>
+      <w:r>
+        <w:rPr>
+          <w:rFonts w:ascii="Calibri" w:cs="Calibri" w:eastAsia="Calibri" w:hAnsi="Calibri"/>
+          <w:b/>
+          <w:bCs/>
+          <w:color w:val="1F4E79"/>
+          <w:sz w:val="30"/>
+          <w:szCs w:val="30"/>
+        </w:rPr>
+        <w:t xml:space="preserve">Sumário</w:t>
+      </w:r>
+    </w:p>
+    <w:p>
+      <w:pPr>
+        <w:tabs>
+          <w:tab w:val="right" w:pos="9000" w:leader="dot"/>
+        </w:tabs>
+        <w:spacing w:after="120"/>
+        <w:ind w:left="0"/>
+      </w:pPr>
+      <w:r>
+        <w:rPr>
+          <w:rFonts w:ascii="Calibri" w:cs="Calibri" w:eastAsia="Calibri" w:hAnsi="Calibri"/>
+          <w:b/>
+          <w:bCs/>
+          <w:color w:val="1F4E79"/>
+          <w:sz w:val="22"/>
+          <w:szCs w:val="22"/>
+        </w:rPr>
+        <w:t xml:space="preserve">Sumário Executivo</w:t>
+      </w:r>
+      <w:r>
+        <w:rPr>
+          <w:rFonts w:ascii="Calibri" w:cs="Calibri" w:eastAsia="Calibri" w:hAnsi="Calibri"/>
+          <w:color w:val="444444"/>
+          <w:sz w:val="20"/>
+          <w:szCs w:val="20"/>
+        </w:rPr>
+        <w:t xml:space="preserve">	3</w:t>
+      </w:r>
+    </w:p>
+    <w:p>
+      <w:pPr>
+        <w:tabs>
+          <w:tab w:val="right" w:pos="9000" w:leader="dot"/>
+        </w:tabs>
+        <w:spacing w:after="120"/>
+        <w:ind w:left="0"/>
+      </w:pPr>
+      <w:r>
+        <w:rPr>
+          <w:rFonts w:ascii="Calibri" w:cs="Calibri" w:eastAsia="Calibri" w:hAnsi="Calibri"/>
+          <w:b/>
+          <w:bCs/>
+          <w:color w:val="1F4E79"/>
+          <w:sz w:val="22"/>
+          <w:szCs w:val="22"/>
+        </w:rPr>
+        <w:t xml:space="preserve">1. Contexto e objetivo</w:t>
+      </w:r>
+      <w:r>
+        <w:rPr>
+          <w:rFonts w:ascii="Calibri" w:cs="Calibri" w:eastAsia="Calibri" w:hAnsi="Calibri"/>
+          <w:color w:val="444444"/>
+          <w:sz w:val="20"/>
+          <w:szCs w:val="20"/>
+        </w:rPr>
+        <w:t xml:space="preserve">	5</w:t>
+      </w:r>
+    </w:p>
+    <w:p>
+      <w:pPr>
+        <w:tabs>
+          <w:tab w:val="right" w:pos="9000" w:leader="dot"/>
+        </w:tabs>
+        <w:spacing w:after="120"/>
+        <w:ind w:left="0"/>
+      </w:pPr>
+      <w:r>
+        <w:rPr>
+          <w:rFonts w:ascii="Calibri" w:cs="Calibri" w:eastAsia="Calibri" w:hAnsi="Calibri"/>
+          <w:b/>
+          <w:bCs/>
+          <w:color w:val="1F4E79"/>
+          <w:sz w:val="22"/>
+          <w:szCs w:val="22"/>
+        </w:rPr>
+        <w:t xml:space="preserve">2. Metodologia e governança dos dados</w:t>
+      </w:r>
+      <w:r>
+        <w:rPr>
+          <w:rFonts w:ascii="Calibri" w:cs="Calibri" w:eastAsia="Calibri" w:hAnsi="Calibri"/>
+          <w:color w:val="444444"/>
+          <w:sz w:val="20"/>
+          <w:szCs w:val="20"/>
+        </w:rPr>
+        <w:t xml:space="preserve">	5</w:t>
+      </w:r>
+    </w:p>
+    <w:p>
+      <w:pPr>
+        <w:tabs>
+          <w:tab w:val="right" w:pos="9000" w:leader="dot"/>
+        </w:tabs>
+        <w:spacing w:after="70"/>
+        <w:ind w:left="280"/>
+      </w:pPr>
+      <w:r>
+        <w:rPr>
+          <w:rFonts w:ascii="Calibri" w:cs="Calibri" w:eastAsia="Calibri" w:hAnsi="Calibri"/>
+          <w:b w:val="false"/>
+          <w:bCs w:val="false"/>
+          <w:color w:val="444444"/>
+          <w:sz w:val="20"/>
+          <w:szCs w:val="20"/>
+        </w:rPr>
+        <w:t xml:space="preserve">2.1 Decisões que afetam os números</w:t>
+      </w:r>
+      <w:r>
+        <w:rPr>
+          <w:rFonts w:ascii="Calibri" w:cs="Calibri" w:eastAsia="Calibri" w:hAnsi="Calibri"/>
+          <w:color w:val="444444"/>
+          <w:sz w:val="20"/>
+          <w:szCs w:val="20"/>
+        </w:rPr>
+        <w:t xml:space="preserve">	5</w:t>
+      </w:r>
+    </w:p>
+    <w:p>
+      <w:pPr>
+        <w:tabs>
+          <w:tab w:val="right" w:pos="9000" w:leader="dot"/>
+        </w:tabs>
+        <w:spacing w:after="70"/>
+        <w:ind w:left="280"/>
+      </w:pPr>
+      <w:r>
+        <w:rPr>
+          <w:rFonts w:ascii="Calibri" w:cs="Calibri" w:eastAsia="Calibri" w:hAnsi="Calibri"/>
+          <w:b w:val="false"/>
+          <w:bCs w:val="false"/>
+          <w:color w:val="444444"/>
+          <w:sz w:val="20"/>
+          <w:szCs w:val="20"/>
+        </w:rPr>
+        <w:t xml:space="preserve">2.2 Reprodutibilidade</w:t>
+      </w:r>
+      <w:r>
+        <w:rPr>
+          <w:rFonts w:ascii="Calibri" w:cs="Calibri" w:eastAsia="Calibri" w:hAnsi="Calibri"/>
+          <w:color w:val="444444"/>
+          <w:sz w:val="20"/>
+          <w:szCs w:val="20"/>
+        </w:rPr>
+        <w:t xml:space="preserve">	6</w:t>
+      </w:r>
+    </w:p>
+    <w:p>
+      <w:pPr>
+        <w:tabs>
+          <w:tab w:val="right" w:pos="9000" w:leader="dot"/>
+        </w:tabs>
+        <w:spacing w:after="120"/>
+        <w:ind w:left="0"/>
+      </w:pPr>
+      <w:r>
+        <w:rPr>
+          <w:rFonts w:ascii="Calibri" w:cs="Calibri" w:eastAsia="Calibri" w:hAnsi="Calibri"/>
+          <w:b/>
+          <w:bCs/>
+          <w:color w:val="1F4E79"/>
+          <w:sz w:val="22"/>
+          <w:szCs w:val="22"/>
+        </w:rPr>
+        <w:t xml:space="preserve">3. O que aconteceu</w:t>
+      </w:r>
+      <w:r>
+        <w:rPr>
+          <w:rFonts w:ascii="Calibri" w:cs="Calibri" w:eastAsia="Calibri" w:hAnsi="Calibri"/>
+          <w:color w:val="444444"/>
+          <w:sz w:val="20"/>
+          <w:szCs w:val="20"/>
+        </w:rPr>
+        <w:t xml:space="preserve">	7</w:t>
+      </w:r>
+    </w:p>
+    <w:p>
+      <w:pPr>
+        <w:tabs>
+          <w:tab w:val="right" w:pos="9000" w:leader="dot"/>
+        </w:tabs>
+        <w:spacing w:after="70"/>
+        <w:ind w:left="280"/>
+      </w:pPr>
+      <w:r>
+        <w:rPr>
+          <w:rFonts w:ascii="Calibri" w:cs="Calibri" w:eastAsia="Calibri" w:hAnsi="Calibri"/>
+          <w:b w:val="false"/>
+          <w:bCs w:val="false"/>
+          <w:color w:val="444444"/>
+          <w:sz w:val="20"/>
+          <w:szCs w:val="20"/>
+        </w:rPr>
+        <w:t xml:space="preserve">3.1 O crescimento veio de volume, não de valor</w:t>
+      </w:r>
+      <w:r>
+        <w:rPr>
+          <w:rFonts w:ascii="Calibri" w:cs="Calibri" w:eastAsia="Calibri" w:hAnsi="Calibri"/>
+          <w:color w:val="444444"/>
+          <w:sz w:val="20"/>
+          <w:szCs w:val="20"/>
+        </w:rPr>
+        <w:t xml:space="preserve">	7</w:t>
+      </w:r>
+    </w:p>
+    <w:p>
+      <w:pPr>
+        <w:tabs>
+          <w:tab w:val="right" w:pos="9000" w:leader="dot"/>
+        </w:tabs>
+        <w:spacing w:after="70"/>
+        <w:ind w:left="280"/>
+      </w:pPr>
+      <w:r>
+        <w:rPr>
+          <w:rFonts w:ascii="Calibri" w:cs="Calibri" w:eastAsia="Calibri" w:hAnsi="Calibri"/>
+          <w:b w:val="false"/>
+          <w:bCs w:val="false"/>
+          <w:color w:val="444444"/>
+          <w:sz w:val="20"/>
+          <w:szCs w:val="20"/>
+        </w:rPr>
+        <w:t xml:space="preserve">3.2 O maior mês da série é sazonalidade</w:t>
+      </w:r>
+      <w:r>
+        <w:rPr>
+          <w:rFonts w:ascii="Calibri" w:cs="Calibri" w:eastAsia="Calibri" w:hAnsi="Calibri"/>
+          <w:color w:val="444444"/>
+          <w:sz w:val="20"/>
+          <w:szCs w:val="20"/>
+        </w:rPr>
+        <w:t xml:space="preserve">	7</w:t>
+      </w:r>
+    </w:p>
+    <w:p>
+      <w:pPr>
+        <w:tabs>
+          <w:tab w:val="right" w:pos="9000" w:leader="dot"/>
+        </w:tabs>
+        <w:spacing w:after="120"/>
+        <w:ind w:left="0"/>
+      </w:pPr>
+      <w:r>
+        <w:rPr>
+          <w:rFonts w:ascii="Calibri" w:cs="Calibri" w:eastAsia="Calibri" w:hAnsi="Calibri"/>
+          <w:b/>
+          <w:bCs/>
+          <w:color w:val="1F4E79"/>
+          <w:sz w:val="22"/>
+          <w:szCs w:val="22"/>
+        </w:rPr>
+        <w:t xml:space="preserve">4. Por que o crescimento parou</w:t>
+      </w:r>
+      <w:r>
+        <w:rPr>
+          <w:rFonts w:ascii="Calibri" w:cs="Calibri" w:eastAsia="Calibri" w:hAnsi="Calibri"/>
+          <w:color w:val="444444"/>
+          <w:sz w:val="20"/>
+          <w:szCs w:val="20"/>
+        </w:rPr>
+        <w:t xml:space="preserve">	9</w:t>
+      </w:r>
+    </w:p>
+    <w:p>
+      <w:pPr>
+        <w:tabs>
+          <w:tab w:val="right" w:pos="9000" w:leader="dot"/>
+        </w:tabs>
+        <w:spacing w:after="70"/>
+        <w:ind w:left="280"/>
+      </w:pPr>
+      <w:r>
+        <w:rPr>
+          <w:rFonts w:ascii="Calibri" w:cs="Calibri" w:eastAsia="Calibri" w:hAnsi="Calibri"/>
+          <w:b w:val="false"/>
+          <w:bCs w:val="false"/>
+          <w:color w:val="444444"/>
+          <w:sz w:val="20"/>
+          <w:szCs w:val="20"/>
+        </w:rPr>
+        <w:t xml:space="preserve">4.1 Onde a demanda não se materializa</w:t>
+      </w:r>
+      <w:r>
+        <w:rPr>
+          <w:rFonts w:ascii="Calibri" w:cs="Calibri" w:eastAsia="Calibri" w:hAnsi="Calibri"/>
+          <w:color w:val="444444"/>
+          <w:sz w:val="20"/>
+          <w:szCs w:val="20"/>
+        </w:rPr>
+        <w:t xml:space="preserve">	9</w:t>
+      </w:r>
+    </w:p>
+    <w:p>
+      <w:pPr>
+        <w:tabs>
+          <w:tab w:val="right" w:pos="9000" w:leader="dot"/>
+        </w:tabs>
+        <w:spacing w:after="120"/>
+        <w:ind w:left="0"/>
+      </w:pPr>
+      <w:r>
+        <w:rPr>
+          <w:rFonts w:ascii="Calibri" w:cs="Calibri" w:eastAsia="Calibri" w:hAnsi="Calibri"/>
+          <w:b/>
+          <w:bCs/>
+          <w:color w:val="1F4E79"/>
+          <w:sz w:val="22"/>
+          <w:szCs w:val="22"/>
+        </w:rPr>
+        <w:t xml:space="preserve">5. A operação explica parte da concentração</w:t>
+      </w:r>
+      <w:r>
+        <w:rPr>
+          <w:rFonts w:ascii="Calibri" w:cs="Calibri" w:eastAsia="Calibri" w:hAnsi="Calibri"/>
+          <w:color w:val="444444"/>
+          <w:sz w:val="20"/>
+          <w:szCs w:val="20"/>
+        </w:rPr>
+        <w:t xml:space="preserve">	11</w:t>
+      </w:r>
+    </w:p>
+    <w:p>
+      <w:pPr>
+        <w:tabs>
+          <w:tab w:val="right" w:pos="9000" w:leader="dot"/>
+        </w:tabs>
+        <w:spacing w:after="70"/>
+        <w:ind w:left="280"/>
+      </w:pPr>
+      <w:r>
+        <w:rPr>
+          <w:rFonts w:ascii="Calibri" w:cs="Calibri" w:eastAsia="Calibri" w:hAnsi="Calibri"/>
+          <w:b w:val="false"/>
+          <w:bCs w:val="false"/>
+          <w:color w:val="444444"/>
+          <w:sz w:val="20"/>
+          <w:szCs w:val="20"/>
+        </w:rPr>
+        <w:t xml:space="preserve">5.1 Atraso e demora são problemas diferentes</w:t>
+      </w:r>
+      <w:r>
+        <w:rPr>
+          <w:rFonts w:ascii="Calibri" w:cs="Calibri" w:eastAsia="Calibri" w:hAnsi="Calibri"/>
+          <w:color w:val="444444"/>
+          <w:sz w:val="20"/>
+          <w:szCs w:val="20"/>
+        </w:rPr>
+        <w:t xml:space="preserve">	12</w:t>
+      </w:r>
+    </w:p>
+    <w:p>
+      <w:pPr>
+        <w:tabs>
+          <w:tab w:val="right" w:pos="9000" w:leader="dot"/>
+        </w:tabs>
+        <w:spacing w:after="70"/>
+        <w:ind w:left="280"/>
+      </w:pPr>
+      <w:r>
+        <w:rPr>
+          <w:rFonts w:ascii="Calibri" w:cs="Calibri" w:eastAsia="Calibri" w:hAnsi="Calibri"/>
+          <w:b w:val="false"/>
+          <w:bCs w:val="false"/>
+          <w:color w:val="444444"/>
+          <w:sz w:val="20"/>
+          <w:szCs w:val="20"/>
+        </w:rPr>
+        <w:t xml:space="preserve">5.2 O efeito do atraso sobre o retorno do cliente</w:t>
+      </w:r>
+      <w:r>
+        <w:rPr>
+          <w:rFonts w:ascii="Calibri" w:cs="Calibri" w:eastAsia="Calibri" w:hAnsi="Calibri"/>
+          <w:color w:val="444444"/>
+          <w:sz w:val="20"/>
+          <w:szCs w:val="20"/>
+        </w:rPr>
+        <w:t xml:space="preserve">	12</w:t>
+      </w:r>
+    </w:p>
+    <w:p>
+      <w:pPr>
+        <w:tabs>
+          <w:tab w:val="right" w:pos="9000" w:leader="dot"/>
+        </w:tabs>
+        <w:spacing w:after="120"/>
+        <w:ind w:left="0"/>
+      </w:pPr>
+      <w:r>
+        <w:rPr>
+          <w:rFonts w:ascii="Calibri" w:cs="Calibri" w:eastAsia="Calibri" w:hAnsi="Calibri"/>
+          <w:b/>
+          <w:bCs/>
+          <w:color w:val="1F4E79"/>
+          <w:sz w:val="22"/>
+          <w:szCs w:val="22"/>
+        </w:rPr>
+        <w:t xml:space="preserve">6. Projeção para os próximos meses</w:t>
+      </w:r>
+      <w:r>
+        <w:rPr>
+          <w:rFonts w:ascii="Calibri" w:cs="Calibri" w:eastAsia="Calibri" w:hAnsi="Calibri"/>
+          <w:color w:val="444444"/>
+          <w:sz w:val="20"/>
+          <w:szCs w:val="20"/>
+        </w:rPr>
+        <w:t xml:space="preserve">	14</w:t>
+      </w:r>
+    </w:p>
+    <w:p>
+      <w:pPr>
+        <w:tabs>
+          <w:tab w:val="right" w:pos="9000" w:leader="dot"/>
+        </w:tabs>
+        <w:spacing w:after="120"/>
+        <w:ind w:left="0"/>
+      </w:pPr>
+      <w:r>
+        <w:rPr>
+          <w:rFonts w:ascii="Calibri" w:cs="Calibri" w:eastAsia="Calibri" w:hAnsi="Calibri"/>
+          <w:b/>
+          <w:bCs/>
+          <w:color w:val="1F4E79"/>
+          <w:sz w:val="22"/>
+          <w:szCs w:val="22"/>
+        </w:rPr>
+        <w:t xml:space="preserve">7. Conclusões e recomendações</w:t>
+      </w:r>
+      <w:r>
+        <w:rPr>
+          <w:rFonts w:ascii="Calibri" w:cs="Calibri" w:eastAsia="Calibri" w:hAnsi="Calibri"/>
+          <w:color w:val="444444"/>
+          <w:sz w:val="20"/>
+          <w:szCs w:val="20"/>
+        </w:rPr>
+        <w:t xml:space="preserve">	14</w:t>
+      </w:r>
+    </w:p>
+    <w:p>
+      <w:pPr>
+        <w:tabs>
+          <w:tab w:val="right" w:pos="9000" w:leader="dot"/>
+        </w:tabs>
+        <w:spacing w:after="70"/>
+        <w:ind w:left="280"/>
+      </w:pPr>
+      <w:r>
+        <w:rPr>
+          <w:rFonts w:ascii="Calibri" w:cs="Calibri" w:eastAsia="Calibri" w:hAnsi="Calibri"/>
+          <w:b w:val="false"/>
+          <w:bCs w:val="false"/>
+          <w:color w:val="444444"/>
+          <w:sz w:val="20"/>
+          <w:szCs w:val="20"/>
+        </w:rPr>
+        <w:t xml:space="preserve">7.1 Limitações desta análise</w:t>
+      </w:r>
+      <w:r>
+        <w:rPr>
+          <w:rFonts w:ascii="Calibri" w:cs="Calibri" w:eastAsia="Calibri" w:hAnsi="Calibri"/>
+          <w:color w:val="444444"/>
+          <w:sz w:val="20"/>
+          <w:szCs w:val="20"/>
+        </w:rPr>
+        <w:t xml:space="preserve">	15</w:t>
+      </w:r>
+    </w:p>
+    <w:p>
+      <w:pPr>
+        <w:spacing w:after="200"/>
+      </w:pPr>
+      <w:r>
+        <w:t xml:space="preserve"/>
+      </w:r>
+    </w:p>
+    <w:p>
+      <w:pPr>
+        <w:spacing w:after="200"/>
+      </w:pPr>
+      <w:r>
+        <w:t xml:space="preserve"/>
+      </w:r>
+    </w:p>
+    <w:p>
+      <w:pPr>
+        <w:spacing w:after="140" w:before="200"/>
+      </w:pPr>
+      <w:r>
+        <w:rPr>
+          <w:rFonts w:ascii="Calibri" w:cs="Calibri" w:eastAsia="Calibri" w:hAnsi="Calibri"/>
+          <w:b/>
+          <w:bCs/>
+          <w:color w:val="1F4E79"/>
+          <w:sz w:val="22"/>
+          <w:szCs w:val="22"/>
+        </w:rPr>
+        <w:t xml:space="preserve">Figuras</w:t>
+      </w:r>
+    </w:p>
+    <w:p>
+      <w:pPr>
+        <w:spacing w:after="70"/>
+        <w:ind w:left="280"/>
+      </w:pPr>
+      <w:r>
+        <w:rPr>
+          <w:rFonts w:ascii="Calibri" w:cs="Calibri" w:eastAsia="Calibri" w:hAnsi="Calibri"/>
+          <w:color w:val="444444"/>
+          <w:sz w:val="19"/>
+          <w:szCs w:val="19"/>
+        </w:rPr>
+        <w:t xml:space="preserve">Figura 1. Receita mensal entre janeiro de 2017 e agosto de 2018.</w:t>
+      </w:r>
+    </w:p>
+    <w:p>
+      <w:pPr>
+        <w:spacing w:after="70"/>
+        <w:ind w:left="280"/>
+      </w:pPr>
+      <w:r>
+        <w:rPr>
+          <w:rFonts w:ascii="Calibri" w:cs="Calibri" w:eastAsia="Calibri" w:hAnsi="Calibri"/>
+          <w:color w:val="444444"/>
+          <w:sz w:val="19"/>
+          <w:szCs w:val="19"/>
+        </w:rPr>
+        <w:t xml:space="preserve">Figura 2. Pedidos por dia em novembro de 2017.</w:t>
+      </w:r>
+    </w:p>
+    <w:p>
+      <w:pPr>
+        <w:spacing w:after="70"/>
+        <w:ind w:left="280"/>
+      </w:pPr>
+      <w:r>
+        <w:rPr>
+          <w:rFonts w:ascii="Calibri" w:cs="Calibri" w:eastAsia="Calibri" w:hAnsi="Calibri"/>
+          <w:color w:val="444444"/>
+          <w:sz w:val="19"/>
+          <w:szCs w:val="19"/>
+        </w:rPr>
+        <w:t xml:space="preserve">Figura 3. Clientes e vendedores ativos por mês.</w:t>
+      </w:r>
+    </w:p>
+    <w:p>
+      <w:pPr>
+        <w:spacing w:after="70"/>
+        <w:ind w:left="280"/>
+      </w:pPr>
+      <w:r>
+        <w:rPr>
+          <w:rFonts w:ascii="Calibri" w:cs="Calibri" w:eastAsia="Calibri" w:hAnsi="Calibri"/>
+          <w:color w:val="444444"/>
+          <w:sz w:val="19"/>
+          <w:szCs w:val="19"/>
+        </w:rPr>
+        <w:t xml:space="preserve">Figura 4. Distribuição da receita por categoria e por estado.</w:t>
+      </w:r>
+    </w:p>
+    <w:p>
+      <w:pPr>
+        <w:spacing w:after="70"/>
+        <w:ind w:left="280"/>
+      </w:pPr>
+      <w:r>
+        <w:rPr>
+          <w:rFonts w:ascii="Calibri" w:cs="Calibri" w:eastAsia="Calibri" w:hAnsi="Calibri"/>
+          <w:color w:val="444444"/>
+          <w:sz w:val="19"/>
+          <w:szCs w:val="19"/>
+        </w:rPr>
+        <w:t xml:space="preserve">Figura 5. Participação na receita e tempo médio de entrega, por estado.</w:t>
+      </w:r>
+    </w:p>
+    <w:p>
+      <w:pPr>
+        <w:spacing w:after="70"/>
+        <w:ind w:left="280"/>
+      </w:pPr>
+      <w:r>
+        <w:rPr>
+          <w:rFonts w:ascii="Calibri" w:cs="Calibri" w:eastAsia="Calibri" w:hAnsi="Calibri"/>
+          <w:color w:val="444444"/>
+          <w:sz w:val="19"/>
+          <w:szCs w:val="19"/>
+        </w:rPr>
+        <w:t xml:space="preserve">Figura 6. Percentual de pedidos entregues após a data prometida.</w:t>
+      </w:r>
+    </w:p>
+    <w:p>
+      <w:pPr>
+        <w:spacing w:after="70"/>
+        <w:ind w:left="280"/>
+      </w:pPr>
+      <w:r>
+        <w:rPr>
+          <w:rFonts w:ascii="Calibri" w:cs="Calibri" w:eastAsia="Calibri" w:hAnsi="Calibri"/>
+          <w:color w:val="444444"/>
+          <w:sz w:val="19"/>
+          <w:szCs w:val="19"/>
+        </w:rPr>
+        <w:t xml:space="preserve">Figura 7. Percentual de clientes que voltaram a comprar, conforme a primeira entrega.</w:t>
+      </w:r>
+    </w:p>
+    <w:p>
+      <w:pPr>
+        <w:spacing w:after="70"/>
+        <w:ind w:left="280"/>
+      </w:pPr>
+      <w:r>
+        <w:rPr>
+          <w:rFonts w:ascii="Calibri" w:cs="Calibri" w:eastAsia="Calibri" w:hAnsi="Calibri"/>
+          <w:color w:val="444444"/>
+          <w:sz w:val="19"/>
+          <w:szCs w:val="19"/>
+        </w:rPr>
+        <w:t xml:space="preserve">Figura 8. Receita realizada e projeção para o trimestre seguinte.</w:t>
+      </w:r>
+    </w:p>
+    <w:p>
+      <w:r>
+        <w:br w:type="page"/>
+      </w:r>
+    </w:p>
+    <w:p>
+      <w:pPr>
+        <w:keepNext/>
+        <w:pBdr>
+          <w:bottom w:val="single" w:color="D9D9D9" w:sz="6" w:space="6"/>
+        </w:pBdr>
         <w:spacing w:after="180" w:before="360"/>
       </w:pPr>
       <w:r>
@@ -888,6 +1779,10 @@
     </w:p>
     <w:p>
       <w:pPr>
+        <w:keepNext/>
+        <w:pBdr>
+          <w:bottom w:val="single" w:color="D9D9D9" w:sz="6" w:space="6"/>
+        </w:pBdr>
         <w:spacing w:after="180" w:before="360"/>
       </w:pPr>
       <w:r>
@@ -949,6 +1844,10 @@
     </w:p>
     <w:p>
       <w:pPr>
+        <w:keepNext/>
+        <w:pBdr>
+          <w:bottom w:val="single" w:color="D9D9D9" w:sz="6" w:space="6"/>
+        </w:pBdr>
         <w:spacing w:after="180" w:before="360"/>
       </w:pPr>
       <w:r>
@@ -995,6 +1894,7 @@
     </w:p>
     <w:p>
       <w:pPr>
+        <w:keepNext/>
         <w:spacing w:after="130" w:before="260"/>
       </w:pPr>
       <w:r>
@@ -1469,6 +2369,7 @@
     </w:p>
     <w:p>
       <w:pPr>
+        <w:keepNext/>
         <w:spacing w:after="130" w:before="260"/>
       </w:pPr>
       <w:r>
@@ -1505,6 +2406,10 @@
     </w:p>
     <w:p>
       <w:pPr>
+        <w:keepNext/>
+        <w:pBdr>
+          <w:bottom w:val="single" w:color="D9D9D9" w:sz="6" w:space="6"/>
+        </w:pBdr>
         <w:spacing w:after="180" w:before="360"/>
       </w:pPr>
       <w:r>
@@ -1543,892 +2448,6 @@
         <w:drawing>
           <wp:inline distT="0" distB="0" distL="0" distR="0">
             <wp:extent cx="5143500" cy="2571750"/>
-            <wp:effectExtent t="0" r="0" b="0" l="0"/>
-            <wp:docPr id="1" name="" descr="" title=""/>
-            <wp:cNvGraphicFramePr>
-              <a:graphicFrameLocks xmlns:a="http://schemas.openxmlformats.org/drawingml/2006/main" noChangeAspect="1"/>
-            </wp:cNvGraphicFramePr>
-            <a:graphic xmlns:a="http://schemas.openxmlformats.org/drawingml/2006/main">
-              <a:graphicData uri="http://schemas.openxmlformats.org/drawingml/2006/picture">
-                <pic:pic xmlns:pic="http://schemas.openxmlformats.org/drawingml/2006/picture">
-                  <pic:nvPicPr>
-                    <pic:cNvPr id="0" name="" descr=""/>
-                    <pic:cNvPicPr>
-                      <a:picLocks noChangeAspect="1" noChangeArrowheads="1"/>
-                    </pic:cNvPicPr>
-                  </pic:nvPicPr>
-                  <pic:blipFill>
-                    <a:blip r:embed="rId8" cstate="none"/>
-                    <a:srcRect/>
-                    <a:stretch>
-                      <a:fillRect/>
-                    </a:stretch>
-                  </pic:blipFill>
-                  <pic:spPr bwMode="auto">
-                    <a:xfrm>
-                      <a:off x="0" y="0"/>
-                      <a:ext cx="5143500" cy="2571750"/>
-                    </a:xfrm>
-                    <a:prstGeom prst="rect">
-                      <a:avLst/>
-                    </a:prstGeom>
-                  </pic:spPr>
-                </pic:pic>
-              </a:graphicData>
-            </a:graphic>
-          </wp:inline>
-        </w:drawing>
-      </w:r>
-    </w:p>
-    <w:p>
-      <w:pPr>
-        <w:spacing w:after="240"/>
-        <w:jc w:val="center"/>
-      </w:pPr>
-      <w:r>
-        <w:rPr>
-          <w:rFonts w:ascii="Calibri" w:cs="Calibri" w:eastAsia="Calibri" w:hAnsi="Calibri"/>
-          <w:i/>
-          <w:iCs/>
-          <w:color w:val="777777"/>
-          <w:sz w:val="18"/>
-          <w:szCs w:val="18"/>
-        </w:rPr>
-        <w:t xml:space="preserve">Figura 1. Receita mensal entre janeiro de 2017 e agosto de 2018.</w:t>
-      </w:r>
-    </w:p>
-    <w:p>
-      <w:pPr>
-        <w:spacing w:after="160" w:line="300"/>
-        <w:jc w:val="both"/>
-      </w:pPr>
-      <w:r>
-        <w:rPr>
-          <w:rFonts w:ascii="Calibri" w:cs="Calibri" w:eastAsia="Calibri" w:hAnsi="Calibri"/>
-          <w:color w:val="444444"/>
-          <w:sz w:val="22"/>
-          <w:szCs w:val="22"/>
-        </w:rPr>
-        <w:t xml:space="preserve">O gráfico revela duas fases distintas. Durante 2017 o crescimento é consistente. A partir do início de 2018 a curva se achata e passa a oscilar em torno de R$ 1 milhão mensais. Comparando os dois quadrimestres de 2018, a média mensal recua de R$ 1,10 milhão para R$ 1,05 milhão.</w:t>
-      </w:r>
-    </w:p>
-    <w:p>
-      <w:pPr>
-        <w:spacing w:after="130" w:before="260"/>
-      </w:pPr>
-      <w:r>
-        <w:rPr>
-          <w:rFonts w:ascii="Calibri" w:cs="Calibri" w:eastAsia="Calibri" w:hAnsi="Calibri"/>
-          <w:b/>
-          <w:bCs/>
-          <w:color w:val="1F4E79"/>
-          <w:sz w:val="24"/>
-          <w:szCs w:val="24"/>
-        </w:rPr>
-        <w:t xml:space="preserve">3.1 O crescimento veio de volume, não de valor</w:t>
-      </w:r>
-    </w:p>
-    <w:p>
-      <w:pPr>
-        <w:spacing w:after="160" w:line="300"/>
-        <w:jc w:val="both"/>
-      </w:pPr>
-      <w:r>
-        <w:rPr>
-          <w:rFonts w:ascii="Calibri" w:cs="Calibri" w:eastAsia="Calibri" w:hAnsi="Calibri"/>
-          <w:color w:val="444444"/>
-          <w:sz w:val="22"/>
-          <w:szCs w:val="22"/>
-        </w:rPr>
-        <w:t xml:space="preserve">O valor médio por pedido permaneceu estável durante todo o período, entre R$ 146 e R$ 174. Considerando os pedidos individualmente, a média é de R$ 160,19 e a mediana de R$ 105,28, com coeficiente de variação de 137%.</w:t>
-      </w:r>
-    </w:p>
-    <w:p>
-      <w:pPr>
-        <w:spacing w:after="160" w:line="300"/>
-        <w:jc w:val="both"/>
-      </w:pPr>
-      <w:r>
-        <w:rPr>
-          <w:rFonts w:ascii="Calibri" w:cs="Calibri" w:eastAsia="Calibri" w:hAnsi="Calibri"/>
-          <w:color w:val="444444"/>
-          <w:sz w:val="22"/>
-          <w:szCs w:val="22"/>
-        </w:rPr>
-        <w:t xml:space="preserve">A diferença entre média e mediana indica distribuição assimétrica: a maior parte dos pedidos tem valor baixo e um conjunto reduzido de pedidos caros eleva a média. A mediana representa melhor o pedido típico. Na prática, o crescimento da receita decorreu de vender mais pedidos, não de vender pedidos mais caros.</w:t>
-      </w:r>
-    </w:p>
-    <w:p>
-      <w:pPr>
-        <w:spacing w:after="130" w:before="260"/>
-      </w:pPr>
-      <w:r>
-        <w:rPr>
-          <w:rFonts w:ascii="Calibri" w:cs="Calibri" w:eastAsia="Calibri" w:hAnsi="Calibri"/>
-          <w:b/>
-          <w:bCs/>
-          <w:color w:val="1F4E79"/>
-          <w:sz w:val="24"/>
-          <w:szCs w:val="24"/>
-        </w:rPr>
-        <w:t xml:space="preserve">3.2 O maior mês da série é sazonalidade</w:t>
-      </w:r>
-    </w:p>
-    <w:p>
-      <w:pPr>
-        <w:spacing w:after="160" w:line="300"/>
-        <w:jc w:val="both"/>
-      </w:pPr>
-      <w:r>
-        <w:rPr>
-          <w:rFonts w:ascii="Calibri" w:cs="Calibri" w:eastAsia="Calibri" w:hAnsi="Calibri"/>
-          <w:color w:val="444444"/>
-          <w:sz w:val="22"/>
-          <w:szCs w:val="22"/>
-        </w:rPr>
-        <w:t xml:space="preserve">Novembro de 2017 é o mês de maior receita de toda a base, superando qualquer mês de 2018. Antes de interpretar isso como um patamar superior, o mês foi aberto por dia.</w:t>
-      </w:r>
-    </w:p>
-    <w:p>
-      <w:pPr>
-        <w:spacing w:after="60" w:before="120"/>
-        <w:jc w:val="center"/>
-      </w:pPr>
-      <w:r>
-        <w:drawing>
-          <wp:inline distT="0" distB="0" distL="0" distR="0">
-            <wp:extent cx="5143500" cy="2057400"/>
-            <wp:effectExtent t="0" r="0" b="0" l="0"/>
-            <wp:docPr id="1" name="" descr="" title=""/>
-            <wp:cNvGraphicFramePr>
-              <a:graphicFrameLocks xmlns:a="http://schemas.openxmlformats.org/drawingml/2006/main" noChangeAspect="1"/>
-            </wp:cNvGraphicFramePr>
-            <a:graphic xmlns:a="http://schemas.openxmlformats.org/drawingml/2006/main">
-              <a:graphicData uri="http://schemas.openxmlformats.org/drawingml/2006/picture">
-                <pic:pic xmlns:pic="http://schemas.openxmlformats.org/drawingml/2006/picture">
-                  <pic:nvPicPr>
-                    <pic:cNvPr id="0" name="" descr=""/>
-                    <pic:cNvPicPr>
-                      <a:picLocks noChangeAspect="1" noChangeArrowheads="1"/>
-                    </pic:cNvPicPr>
-                  </pic:nvPicPr>
-                  <pic:blipFill>
-                    <a:blip r:embed="rId9" cstate="none"/>
-                    <a:srcRect/>
-                    <a:stretch>
-                      <a:fillRect/>
-                    </a:stretch>
-                  </pic:blipFill>
-                  <pic:spPr bwMode="auto">
-                    <a:xfrm>
-                      <a:off x="0" y="0"/>
-                      <a:ext cx="5143500" cy="2057400"/>
-                    </a:xfrm>
-                    <a:prstGeom prst="rect">
-                      <a:avLst/>
-                    </a:prstGeom>
-                  </pic:spPr>
-                </pic:pic>
-              </a:graphicData>
-            </a:graphic>
-          </wp:inline>
-        </w:drawing>
-      </w:r>
-    </w:p>
-    <w:p>
-      <w:pPr>
-        <w:spacing w:after="240"/>
-        <w:jc w:val="center"/>
-      </w:pPr>
-      <w:r>
-        <w:rPr>
-          <w:rFonts w:ascii="Calibri" w:cs="Calibri" w:eastAsia="Calibri" w:hAnsi="Calibri"/>
-          <w:i/>
-          <w:iCs/>
-          <w:color w:val="777777"/>
-          <w:sz w:val="18"/>
-          <w:szCs w:val="18"/>
-        </w:rPr>
-        <w:t xml:space="preserve">Figura 2. Pedidos por dia em novembro de 2017.</w:t>
-      </w:r>
-    </w:p>
-    <w:p>
-      <w:pPr>
-        <w:spacing w:after="160" w:line="300"/>
-        <w:jc w:val="both"/>
-      </w:pPr>
-      <w:r>
-        <w:rPr>
-          <w:rFonts w:ascii="Calibri" w:cs="Calibri" w:eastAsia="Calibri" w:hAnsi="Calibri"/>
-          <w:color w:val="444444"/>
-          <w:sz w:val="22"/>
-          <w:szCs w:val="22"/>
-        </w:rPr>
-        <w:t xml:space="preserve">O resultado se concentra em uma única data. Em 24 de novembro, dia da Black Friday, foram registrados 1.166 pedidos, contra uma média de 191 nos demais dias do mês, seis vezes o volume habitual. Dezembro retorna ao patamar anterior.</w:t>
-      </w:r>
-    </w:p>
-    <w:p>
-      <w:pPr>
-        <w:spacing w:after="160" w:line="300"/>
-        <w:jc w:val="both"/>
-      </w:pPr>
-      <w:r>
-        <w:rPr>
-          <w:rFonts w:ascii="Calibri" w:cs="Calibri" w:eastAsia="Calibri" w:hAnsi="Calibri"/>
-          <w:color w:val="444444"/>
-          <w:sz w:val="22"/>
-          <w:szCs w:val="22"/>
-        </w:rPr>
-        <w:t xml:space="preserve">O pico é sazonalidade de varejo e não um novo nível de operação. A capacidade de absorver uma demanda dessa magnitude, por outro lado, é um ponto positivo da plataforma.</w:t>
-      </w:r>
-    </w:p>
-    <w:p>
-      <w:r>
-        <w:br w:type="page"/>
-      </w:r>
-    </w:p>
-    <w:p>
-      <w:pPr>
-        <w:spacing w:after="180" w:before="360"/>
-      </w:pPr>
-      <w:r>
-        <w:rPr>
-          <w:rFonts w:ascii="Calibri" w:cs="Calibri" w:eastAsia="Calibri" w:hAnsi="Calibri"/>
-          <w:b/>
-          <w:bCs/>
-          <w:color w:val="1F4E79"/>
-          <w:sz w:val="30"/>
-          <w:szCs w:val="30"/>
-        </w:rPr>
-        <w:t xml:space="preserve">4. Por que o crescimento parou</w:t>
-      </w:r>
-    </w:p>
-    <w:p>
-      <w:pPr>
-        <w:spacing w:after="160" w:line="300"/>
-        <w:jc w:val="both"/>
-      </w:pPr>
-      <w:r>
-        <w:rPr>
-          <w:rFonts w:ascii="Calibri" w:cs="Calibri" w:eastAsia="Calibri" w:hAnsi="Calibri"/>
-          <w:color w:val="444444"/>
-          <w:sz w:val="22"/>
-          <w:szCs w:val="22"/>
-        </w:rPr>
-        <w:t xml:space="preserve">Receita em um marketplace resulta de dois lados: a oferta, representada pelos vendedores, e a demanda, representada pelos compradores. Contando os dois separadamente ao longo de 2018, é possível identificar qual deles limitou o resultado.</w:t>
-      </w:r>
-    </w:p>
-    <w:p>
-      <w:pPr>
-        <w:spacing w:after="60" w:before="120"/>
-        <w:jc w:val="center"/>
-      </w:pPr>
-      <w:r>
-        <w:drawing>
-          <wp:inline distT="0" distB="0" distL="0" distR="0">
-            <wp:extent cx="5143500" cy="2571750"/>
-            <wp:effectExtent t="0" r="0" b="0" l="0"/>
-            <wp:docPr id="1" name="" descr="" title=""/>
-            <wp:cNvGraphicFramePr>
-              <a:graphicFrameLocks xmlns:a="http://schemas.openxmlformats.org/drawingml/2006/main" noChangeAspect="1"/>
-            </wp:cNvGraphicFramePr>
-            <a:graphic xmlns:a="http://schemas.openxmlformats.org/drawingml/2006/main">
-              <a:graphicData uri="http://schemas.openxmlformats.org/drawingml/2006/picture">
-                <pic:pic xmlns:pic="http://schemas.openxmlformats.org/drawingml/2006/picture">
-                  <pic:nvPicPr>
-                    <pic:cNvPr id="0" name="" descr=""/>
-                    <pic:cNvPicPr>
-                      <a:picLocks noChangeAspect="1" noChangeArrowheads="1"/>
-                    </pic:cNvPicPr>
-                  </pic:nvPicPr>
-                  <pic:blipFill>
-                    <a:blip r:embed="rId10" cstate="none"/>
-                    <a:srcRect/>
-                    <a:stretch>
-                      <a:fillRect/>
-                    </a:stretch>
-                  </pic:blipFill>
-                  <pic:spPr bwMode="auto">
-                    <a:xfrm>
-                      <a:off x="0" y="0"/>
-                      <a:ext cx="5143500" cy="2571750"/>
-                    </a:xfrm>
-                    <a:prstGeom prst="rect">
-                      <a:avLst/>
-                    </a:prstGeom>
-                  </pic:spPr>
-                </pic:pic>
-              </a:graphicData>
-            </a:graphic>
-          </wp:inline>
-        </w:drawing>
-      </w:r>
-    </w:p>
-    <w:p>
-      <w:pPr>
-        <w:spacing w:after="240"/>
-        <w:jc w:val="center"/>
-      </w:pPr>
-      <w:r>
-        <w:rPr>
-          <w:rFonts w:ascii="Calibri" w:cs="Calibri" w:eastAsia="Calibri" w:hAnsi="Calibri"/>
-          <w:i/>
-          <w:iCs/>
-          <w:color w:val="777777"/>
-          <w:sz w:val="18"/>
-          <w:szCs w:val="18"/>
-        </w:rPr>
-        <w:t xml:space="preserve">Figura 3. Clientes e vendedores ativos por mês.</w:t>
-      </w:r>
-    </w:p>
-    <w:p>
-      <w:pPr>
-        <w:spacing w:after="200"/>
-      </w:pPr>
-      <w:r>
-        <w:t xml:space="preserve"/>
-      </w:r>
-    </w:p>
-    <w:tbl>
-      <w:tblPr>
-        <w:tblW w:type="pct" w:w="100%"/>
-        <w:tblBorders>
-          <w:top w:val="single" w:color="auto" w:sz="4"/>
-          <w:left w:val="single" w:color="auto" w:sz="4"/>
-          <w:bottom w:val="single" w:color="auto" w:sz="4"/>
-          <w:right w:val="single" w:color="auto" w:sz="4"/>
-          <w:insideH w:val="single" w:color="auto" w:sz="4"/>
-          <w:insideV w:val="single" w:color="auto" w:sz="4"/>
-        </w:tblBorders>
-      </w:tblPr>
-      <w:tblGrid>
-        <w:gridCol w:w="100"/>
-        <w:gridCol w:w="100"/>
-        <w:gridCol w:w="100"/>
-        <w:gridCol w:w="100"/>
-      </w:tblGrid>
-      <w:tr>
-        <w:tc>
-          <w:tcPr>
-            <w:shd w:fill="1F4E79" w:color="auto" w:val="clear"/>
-            <w:tcMar>
-              <w:top w:type="dxa" w:w="60"/>
-              <w:left w:type="dxa" w:w="110"/>
-              <w:bottom w:type="dxa" w:w="60"/>
-              <w:right w:type="dxa" w:w="110"/>
-            </w:tcMar>
-          </w:tcPr>
-          <w:p>
-            <w:pPr>
-              <w:spacing w:after="60" w:before="60"/>
-            </w:pPr>
-            <w:r>
-              <w:rPr>
-                <w:rFonts w:ascii="Calibri" w:cs="Calibri" w:eastAsia="Calibri" w:hAnsi="Calibri"/>
-                <w:b/>
-                <w:bCs/>
-                <w:color w:val="FFFFFF"/>
-                <w:sz w:val="20"/>
-                <w:szCs w:val="20"/>
-              </w:rPr>
-              <w:t xml:space="preserve">Indicador</w:t>
-            </w:r>
-          </w:p>
-        </w:tc>
-        <w:tc>
-          <w:tcPr>
-            <w:shd w:fill="1F4E79" w:color="auto" w:val="clear"/>
-            <w:tcMar>
-              <w:top w:type="dxa" w:w="60"/>
-              <w:left w:type="dxa" w:w="110"/>
-              <w:bottom w:type="dxa" w:w="60"/>
-              <w:right w:type="dxa" w:w="110"/>
-            </w:tcMar>
-          </w:tcPr>
-          <w:p>
-            <w:pPr>
-              <w:spacing w:after="60" w:before="60"/>
-            </w:pPr>
-            <w:r>
-              <w:rPr>
-                <w:rFonts w:ascii="Calibri" w:cs="Calibri" w:eastAsia="Calibri" w:hAnsi="Calibri"/>
-                <w:b/>
-                <w:bCs/>
-                <w:color w:val="FFFFFF"/>
-                <w:sz w:val="20"/>
-                <w:szCs w:val="20"/>
-              </w:rPr>
-              <w:t xml:space="preserve">Janeiro 2018</w:t>
-            </w:r>
-          </w:p>
-        </w:tc>
-        <w:tc>
-          <w:tcPr>
-            <w:shd w:fill="1F4E79" w:color="auto" w:val="clear"/>
-            <w:tcMar>
-              <w:top w:type="dxa" w:w="60"/>
-              <w:left w:type="dxa" w:w="110"/>
-              <w:bottom w:type="dxa" w:w="60"/>
-              <w:right w:type="dxa" w:w="110"/>
-            </w:tcMar>
-          </w:tcPr>
-          <w:p>
-            <w:pPr>
-              <w:spacing w:after="60" w:before="60"/>
-            </w:pPr>
-            <w:r>
-              <w:rPr>
-                <w:rFonts w:ascii="Calibri" w:cs="Calibri" w:eastAsia="Calibri" w:hAnsi="Calibri"/>
-                <w:b/>
-                <w:bCs/>
-                <w:color w:val="FFFFFF"/>
-                <w:sz w:val="20"/>
-                <w:szCs w:val="20"/>
-              </w:rPr>
-              <w:t xml:space="preserve">Agosto 2018</w:t>
-            </w:r>
-          </w:p>
-        </w:tc>
-        <w:tc>
-          <w:tcPr>
-            <w:shd w:fill="1F4E79" w:color="auto" w:val="clear"/>
-            <w:tcMar>
-              <w:top w:type="dxa" w:w="60"/>
-              <w:left w:type="dxa" w:w="110"/>
-              <w:bottom w:type="dxa" w:w="60"/>
-              <w:right w:type="dxa" w:w="110"/>
-            </w:tcMar>
-          </w:tcPr>
-          <w:p>
-            <w:pPr>
-              <w:spacing w:after="60" w:before="60"/>
-            </w:pPr>
-            <w:r>
-              <w:rPr>
-                <w:rFonts w:ascii="Calibri" w:cs="Calibri" w:eastAsia="Calibri" w:hAnsi="Calibri"/>
-                <w:b/>
-                <w:bCs/>
-                <w:color w:val="FFFFFF"/>
-                <w:sz w:val="20"/>
-                <w:szCs w:val="20"/>
-              </w:rPr>
-              <w:t xml:space="preserve">Variação</w:t>
-            </w:r>
-          </w:p>
-        </w:tc>
-      </w:tr>
-      <w:tr>
-        <w:tc>
-          <w:tcPr>
-            <w:tcMar>
-              <w:top w:type="dxa" w:w="60"/>
-              <w:left w:type="dxa" w:w="110"/>
-              <w:bottom w:type="dxa" w:w="60"/>
-              <w:right w:type="dxa" w:w="110"/>
-            </w:tcMar>
-          </w:tcPr>
-          <w:p>
-            <w:pPr>
-              <w:spacing w:after="60" w:before="60"/>
-            </w:pPr>
-            <w:r>
-              <w:rPr>
-                <w:rFonts w:ascii="Calibri" w:cs="Calibri" w:eastAsia="Calibri" w:hAnsi="Calibri"/>
-                <w:b w:val="false"/>
-                <w:bCs w:val="false"/>
-                <w:color w:val="444444"/>
-                <w:sz w:val="20"/>
-                <w:szCs w:val="20"/>
-              </w:rPr>
-              <w:t xml:space="preserve">Vendedores ativos</w:t>
-            </w:r>
-          </w:p>
-        </w:tc>
-        <w:tc>
-          <w:tcPr>
-            <w:tcMar>
-              <w:top w:type="dxa" w:w="60"/>
-              <w:left w:type="dxa" w:w="110"/>
-              <w:bottom w:type="dxa" w:w="60"/>
-              <w:right w:type="dxa" w:w="110"/>
-            </w:tcMar>
-          </w:tcPr>
-          <w:p>
-            <w:pPr>
-              <w:spacing w:after="60" w:before="60"/>
-            </w:pPr>
-            <w:r>
-              <w:rPr>
-                <w:rFonts w:ascii="Calibri" w:cs="Calibri" w:eastAsia="Calibri" w:hAnsi="Calibri"/>
-                <w:b w:val="false"/>
-                <w:bCs w:val="false"/>
-                <w:color w:val="444444"/>
-                <w:sz w:val="20"/>
-                <w:szCs w:val="20"/>
-              </w:rPr>
-              <w:t xml:space="preserve">968</w:t>
-            </w:r>
-          </w:p>
-        </w:tc>
-        <w:tc>
-          <w:tcPr>
-            <w:tcMar>
-              <w:top w:type="dxa" w:w="60"/>
-              <w:left w:type="dxa" w:w="110"/>
-              <w:bottom w:type="dxa" w:w="60"/>
-              <w:right w:type="dxa" w:w="110"/>
-            </w:tcMar>
-          </w:tcPr>
-          <w:p>
-            <w:pPr>
-              <w:spacing w:after="60" w:before="60"/>
-            </w:pPr>
-            <w:r>
-              <w:rPr>
-                <w:rFonts w:ascii="Calibri" w:cs="Calibri" w:eastAsia="Calibri" w:hAnsi="Calibri"/>
-                <w:b w:val="false"/>
-                <w:bCs w:val="false"/>
-                <w:color w:val="444444"/>
-                <w:sz w:val="20"/>
-                <w:szCs w:val="20"/>
-              </w:rPr>
-              <w:t xml:space="preserve">1.266</w:t>
-            </w:r>
-          </w:p>
-        </w:tc>
-        <w:tc>
-          <w:tcPr>
-            <w:tcMar>
-              <w:top w:type="dxa" w:w="60"/>
-              <w:left w:type="dxa" w:w="110"/>
-              <w:bottom w:type="dxa" w:w="60"/>
-              <w:right w:type="dxa" w:w="110"/>
-            </w:tcMar>
-          </w:tcPr>
-          <w:p>
-            <w:pPr>
-              <w:spacing w:after="60" w:before="60"/>
-            </w:pPr>
-            <w:r>
-              <w:rPr>
-                <w:rFonts w:ascii="Calibri" w:cs="Calibri" w:eastAsia="Calibri" w:hAnsi="Calibri"/>
-                <w:b w:val="false"/>
-                <w:bCs w:val="false"/>
-                <w:color w:val="444444"/>
-                <w:sz w:val="20"/>
-                <w:szCs w:val="20"/>
-              </w:rPr>
-              <w:t xml:space="preserve">+30,8%</w:t>
-            </w:r>
-          </w:p>
-        </w:tc>
-      </w:tr>
-      <w:tr>
-        <w:tc>
-          <w:tcPr>
-            <w:tcMar>
-              <w:top w:type="dxa" w:w="60"/>
-              <w:left w:type="dxa" w:w="110"/>
-              <w:bottom w:type="dxa" w:w="60"/>
-              <w:right w:type="dxa" w:w="110"/>
-            </w:tcMar>
-          </w:tcPr>
-          <w:p>
-            <w:pPr>
-              <w:spacing w:after="60" w:before="60"/>
-            </w:pPr>
-            <w:r>
-              <w:rPr>
-                <w:rFonts w:ascii="Calibri" w:cs="Calibri" w:eastAsia="Calibri" w:hAnsi="Calibri"/>
-                <w:b w:val="false"/>
-                <w:bCs w:val="false"/>
-                <w:color w:val="444444"/>
-                <w:sz w:val="20"/>
-                <w:szCs w:val="20"/>
-              </w:rPr>
-              <w:t xml:space="preserve">Clientes</w:t>
-            </w:r>
-          </w:p>
-        </w:tc>
-        <w:tc>
-          <w:tcPr>
-            <w:tcMar>
-              <w:top w:type="dxa" w:w="60"/>
-              <w:left w:type="dxa" w:w="110"/>
-              <w:bottom w:type="dxa" w:w="60"/>
-              <w:right w:type="dxa" w:w="110"/>
-            </w:tcMar>
-          </w:tcPr>
-          <w:p>
-            <w:pPr>
-              <w:spacing w:after="60" w:before="60"/>
-            </w:pPr>
-            <w:r>
-              <w:rPr>
-                <w:rFonts w:ascii="Calibri" w:cs="Calibri" w:eastAsia="Calibri" w:hAnsi="Calibri"/>
-                <w:b w:val="false"/>
-                <w:bCs w:val="false"/>
-                <w:color w:val="444444"/>
-                <w:sz w:val="20"/>
-                <w:szCs w:val="20"/>
-              </w:rPr>
-              <w:t xml:space="preserve">7.088</w:t>
-            </w:r>
-          </w:p>
-        </w:tc>
-        <w:tc>
-          <w:tcPr>
-            <w:tcMar>
-              <w:top w:type="dxa" w:w="60"/>
-              <w:left w:type="dxa" w:w="110"/>
-              <w:bottom w:type="dxa" w:w="60"/>
-              <w:right w:type="dxa" w:w="110"/>
-            </w:tcMar>
-          </w:tcPr>
-          <w:p>
-            <w:pPr>
-              <w:spacing w:after="60" w:before="60"/>
-            </w:pPr>
-            <w:r>
-              <w:rPr>
-                <w:rFonts w:ascii="Calibri" w:cs="Calibri" w:eastAsia="Calibri" w:hAnsi="Calibri"/>
-                <w:b w:val="false"/>
-                <w:bCs w:val="false"/>
-                <w:color w:val="444444"/>
-                <w:sz w:val="20"/>
-                <w:szCs w:val="20"/>
-              </w:rPr>
-              <w:t xml:space="preserve">6.380</w:t>
-            </w:r>
-          </w:p>
-        </w:tc>
-        <w:tc>
-          <w:tcPr>
-            <w:tcMar>
-              <w:top w:type="dxa" w:w="60"/>
-              <w:left w:type="dxa" w:w="110"/>
-              <w:bottom w:type="dxa" w:w="60"/>
-              <w:right w:type="dxa" w:w="110"/>
-            </w:tcMar>
-          </w:tcPr>
-          <w:p>
-            <w:pPr>
-              <w:spacing w:after="60" w:before="60"/>
-            </w:pPr>
-            <w:r>
-              <w:rPr>
-                <w:rFonts w:ascii="Calibri" w:cs="Calibri" w:eastAsia="Calibri" w:hAnsi="Calibri"/>
-                <w:b w:val="false"/>
-                <w:bCs w:val="false"/>
-                <w:color w:val="444444"/>
-                <w:sz w:val="20"/>
-                <w:szCs w:val="20"/>
-              </w:rPr>
-              <w:t xml:space="preserve">-10,0%</w:t>
-            </w:r>
-          </w:p>
-        </w:tc>
-      </w:tr>
-      <w:tr>
-        <w:tc>
-          <w:tcPr>
-            <w:tcMar>
-              <w:top w:type="dxa" w:w="60"/>
-              <w:left w:type="dxa" w:w="110"/>
-              <w:bottom w:type="dxa" w:w="60"/>
-              <w:right w:type="dxa" w:w="110"/>
-            </w:tcMar>
-          </w:tcPr>
-          <w:p>
-            <w:pPr>
-              <w:spacing w:after="60" w:before="60"/>
-            </w:pPr>
-            <w:r>
-              <w:rPr>
-                <w:rFonts w:ascii="Calibri" w:cs="Calibri" w:eastAsia="Calibri" w:hAnsi="Calibri"/>
-                <w:b w:val="false"/>
-                <w:bCs w:val="false"/>
-                <w:color w:val="444444"/>
-                <w:sz w:val="20"/>
-                <w:szCs w:val="20"/>
-              </w:rPr>
-              <w:t xml:space="preserve">Receita por vendedor</w:t>
-            </w:r>
-          </w:p>
-        </w:tc>
-        <w:tc>
-          <w:tcPr>
-            <w:tcMar>
-              <w:top w:type="dxa" w:w="60"/>
-              <w:left w:type="dxa" w:w="110"/>
-              <w:bottom w:type="dxa" w:w="60"/>
-              <w:right w:type="dxa" w:w="110"/>
-            </w:tcMar>
-          </w:tcPr>
-          <w:p>
-            <w:pPr>
-              <w:spacing w:after="60" w:before="60"/>
-            </w:pPr>
-            <w:r>
-              <w:rPr>
-                <w:rFonts w:ascii="Calibri" w:cs="Calibri" w:eastAsia="Calibri" w:hAnsi="Calibri"/>
-                <w:b w:val="false"/>
-                <w:bCs w:val="false"/>
-                <w:color w:val="444444"/>
-                <w:sz w:val="20"/>
-                <w:szCs w:val="20"/>
-              </w:rPr>
-              <w:t xml:space="preserve">R$ 1.138</w:t>
-            </w:r>
-          </w:p>
-        </w:tc>
-        <w:tc>
-          <w:tcPr>
-            <w:tcMar>
-              <w:top w:type="dxa" w:w="60"/>
-              <w:left w:type="dxa" w:w="110"/>
-              <w:bottom w:type="dxa" w:w="60"/>
-              <w:right w:type="dxa" w:w="110"/>
-            </w:tcMar>
-          </w:tcPr>
-          <w:p>
-            <w:pPr>
-              <w:spacing w:after="60" w:before="60"/>
-            </w:pPr>
-            <w:r>
-              <w:rPr>
-                <w:rFonts w:ascii="Calibri" w:cs="Calibri" w:eastAsia="Calibri" w:hAnsi="Calibri"/>
-                <w:b w:val="false"/>
-                <w:bCs w:val="false"/>
-                <w:color w:val="444444"/>
-                <w:sz w:val="20"/>
-                <w:szCs w:val="20"/>
-              </w:rPr>
-              <w:t xml:space="preserve">R$ 788</w:t>
-            </w:r>
-          </w:p>
-        </w:tc>
-        <w:tc>
-          <w:tcPr>
-            <w:tcMar>
-              <w:top w:type="dxa" w:w="60"/>
-              <w:left w:type="dxa" w:w="110"/>
-              <w:bottom w:type="dxa" w:w="60"/>
-              <w:right w:type="dxa" w:w="110"/>
-            </w:tcMar>
-          </w:tcPr>
-          <w:p>
-            <w:pPr>
-              <w:spacing w:after="60" w:before="60"/>
-            </w:pPr>
-            <w:r>
-              <w:rPr>
-                <w:rFonts w:ascii="Calibri" w:cs="Calibri" w:eastAsia="Calibri" w:hAnsi="Calibri"/>
-                <w:b w:val="false"/>
-                <w:bCs w:val="false"/>
-                <w:color w:val="444444"/>
-                <w:sz w:val="20"/>
-                <w:szCs w:val="20"/>
-              </w:rPr>
-              <w:t xml:space="preserve">-30,8%</w:t>
-            </w:r>
-          </w:p>
-        </w:tc>
-      </w:tr>
-    </w:tbl>
-    <w:p>
-      <w:pPr>
-        <w:spacing w:after="200"/>
-      </w:pPr>
-      <w:r>
-        <w:t xml:space="preserve"/>
-      </w:r>
-    </w:p>
-    <w:p>
-      <w:pPr>
-        <w:spacing w:after="160" w:line="300"/>
-        <w:jc w:val="both"/>
-      </w:pPr>
-      <w:r>
-        <w:rPr>
-          <w:rFonts w:ascii="Calibri" w:cs="Calibri" w:eastAsia="Calibri" w:hAnsi="Calibri"/>
-          <w:color w:val="444444"/>
-          <w:sz w:val="22"/>
-          <w:szCs w:val="22"/>
-        </w:rPr>
-        <w:t xml:space="preserve">A oferta continuou crescendo. A demanda recuou. Como consequência, o mesmo volume de vendas passou a ser distribuído entre um número maior de vendedores, e o resultado individual de cada um caiu quase um terço em oito meses.</w:t>
-      </w:r>
-    </w:p>
-    <w:p>
-      <w:pPr>
-        <w:spacing w:after="160" w:line="300"/>
-        <w:jc w:val="both"/>
-      </w:pPr>
-      <w:r>
-        <w:rPr>
-          <w:rFonts w:ascii="Calibri" w:cs="Calibri" w:eastAsia="Calibri" w:hAnsi="Calibri"/>
-          <w:color w:val="444444"/>
-          <w:sz w:val="22"/>
-          <w:szCs w:val="22"/>
-        </w:rPr>
-        <w:t xml:space="preserve">Esse achado inverte a recomendação intuitiva. Ampliar a base de vendedores neste momento não aumenta a receita da plataforma e deteriora o desempenho de quem já opera nela. A prioridade está do lado da demanda.</w:t>
-      </w:r>
-    </w:p>
-    <w:p>
-      <w:pPr>
-        <w:spacing w:after="130" w:before="260"/>
-      </w:pPr>
-      <w:r>
-        <w:rPr>
-          <w:rFonts w:ascii="Calibri" w:cs="Calibri" w:eastAsia="Calibri" w:hAnsi="Calibri"/>
-          <w:b/>
-          <w:bCs/>
-          <w:color w:val="1F4E79"/>
-          <w:sz w:val="24"/>
-          <w:szCs w:val="24"/>
-        </w:rPr>
-        <w:t xml:space="preserve">4.1 Onde a demanda não se materializa</w:t>
-      </w:r>
-    </w:p>
-    <w:p>
-      <w:pPr>
-        <w:spacing w:after="160" w:line="300"/>
-        <w:jc w:val="both"/>
-      </w:pPr>
-      <w:r>
-        <w:rPr>
-          <w:rFonts w:ascii="Calibri" w:cs="Calibri" w:eastAsia="Calibri" w:hAnsi="Calibri"/>
-          <w:color w:val="444444"/>
-          <w:sz w:val="22"/>
-          <w:szCs w:val="22"/>
-        </w:rPr>
-        <w:t xml:space="preserve">A receita está distribuída de forma saudável em dois eixos e concentrada em um terceiro. São 72 categorias de produto, com as cinco maiores somando 39,3%, e 3.029 vendedores, com os dez maiores somando apenas 12,9%. Não há dependência de produto-âncora nem de fornecedor específico.</w:t>
-      </w:r>
-    </w:p>
-    <w:p>
-      <w:pPr>
-        <w:spacing w:after="160" w:line="300"/>
-        <w:jc w:val="both"/>
-      </w:pPr>
-      <w:r>
-        <w:rPr>
-          <w:rFonts w:ascii="Calibri" w:cs="Calibri" w:eastAsia="Calibri" w:hAnsi="Calibri"/>
-          <w:color w:val="444444"/>
-          <w:sz w:val="22"/>
-          <w:szCs w:val="22"/>
-        </w:rPr>
-        <w:t xml:space="preserve">A concentração está na geografia. São Paulo responde sozinho por 37,4% da receita e os cinco maiores estados somam 73,1%, restando 26,9% distribuídos entre os outros 22 estados.</w:t>
-      </w:r>
-    </w:p>
-    <w:p>
-      <w:pPr>
-        <w:spacing w:after="60" w:before="120"/>
-        <w:jc w:val="center"/>
-      </w:pPr>
-      <w:r>
-        <w:drawing>
-          <wp:inline distT="0" distB="0" distL="0" distR="0">
-            <wp:extent cx="5334000" cy="1905000"/>
             <wp:effectExtent t="0" r="0" b="0" l="0"/>
             <wp:docPr id="1" name="" descr="" title=""/>
             <wp:cNvGraphicFramePr>
@@ -2453,7 +2472,7 @@
                   <pic:spPr bwMode="auto">
                     <a:xfrm>
                       <a:off x="0" y="0"/>
-                      <a:ext cx="5334000" cy="1905000"/>
+                      <a:ext cx="5143500" cy="2571750"/>
                     </a:xfrm>
                     <a:prstGeom prst="rect">
                       <a:avLst/>
@@ -2480,17 +2499,28 @@
           <w:sz w:val="18"/>
           <w:szCs w:val="18"/>
         </w:rPr>
-        <w:t xml:space="preserve">Figura 4. Distribuição da receita por categoria e por estado.</w:t>
-      </w:r>
-    </w:p>
-    <w:p>
-      <w:r>
-        <w:br w:type="page"/>
-      </w:r>
-    </w:p>
-    <w:p>
-      <w:pPr>
-        <w:spacing w:after="180" w:before="360"/>
+        <w:t xml:space="preserve">Figura 1. Receita mensal entre janeiro de 2017 e agosto de 2018.</w:t>
+      </w:r>
+    </w:p>
+    <w:p>
+      <w:pPr>
+        <w:spacing w:after="160" w:line="300"/>
+        <w:jc w:val="both"/>
+      </w:pPr>
+      <w:r>
+        <w:rPr>
+          <w:rFonts w:ascii="Calibri" w:cs="Calibri" w:eastAsia="Calibri" w:hAnsi="Calibri"/>
+          <w:color w:val="444444"/>
+          <w:sz w:val="22"/>
+          <w:szCs w:val="22"/>
+        </w:rPr>
+        <w:t xml:space="preserve">O gráfico revela duas fases distintas. Durante 2017 o crescimento é consistente. A partir do início de 2018 a curva se achata e passa a oscilar em torno de R$ 1 milhão mensais. Comparando os dois quadrimestres de 2018, a média mensal recua de R$ 1,10 milhão para R$ 1,05 milhão.</w:t>
+      </w:r>
+    </w:p>
+    <w:p>
+      <w:pPr>
+        <w:keepNext/>
+        <w:spacing w:after="130" w:before="260"/>
       </w:pPr>
       <w:r>
         <w:rPr>
@@ -2498,10 +2528,10 @@
           <w:b/>
           <w:bCs/>
           <w:color w:val="1F4E79"/>
-          <w:sz w:val="30"/>
-          <w:szCs w:val="30"/>
-        </w:rPr>
-        <w:t xml:space="preserve">5. A operação explica parte da concentração</w:t>
+          <w:sz w:val="24"/>
+          <w:szCs w:val="24"/>
+        </w:rPr>
+        <w:t xml:space="preserve">3.1 O crescimento veio de volume, não de valor</w:t>
       </w:r>
     </w:p>
     <w:p>
@@ -2516,7 +2546,54 @@
           <w:sz w:val="22"/>
           <w:szCs w:val="22"/>
         </w:rPr>
-        <w:t xml:space="preserve">Duas hipóteses explicariam a concentração geográfica. A primeira é que o mercado fora do Sudeste simplesmente compra menos, por população e renda. A segunda é que a experiência de compra é pior nessas regiões. As duas conduzem a decisões opostas, e por isso foram testadas.</w:t>
+        <w:t xml:space="preserve">O valor médio por pedido permaneceu estável durante todo o período, entre R$ 146 e R$ 174. Considerando os pedidos individualmente, a média é de R$ 160,19 e a mediana de R$ 105,28, com coeficiente de variação de 137%.</w:t>
+      </w:r>
+    </w:p>
+    <w:p>
+      <w:pPr>
+        <w:spacing w:after="160" w:line="300"/>
+        <w:jc w:val="both"/>
+      </w:pPr>
+      <w:r>
+        <w:rPr>
+          <w:rFonts w:ascii="Calibri" w:cs="Calibri" w:eastAsia="Calibri" w:hAnsi="Calibri"/>
+          <w:color w:val="444444"/>
+          <w:sz w:val="22"/>
+          <w:szCs w:val="22"/>
+        </w:rPr>
+        <w:t xml:space="preserve">A diferença entre média e mediana indica distribuição assimétrica: a maior parte dos pedidos tem valor baixo e um conjunto reduzido de pedidos caros eleva a média. A mediana representa melhor o pedido típico. Na prática, o crescimento da receita decorreu de vender mais pedidos, não de vender pedidos mais caros.</w:t>
+      </w:r>
+    </w:p>
+    <w:p>
+      <w:pPr>
+        <w:keepNext/>
+        <w:spacing w:after="130" w:before="260"/>
+      </w:pPr>
+      <w:r>
+        <w:rPr>
+          <w:rFonts w:ascii="Calibri" w:cs="Calibri" w:eastAsia="Calibri" w:hAnsi="Calibri"/>
+          <w:b/>
+          <w:bCs/>
+          <w:color w:val="1F4E79"/>
+          <w:sz w:val="24"/>
+          <w:szCs w:val="24"/>
+        </w:rPr>
+        <w:t xml:space="preserve">3.2 O maior mês da série é sazonalidade</w:t>
+      </w:r>
+    </w:p>
+    <w:p>
+      <w:pPr>
+        <w:spacing w:after="160" w:line="300"/>
+        <w:jc w:val="both"/>
+      </w:pPr>
+      <w:r>
+        <w:rPr>
+          <w:rFonts w:ascii="Calibri" w:cs="Calibri" w:eastAsia="Calibri" w:hAnsi="Calibri"/>
+          <w:color w:val="444444"/>
+          <w:sz w:val="22"/>
+          <w:szCs w:val="22"/>
+        </w:rPr>
+        <w:t xml:space="preserve">Novembro de 2017 é o mês de maior receita de toda a base, superando qualquer mês de 2018. Antes de interpretar isso como um patamar superior, o mês foi aberto por dia.</w:t>
       </w:r>
     </w:p>
     <w:p>
@@ -2527,7 +2604,7 @@
       <w:r>
         <w:drawing>
           <wp:inline distT="0" distB="0" distL="0" distR="0">
-            <wp:extent cx="4572000" cy="3048000"/>
+            <wp:extent cx="5143500" cy="2057400"/>
             <wp:effectExtent t="0" r="0" b="0" l="0"/>
             <wp:docPr id="1" name="" descr="" title=""/>
             <wp:cNvGraphicFramePr>
@@ -2552,7 +2629,7 @@
                   <pic:spPr bwMode="auto">
                     <a:xfrm>
                       <a:off x="0" y="0"/>
-                      <a:ext cx="4572000" cy="3048000"/>
+                      <a:ext cx="5143500" cy="2057400"/>
                     </a:xfrm>
                     <a:prstGeom prst="rect">
                       <a:avLst/>
@@ -2579,7 +2656,7 @@
           <w:sz w:val="18"/>
           <w:szCs w:val="18"/>
         </w:rPr>
-        <w:t xml:space="preserve">Figura 5. Participação na receita e tempo médio de entrega, por estado.</w:t>
+        <w:t xml:space="preserve">Figura 2. Pedidos por dia em novembro de 2017.</w:t>
       </w:r>
     </w:p>
     <w:p>
@@ -2594,7 +2671,7 @@
           <w:sz w:val="22"/>
           <w:szCs w:val="22"/>
         </w:rPr>
-        <w:t xml:space="preserve">Os cinco estados que concentram 73,1% da receita recebem seus pedidos em 10,5 dias em média. Os outros 22 esperam 17,3 dias. São Paulo é o mais rápido do país, com 8,3 dias, e Roraima o mais lento, com 29,5 dias. A correlação entre tempo de entrega e participação na receita é de -0,60.</w:t>
+        <w:t xml:space="preserve">O resultado se concentra em uma única data. Em 24 de novembro, dia da Black Friday, foram registrados 1.166 pedidos, contra uma média de 191 nos demais dias do mês, seis vezes o volume habitual. Dezembro retorna ao patamar anterior.</w:t>
       </w:r>
     </w:p>
     <w:p>
@@ -2609,27 +2686,21 @@
           <w:sz w:val="22"/>
           <w:szCs w:val="22"/>
         </w:rPr>
-        <w:t xml:space="preserve">O custo acompanha o prazo. Em São Paulo o frete equivale a 13,8% do valor do produto, enquanto no Maranhão e em Roraima ultrapassa 26%. Fora do Sudeste, comprar demora quase o dobro e custa quase o dobro em frete.</w:t>
-      </w:r>
-    </w:p>
-    <w:p>
-      <w:pPr>
-        <w:spacing w:after="160" w:line="300"/>
-        <w:jc w:val="both"/>
-      </w:pPr>
-      <w:r>
-        <w:rPr>
-          <w:rFonts w:ascii="Calibri" w:cs="Calibri" w:eastAsia="Calibri" w:hAnsi="Calibri"/>
-          <w:color w:val="444444"/>
-          <w:sz w:val="22"/>
-          <w:szCs w:val="22"/>
-        </w:rPr>
-        <w:t xml:space="preserve">Cabe registrar que se trata de correlação e não de prova de causa, uma vez que São Paulo também concentra população e renda. A operação, contudo, é a parcela do problema que a empresa controla, e isso é o que torna o achado acionável.</w:t>
-      </w:r>
-    </w:p>
-    <w:p>
-      <w:pPr>
-        <w:spacing w:after="130" w:before="260"/>
+        <w:t xml:space="preserve">O pico é sazonalidade de varejo e não um novo nível de operação. A capacidade de absorver uma demanda dessa magnitude, por outro lado, é um ponto positivo da plataforma.</w:t>
+      </w:r>
+    </w:p>
+    <w:p>
+      <w:r>
+        <w:br w:type="page"/>
+      </w:r>
+    </w:p>
+    <w:p>
+      <w:pPr>
+        <w:keepNext/>
+        <w:pBdr>
+          <w:bottom w:val="single" w:color="D9D9D9" w:sz="6" w:space="6"/>
+        </w:pBdr>
+        <w:spacing w:after="180" w:before="360"/>
       </w:pPr>
       <w:r>
         <w:rPr>
@@ -2637,10 +2708,25 @@
           <w:b/>
           <w:bCs/>
           <w:color w:val="1F4E79"/>
-          <w:sz w:val="24"/>
-          <w:szCs w:val="24"/>
-        </w:rPr>
-        <w:t xml:space="preserve">5.1 Atraso e demora são problemas diferentes</w:t>
+          <w:sz w:val="30"/>
+          <w:szCs w:val="30"/>
+        </w:rPr>
+        <w:t xml:space="preserve">4. Por que o crescimento parou</w:t>
+      </w:r>
+    </w:p>
+    <w:p>
+      <w:pPr>
+        <w:spacing w:after="160" w:line="300"/>
+        <w:jc w:val="both"/>
+      </w:pPr>
+      <w:r>
+        <w:rPr>
+          <w:rFonts w:ascii="Calibri" w:cs="Calibri" w:eastAsia="Calibri" w:hAnsi="Calibri"/>
+          <w:color w:val="444444"/>
+          <w:sz w:val="22"/>
+          <w:szCs w:val="22"/>
+        </w:rPr>
+        <w:t xml:space="preserve">Receita em um marketplace resulta de dois lados: a oferta, representada pelos vendedores, e a demanda, representada pelos compradores. Contando os dois separadamente ao longo de 2018, é possível identificar qual deles limitou o resultado.</w:t>
       </w:r>
     </w:p>
     <w:p>
@@ -2651,7 +2737,7 @@
       <w:r>
         <w:drawing>
           <wp:inline distT="0" distB="0" distL="0" distR="0">
-            <wp:extent cx="4953000" cy="2476500"/>
+            <wp:extent cx="5143500" cy="2571750"/>
             <wp:effectExtent t="0" r="0" b="0" l="0"/>
             <wp:docPr id="1" name="" descr="" title=""/>
             <wp:cNvGraphicFramePr>
@@ -2676,7 +2762,7 @@
                   <pic:spPr bwMode="auto">
                     <a:xfrm>
                       <a:off x="0" y="0"/>
-                      <a:ext cx="4953000" cy="2476500"/>
+                      <a:ext cx="5143500" cy="2571750"/>
                     </a:xfrm>
                     <a:prstGeom prst="rect">
                       <a:avLst/>
@@ -2703,7 +2789,470 @@
           <w:sz w:val="18"/>
           <w:szCs w:val="18"/>
         </w:rPr>
-        <w:t xml:space="preserve">Figura 6. Percentual de pedidos entregues após a data prometida.</w:t>
+        <w:t xml:space="preserve">Figura 3. Clientes e vendedores ativos por mês.</w:t>
+      </w:r>
+    </w:p>
+    <w:p>
+      <w:pPr>
+        <w:spacing w:after="200"/>
+      </w:pPr>
+      <w:r>
+        <w:t xml:space="preserve"/>
+      </w:r>
+    </w:p>
+    <w:tbl>
+      <w:tblPr>
+        <w:tblW w:type="pct" w:w="100%"/>
+        <w:tblBorders>
+          <w:top w:val="single" w:color="auto" w:sz="4"/>
+          <w:left w:val="single" w:color="auto" w:sz="4"/>
+          <w:bottom w:val="single" w:color="auto" w:sz="4"/>
+          <w:right w:val="single" w:color="auto" w:sz="4"/>
+          <w:insideH w:val="single" w:color="auto" w:sz="4"/>
+          <w:insideV w:val="single" w:color="auto" w:sz="4"/>
+        </w:tblBorders>
+      </w:tblPr>
+      <w:tblGrid>
+        <w:gridCol w:w="100"/>
+        <w:gridCol w:w="100"/>
+        <w:gridCol w:w="100"/>
+        <w:gridCol w:w="100"/>
+      </w:tblGrid>
+      <w:tr>
+        <w:tc>
+          <w:tcPr>
+            <w:shd w:fill="1F4E79" w:color="auto" w:val="clear"/>
+            <w:tcMar>
+              <w:top w:type="dxa" w:w="60"/>
+              <w:left w:type="dxa" w:w="110"/>
+              <w:bottom w:type="dxa" w:w="60"/>
+              <w:right w:type="dxa" w:w="110"/>
+            </w:tcMar>
+          </w:tcPr>
+          <w:p>
+            <w:pPr>
+              <w:spacing w:after="60" w:before="60"/>
+            </w:pPr>
+            <w:r>
+              <w:rPr>
+                <w:rFonts w:ascii="Calibri" w:cs="Calibri" w:eastAsia="Calibri" w:hAnsi="Calibri"/>
+                <w:b/>
+                <w:bCs/>
+                <w:color w:val="FFFFFF"/>
+                <w:sz w:val="20"/>
+                <w:szCs w:val="20"/>
+              </w:rPr>
+              <w:t xml:space="preserve">Indicador</w:t>
+            </w:r>
+          </w:p>
+        </w:tc>
+        <w:tc>
+          <w:tcPr>
+            <w:shd w:fill="1F4E79" w:color="auto" w:val="clear"/>
+            <w:tcMar>
+              <w:top w:type="dxa" w:w="60"/>
+              <w:left w:type="dxa" w:w="110"/>
+              <w:bottom w:type="dxa" w:w="60"/>
+              <w:right w:type="dxa" w:w="110"/>
+            </w:tcMar>
+          </w:tcPr>
+          <w:p>
+            <w:pPr>
+              <w:spacing w:after="60" w:before="60"/>
+            </w:pPr>
+            <w:r>
+              <w:rPr>
+                <w:rFonts w:ascii="Calibri" w:cs="Calibri" w:eastAsia="Calibri" w:hAnsi="Calibri"/>
+                <w:b/>
+                <w:bCs/>
+                <w:color w:val="FFFFFF"/>
+                <w:sz w:val="20"/>
+                <w:szCs w:val="20"/>
+              </w:rPr>
+              <w:t xml:space="preserve">Janeiro 2018</w:t>
+            </w:r>
+          </w:p>
+        </w:tc>
+        <w:tc>
+          <w:tcPr>
+            <w:shd w:fill="1F4E79" w:color="auto" w:val="clear"/>
+            <w:tcMar>
+              <w:top w:type="dxa" w:w="60"/>
+              <w:left w:type="dxa" w:w="110"/>
+              <w:bottom w:type="dxa" w:w="60"/>
+              <w:right w:type="dxa" w:w="110"/>
+            </w:tcMar>
+          </w:tcPr>
+          <w:p>
+            <w:pPr>
+              <w:spacing w:after="60" w:before="60"/>
+            </w:pPr>
+            <w:r>
+              <w:rPr>
+                <w:rFonts w:ascii="Calibri" w:cs="Calibri" w:eastAsia="Calibri" w:hAnsi="Calibri"/>
+                <w:b/>
+                <w:bCs/>
+                <w:color w:val="FFFFFF"/>
+                <w:sz w:val="20"/>
+                <w:szCs w:val="20"/>
+              </w:rPr>
+              <w:t xml:space="preserve">Agosto 2018</w:t>
+            </w:r>
+          </w:p>
+        </w:tc>
+        <w:tc>
+          <w:tcPr>
+            <w:shd w:fill="1F4E79" w:color="auto" w:val="clear"/>
+            <w:tcMar>
+              <w:top w:type="dxa" w:w="60"/>
+              <w:left w:type="dxa" w:w="110"/>
+              <w:bottom w:type="dxa" w:w="60"/>
+              <w:right w:type="dxa" w:w="110"/>
+            </w:tcMar>
+          </w:tcPr>
+          <w:p>
+            <w:pPr>
+              <w:spacing w:after="60" w:before="60"/>
+            </w:pPr>
+            <w:r>
+              <w:rPr>
+                <w:rFonts w:ascii="Calibri" w:cs="Calibri" w:eastAsia="Calibri" w:hAnsi="Calibri"/>
+                <w:b/>
+                <w:bCs/>
+                <w:color w:val="FFFFFF"/>
+                <w:sz w:val="20"/>
+                <w:szCs w:val="20"/>
+              </w:rPr>
+              <w:t xml:space="preserve">Variação</w:t>
+            </w:r>
+          </w:p>
+        </w:tc>
+      </w:tr>
+      <w:tr>
+        <w:tc>
+          <w:tcPr>
+            <w:tcMar>
+              <w:top w:type="dxa" w:w="60"/>
+              <w:left w:type="dxa" w:w="110"/>
+              <w:bottom w:type="dxa" w:w="60"/>
+              <w:right w:type="dxa" w:w="110"/>
+            </w:tcMar>
+          </w:tcPr>
+          <w:p>
+            <w:pPr>
+              <w:spacing w:after="60" w:before="60"/>
+            </w:pPr>
+            <w:r>
+              <w:rPr>
+                <w:rFonts w:ascii="Calibri" w:cs="Calibri" w:eastAsia="Calibri" w:hAnsi="Calibri"/>
+                <w:b w:val="false"/>
+                <w:bCs w:val="false"/>
+                <w:color w:val="444444"/>
+                <w:sz w:val="20"/>
+                <w:szCs w:val="20"/>
+              </w:rPr>
+              <w:t xml:space="preserve">Vendedores ativos</w:t>
+            </w:r>
+          </w:p>
+        </w:tc>
+        <w:tc>
+          <w:tcPr>
+            <w:tcMar>
+              <w:top w:type="dxa" w:w="60"/>
+              <w:left w:type="dxa" w:w="110"/>
+              <w:bottom w:type="dxa" w:w="60"/>
+              <w:right w:type="dxa" w:w="110"/>
+            </w:tcMar>
+          </w:tcPr>
+          <w:p>
+            <w:pPr>
+              <w:spacing w:after="60" w:before="60"/>
+            </w:pPr>
+            <w:r>
+              <w:rPr>
+                <w:rFonts w:ascii="Calibri" w:cs="Calibri" w:eastAsia="Calibri" w:hAnsi="Calibri"/>
+                <w:b w:val="false"/>
+                <w:bCs w:val="false"/>
+                <w:color w:val="444444"/>
+                <w:sz w:val="20"/>
+                <w:szCs w:val="20"/>
+              </w:rPr>
+              <w:t xml:space="preserve">968</w:t>
+            </w:r>
+          </w:p>
+        </w:tc>
+        <w:tc>
+          <w:tcPr>
+            <w:tcMar>
+              <w:top w:type="dxa" w:w="60"/>
+              <w:left w:type="dxa" w:w="110"/>
+              <w:bottom w:type="dxa" w:w="60"/>
+              <w:right w:type="dxa" w:w="110"/>
+            </w:tcMar>
+          </w:tcPr>
+          <w:p>
+            <w:pPr>
+              <w:spacing w:after="60" w:before="60"/>
+            </w:pPr>
+            <w:r>
+              <w:rPr>
+                <w:rFonts w:ascii="Calibri" w:cs="Calibri" w:eastAsia="Calibri" w:hAnsi="Calibri"/>
+                <w:b w:val="false"/>
+                <w:bCs w:val="false"/>
+                <w:color w:val="444444"/>
+                <w:sz w:val="20"/>
+                <w:szCs w:val="20"/>
+              </w:rPr>
+              <w:t xml:space="preserve">1.266</w:t>
+            </w:r>
+          </w:p>
+        </w:tc>
+        <w:tc>
+          <w:tcPr>
+            <w:tcMar>
+              <w:top w:type="dxa" w:w="60"/>
+              <w:left w:type="dxa" w:w="110"/>
+              <w:bottom w:type="dxa" w:w="60"/>
+              <w:right w:type="dxa" w:w="110"/>
+            </w:tcMar>
+          </w:tcPr>
+          <w:p>
+            <w:pPr>
+              <w:spacing w:after="60" w:before="60"/>
+            </w:pPr>
+            <w:r>
+              <w:rPr>
+                <w:rFonts w:ascii="Calibri" w:cs="Calibri" w:eastAsia="Calibri" w:hAnsi="Calibri"/>
+                <w:b w:val="false"/>
+                <w:bCs w:val="false"/>
+                <w:color w:val="444444"/>
+                <w:sz w:val="20"/>
+                <w:szCs w:val="20"/>
+              </w:rPr>
+              <w:t xml:space="preserve">+30,8%</w:t>
+            </w:r>
+          </w:p>
+        </w:tc>
+      </w:tr>
+      <w:tr>
+        <w:tc>
+          <w:tcPr>
+            <w:tcMar>
+              <w:top w:type="dxa" w:w="60"/>
+              <w:left w:type="dxa" w:w="110"/>
+              <w:bottom w:type="dxa" w:w="60"/>
+              <w:right w:type="dxa" w:w="110"/>
+            </w:tcMar>
+          </w:tcPr>
+          <w:p>
+            <w:pPr>
+              <w:spacing w:after="60" w:before="60"/>
+            </w:pPr>
+            <w:r>
+              <w:rPr>
+                <w:rFonts w:ascii="Calibri" w:cs="Calibri" w:eastAsia="Calibri" w:hAnsi="Calibri"/>
+                <w:b w:val="false"/>
+                <w:bCs w:val="false"/>
+                <w:color w:val="444444"/>
+                <w:sz w:val="20"/>
+                <w:szCs w:val="20"/>
+              </w:rPr>
+              <w:t xml:space="preserve">Clientes</w:t>
+            </w:r>
+          </w:p>
+        </w:tc>
+        <w:tc>
+          <w:tcPr>
+            <w:tcMar>
+              <w:top w:type="dxa" w:w="60"/>
+              <w:left w:type="dxa" w:w="110"/>
+              <w:bottom w:type="dxa" w:w="60"/>
+              <w:right w:type="dxa" w:w="110"/>
+            </w:tcMar>
+          </w:tcPr>
+          <w:p>
+            <w:pPr>
+              <w:spacing w:after="60" w:before="60"/>
+            </w:pPr>
+            <w:r>
+              <w:rPr>
+                <w:rFonts w:ascii="Calibri" w:cs="Calibri" w:eastAsia="Calibri" w:hAnsi="Calibri"/>
+                <w:b w:val="false"/>
+                <w:bCs w:val="false"/>
+                <w:color w:val="444444"/>
+                <w:sz w:val="20"/>
+                <w:szCs w:val="20"/>
+              </w:rPr>
+              <w:t xml:space="preserve">7.088</w:t>
+            </w:r>
+          </w:p>
+        </w:tc>
+        <w:tc>
+          <w:tcPr>
+            <w:tcMar>
+              <w:top w:type="dxa" w:w="60"/>
+              <w:left w:type="dxa" w:w="110"/>
+              <w:bottom w:type="dxa" w:w="60"/>
+              <w:right w:type="dxa" w:w="110"/>
+            </w:tcMar>
+          </w:tcPr>
+          <w:p>
+            <w:pPr>
+              <w:spacing w:after="60" w:before="60"/>
+            </w:pPr>
+            <w:r>
+              <w:rPr>
+                <w:rFonts w:ascii="Calibri" w:cs="Calibri" w:eastAsia="Calibri" w:hAnsi="Calibri"/>
+                <w:b w:val="false"/>
+                <w:bCs w:val="false"/>
+                <w:color w:val="444444"/>
+                <w:sz w:val="20"/>
+                <w:szCs w:val="20"/>
+              </w:rPr>
+              <w:t xml:space="preserve">6.380</w:t>
+            </w:r>
+          </w:p>
+        </w:tc>
+        <w:tc>
+          <w:tcPr>
+            <w:tcMar>
+              <w:top w:type="dxa" w:w="60"/>
+              <w:left w:type="dxa" w:w="110"/>
+              <w:bottom w:type="dxa" w:w="60"/>
+              <w:right w:type="dxa" w:w="110"/>
+            </w:tcMar>
+          </w:tcPr>
+          <w:p>
+            <w:pPr>
+              <w:spacing w:after="60" w:before="60"/>
+            </w:pPr>
+            <w:r>
+              <w:rPr>
+                <w:rFonts w:ascii="Calibri" w:cs="Calibri" w:eastAsia="Calibri" w:hAnsi="Calibri"/>
+                <w:b w:val="false"/>
+                <w:bCs w:val="false"/>
+                <w:color w:val="444444"/>
+                <w:sz w:val="20"/>
+                <w:szCs w:val="20"/>
+              </w:rPr>
+              <w:t xml:space="preserve">-10,0%</w:t>
+            </w:r>
+          </w:p>
+        </w:tc>
+      </w:tr>
+      <w:tr>
+        <w:tc>
+          <w:tcPr>
+            <w:tcMar>
+              <w:top w:type="dxa" w:w="60"/>
+              <w:left w:type="dxa" w:w="110"/>
+              <w:bottom w:type="dxa" w:w="60"/>
+              <w:right w:type="dxa" w:w="110"/>
+            </w:tcMar>
+          </w:tcPr>
+          <w:p>
+            <w:pPr>
+              <w:spacing w:after="60" w:before="60"/>
+            </w:pPr>
+            <w:r>
+              <w:rPr>
+                <w:rFonts w:ascii="Calibri" w:cs="Calibri" w:eastAsia="Calibri" w:hAnsi="Calibri"/>
+                <w:b w:val="false"/>
+                <w:bCs w:val="false"/>
+                <w:color w:val="444444"/>
+                <w:sz w:val="20"/>
+                <w:szCs w:val="20"/>
+              </w:rPr>
+              <w:t xml:space="preserve">Receita por vendedor</w:t>
+            </w:r>
+          </w:p>
+        </w:tc>
+        <w:tc>
+          <w:tcPr>
+            <w:tcMar>
+              <w:top w:type="dxa" w:w="60"/>
+              <w:left w:type="dxa" w:w="110"/>
+              <w:bottom w:type="dxa" w:w="60"/>
+              <w:right w:type="dxa" w:w="110"/>
+            </w:tcMar>
+          </w:tcPr>
+          <w:p>
+            <w:pPr>
+              <w:spacing w:after="60" w:before="60"/>
+            </w:pPr>
+            <w:r>
+              <w:rPr>
+                <w:rFonts w:ascii="Calibri" w:cs="Calibri" w:eastAsia="Calibri" w:hAnsi="Calibri"/>
+                <w:b w:val="false"/>
+                <w:bCs w:val="false"/>
+                <w:color w:val="444444"/>
+                <w:sz w:val="20"/>
+                <w:szCs w:val="20"/>
+              </w:rPr>
+              <w:t xml:space="preserve">R$ 1.138</w:t>
+            </w:r>
+          </w:p>
+        </w:tc>
+        <w:tc>
+          <w:tcPr>
+            <w:tcMar>
+              <w:top w:type="dxa" w:w="60"/>
+              <w:left w:type="dxa" w:w="110"/>
+              <w:bottom w:type="dxa" w:w="60"/>
+              <w:right w:type="dxa" w:w="110"/>
+            </w:tcMar>
+          </w:tcPr>
+          <w:p>
+            <w:pPr>
+              <w:spacing w:after="60" w:before="60"/>
+            </w:pPr>
+            <w:r>
+              <w:rPr>
+                <w:rFonts w:ascii="Calibri" w:cs="Calibri" w:eastAsia="Calibri" w:hAnsi="Calibri"/>
+                <w:b w:val="false"/>
+                <w:bCs w:val="false"/>
+                <w:color w:val="444444"/>
+                <w:sz w:val="20"/>
+                <w:szCs w:val="20"/>
+              </w:rPr>
+              <w:t xml:space="preserve">R$ 788</w:t>
+            </w:r>
+          </w:p>
+        </w:tc>
+        <w:tc>
+          <w:tcPr>
+            <w:tcMar>
+              <w:top w:type="dxa" w:w="60"/>
+              <w:left w:type="dxa" w:w="110"/>
+              <w:bottom w:type="dxa" w:w="60"/>
+              <w:right w:type="dxa" w:w="110"/>
+            </w:tcMar>
+          </w:tcPr>
+          <w:p>
+            <w:pPr>
+              <w:spacing w:after="60" w:before="60"/>
+            </w:pPr>
+            <w:r>
+              <w:rPr>
+                <w:rFonts w:ascii="Calibri" w:cs="Calibri" w:eastAsia="Calibri" w:hAnsi="Calibri"/>
+                <w:b w:val="false"/>
+                <w:bCs w:val="false"/>
+                <w:color w:val="444444"/>
+                <w:sz w:val="20"/>
+                <w:szCs w:val="20"/>
+              </w:rPr>
+              <w:t xml:space="preserve">-30,8%</w:t>
+            </w:r>
+          </w:p>
+        </w:tc>
+      </w:tr>
+    </w:tbl>
+    <w:p>
+      <w:pPr>
+        <w:spacing w:after="200"/>
+      </w:pPr>
+      <w:r>
+        <w:t xml:space="preserve"/>
       </w:r>
     </w:p>
     <w:p>
@@ -2718,7 +3267,7 @@
           <w:sz w:val="22"/>
           <w:szCs w:val="22"/>
         </w:rPr>
-        <w:t xml:space="preserve">Alagoas entrega em 24 dias e atrasa em 21,5% dos pedidos. Roraima demora mais, 29,5 dias, e atrasa em 12,5%. Amapá leva 26,7 dias e atrasa em apenas 3%.</w:t>
+        <w:t xml:space="preserve">A oferta continuou crescendo. A demanda recuou. Como consequência, o mesmo volume de vendas passou a ser distribuído entre um número maior de vendedores, e o resultado individual de cada um caiu quase um terço em oito meses.</w:t>
       </w:r>
     </w:p>
     <w:p>
@@ -2733,11 +3282,12 @@
           <w:sz w:val="22"/>
           <w:szCs w:val="22"/>
         </w:rPr>
-        <w:t xml:space="preserve">Atraso significa entregar depois do prazo informado ao cliente, não entregar devagar. Um estado distante pode apresentar atraso baixo se a promessa considerar a distância. Nos casos em que o atraso é elevado sem que o tempo seja o pior da base, o problema está na calibragem do prazo prometido, cuja correção é substancialmente mais rápida e barata do que reestruturar a operação.</w:t>
-      </w:r>
-    </w:p>
-    <w:p>
-      <w:pPr>
+        <w:t xml:space="preserve">Esse achado inverte a recomendação intuitiva. Ampliar a base de vendedores neste momento não aumenta a receita da plataforma e deteriora o desempenho de quem já opera nela. A prioridade está do lado da demanda.</w:t>
+      </w:r>
+    </w:p>
+    <w:p>
+      <w:pPr>
+        <w:keepNext/>
         <w:spacing w:after="130" w:before="260"/>
       </w:pPr>
       <w:r>
@@ -2749,7 +3299,7 @@
           <w:sz w:val="24"/>
           <w:szCs w:val="24"/>
         </w:rPr>
-        <w:t xml:space="preserve">5.2 O efeito do atraso sobre o retorno do cliente</w:t>
+        <w:t xml:space="preserve">4.1 Onde a demanda não se materializa</w:t>
       </w:r>
     </w:p>
     <w:p>
@@ -2764,7 +3314,22 @@
           <w:sz w:val="22"/>
           <w:szCs w:val="22"/>
         </w:rPr>
-        <w:t xml:space="preserve">Se a experiência de entrega afasta o comprador, a logística deixa de ser um tema de satisfação e passa a ser um tema de receita. Para testar, os clientes foram separados pela primeira compra, entre os que receberam no prazo e os que receberam com atraso, considerando apenas quem comprou até fevereiro de 2018 para assegurar ao menos seis meses de janela de retorno.</w:t>
+        <w:t xml:space="preserve">A receita está distribuída de forma saudável em dois eixos e concentrada em um terceiro. São 72 categorias de produto, com as cinco maiores somando 39,3%, e 3.029 vendedores, com os dez maiores somando apenas 12,9%. Não há dependência de produto-âncora nem de fornecedor específico.</w:t>
+      </w:r>
+    </w:p>
+    <w:p>
+      <w:pPr>
+        <w:spacing w:after="160" w:line="300"/>
+        <w:jc w:val="both"/>
+      </w:pPr>
+      <w:r>
+        <w:rPr>
+          <w:rFonts w:ascii="Calibri" w:cs="Calibri" w:eastAsia="Calibri" w:hAnsi="Calibri"/>
+          <w:color w:val="444444"/>
+          <w:sz w:val="22"/>
+          <w:szCs w:val="22"/>
+        </w:rPr>
+        <w:t xml:space="preserve">A concentração está na geografia. São Paulo responde sozinho por 37,4% da receita e os cinco maiores estados somam 73,1%, restando 26,9% distribuídos entre os outros 22 estados.</w:t>
       </w:r>
     </w:p>
     <w:p>
@@ -2775,7 +3340,7 @@
       <w:r>
         <w:drawing>
           <wp:inline distT="0" distB="0" distL="0" distR="0">
-            <wp:extent cx="3429000" cy="2857500"/>
+            <wp:extent cx="5334000" cy="1905000"/>
             <wp:effectExtent t="0" r="0" b="0" l="0"/>
             <wp:docPr id="1" name="" descr="" title=""/>
             <wp:cNvGraphicFramePr>
@@ -2800,7 +3365,7 @@
                   <pic:spPr bwMode="auto">
                     <a:xfrm>
                       <a:off x="0" y="0"/>
-                      <a:ext cx="3429000" cy="2857500"/>
+                      <a:ext cx="5334000" cy="1905000"/>
                     </a:xfrm>
                     <a:prstGeom prst="rect">
                       <a:avLst/>
@@ -2827,52 +3392,7 @@
           <w:sz w:val="18"/>
           <w:szCs w:val="18"/>
         </w:rPr>
-        <w:t xml:space="preserve">Figura 7. Percentual de clientes que voltaram a comprar, conforme a primeira entrega.</w:t>
-      </w:r>
-    </w:p>
-    <w:p>
-      <w:pPr>
-        <w:spacing w:after="160" w:line="300"/>
-        <w:jc w:val="both"/>
-      </w:pPr>
-      <w:r>
-        <w:rPr>
-          <w:rFonts w:ascii="Calibri" w:cs="Calibri" w:eastAsia="Calibri" w:hAnsi="Calibri"/>
-          <w:color w:val="444444"/>
-          <w:sz w:val="22"/>
-          <w:szCs w:val="22"/>
-        </w:rPr>
-        <w:t xml:space="preserve">Entre os clientes atendidos no prazo, 4,08% voltaram a comprar. Entre os que sofreram atraso, 3,16%. A queda é de 22,6% em termos relativos e o teste de qui-quadrado devolve p-valor de 0,007, o que descarta a hipótese de acaso.</w:t>
-      </w:r>
-    </w:p>
-    <w:p>
-      <w:pPr>
-        <w:spacing w:after="160" w:line="300"/>
-        <w:jc w:val="both"/>
-      </w:pPr>
-      <w:r>
-        <w:rPr>
-          <w:rFonts w:ascii="Calibri" w:cs="Calibri" w:eastAsia="Calibri" w:hAnsi="Calibri"/>
-          <w:color w:val="444444"/>
-          <w:sz w:val="22"/>
-          <w:szCs w:val="22"/>
-        </w:rPr>
-        <w:t xml:space="preserve">A magnitude, entretanto, exige precisão. A diferença absoluta é de 0,92 ponto percentual, porque mesmo com entrega pontual cerca de 96% dos clientes não retornam. O atraso agrava um problema de retenção que já existe por outra razão.</w:t>
-      </w:r>
-    </w:p>
-    <w:p>
-      <w:pPr>
-        <w:spacing w:after="160" w:line="300"/>
-        <w:jc w:val="both"/>
-      </w:pPr>
-      <w:r>
-        <w:rPr>
-          <w:rFonts w:ascii="Calibri" w:cs="Calibri" w:eastAsia="Calibri" w:hAnsi="Calibri"/>
-          <w:color w:val="444444"/>
-          <w:sz w:val="22"/>
-          <w:szCs w:val="22"/>
-        </w:rPr>
-        <w:t xml:space="preserve">Esse ponto tem consequência direta sobre estimativas de perda. Multiplicar o número de clientes insatisfeitos pelo ticket médio integral pressupõe que todos retornariam, premissa que os dados não sustentam. A estimativa correta utiliza a diferença entre os dois grupos.</w:t>
+        <w:t xml:space="preserve">Figura 4. Distribuição da receita por categoria e por estado.</w:t>
       </w:r>
     </w:p>
     <w:p>
@@ -2882,6 +3402,10 @@
     </w:p>
     <w:p>
       <w:pPr>
+        <w:keepNext/>
+        <w:pBdr>
+          <w:bottom w:val="single" w:color="D9D9D9" w:sz="6" w:space="6"/>
+        </w:pBdr>
         <w:spacing w:after="180" w:before="360"/>
       </w:pPr>
       <w:r>
@@ -2893,7 +3417,7 @@
           <w:sz w:val="30"/>
           <w:szCs w:val="30"/>
         </w:rPr>
-        <w:t xml:space="preserve">6. Projeção para os próximos meses</w:t>
+        <w:t xml:space="preserve">5. A operação explica parte da concentração</w:t>
       </w:r>
     </w:p>
     <w:p>
@@ -2908,7 +3432,7 @@
           <w:sz w:val="22"/>
           <w:szCs w:val="22"/>
         </w:rPr>
-        <w:t xml:space="preserve">Com a receita estabilizada, a média dos últimos três meses é o método adequado para estimar o período seguinte. Caso a série ainda apresentasse crescimento acelerado, essa escolha seria inadequada e exigiria um modelo de tendência.</w:t>
+        <w:t xml:space="preserve">Duas hipóteses explicariam a concentração geográfica. A primeira é que o mercado fora do Sudeste simplesmente compra menos, por população e renda. A segunda é que a experiência de compra é pior nessas regiões. As duas conduzem a decisões opostas, e por isso foram testadas.</w:t>
       </w:r>
     </w:p>
     <w:p>
@@ -2919,7 +3443,7 @@
       <w:r>
         <w:drawing>
           <wp:inline distT="0" distB="0" distL="0" distR="0">
-            <wp:extent cx="5143500" cy="2333625"/>
+            <wp:extent cx="4572000" cy="3048000"/>
             <wp:effectExtent t="0" r="0" b="0" l="0"/>
             <wp:docPr id="1" name="" descr="" title=""/>
             <wp:cNvGraphicFramePr>
@@ -2944,6 +3468,404 @@
                   <pic:spPr bwMode="auto">
                     <a:xfrm>
                       <a:off x="0" y="0"/>
+                      <a:ext cx="4572000" cy="3048000"/>
+                    </a:xfrm>
+                    <a:prstGeom prst="rect">
+                      <a:avLst/>
+                    </a:prstGeom>
+                  </pic:spPr>
+                </pic:pic>
+              </a:graphicData>
+            </a:graphic>
+          </wp:inline>
+        </w:drawing>
+      </w:r>
+    </w:p>
+    <w:p>
+      <w:pPr>
+        <w:spacing w:after="240"/>
+        <w:jc w:val="center"/>
+      </w:pPr>
+      <w:r>
+        <w:rPr>
+          <w:rFonts w:ascii="Calibri" w:cs="Calibri" w:eastAsia="Calibri" w:hAnsi="Calibri"/>
+          <w:i/>
+          <w:iCs/>
+          <w:color w:val="777777"/>
+          <w:sz w:val="18"/>
+          <w:szCs w:val="18"/>
+        </w:rPr>
+        <w:t xml:space="preserve">Figura 5. Participação na receita e tempo médio de entrega, por estado.</w:t>
+      </w:r>
+    </w:p>
+    <w:p>
+      <w:pPr>
+        <w:spacing w:after="160" w:line="300"/>
+        <w:jc w:val="both"/>
+      </w:pPr>
+      <w:r>
+        <w:rPr>
+          <w:rFonts w:ascii="Calibri" w:cs="Calibri" w:eastAsia="Calibri" w:hAnsi="Calibri"/>
+          <w:color w:val="444444"/>
+          <w:sz w:val="22"/>
+          <w:szCs w:val="22"/>
+        </w:rPr>
+        <w:t xml:space="preserve">Os cinco estados que concentram 73,1% da receita recebem seus pedidos em 10,5 dias em média. Os outros 22 esperam 17,3 dias. São Paulo é o mais rápido do país, com 8,3 dias, e Roraima o mais lento, com 29,5 dias. A correlação entre tempo de entrega e participação na receita é de -0,60.</w:t>
+      </w:r>
+    </w:p>
+    <w:p>
+      <w:pPr>
+        <w:spacing w:after="160" w:line="300"/>
+        <w:jc w:val="both"/>
+      </w:pPr>
+      <w:r>
+        <w:rPr>
+          <w:rFonts w:ascii="Calibri" w:cs="Calibri" w:eastAsia="Calibri" w:hAnsi="Calibri"/>
+          <w:color w:val="444444"/>
+          <w:sz w:val="22"/>
+          <w:szCs w:val="22"/>
+        </w:rPr>
+        <w:t xml:space="preserve">O custo acompanha o prazo. Em São Paulo o frete equivale a 13,8% do valor do produto, enquanto no Maranhão e em Roraima ultrapassa 26%. Fora do Sudeste, comprar demora quase o dobro e custa quase o dobro em frete.</w:t>
+      </w:r>
+    </w:p>
+    <w:p>
+      <w:pPr>
+        <w:spacing w:after="160" w:line="300"/>
+        <w:jc w:val="both"/>
+      </w:pPr>
+      <w:r>
+        <w:rPr>
+          <w:rFonts w:ascii="Calibri" w:cs="Calibri" w:eastAsia="Calibri" w:hAnsi="Calibri"/>
+          <w:color w:val="444444"/>
+          <w:sz w:val="22"/>
+          <w:szCs w:val="22"/>
+        </w:rPr>
+        <w:t xml:space="preserve">Cabe registrar que se trata de correlação e não de prova de causa, uma vez que São Paulo também concentra população e renda. A operação, contudo, é a parcela do problema que a empresa controla, e isso é o que torna o achado acionável.</w:t>
+      </w:r>
+    </w:p>
+    <w:p>
+      <w:pPr>
+        <w:keepNext/>
+        <w:spacing w:after="130" w:before="260"/>
+      </w:pPr>
+      <w:r>
+        <w:rPr>
+          <w:rFonts w:ascii="Calibri" w:cs="Calibri" w:eastAsia="Calibri" w:hAnsi="Calibri"/>
+          <w:b/>
+          <w:bCs/>
+          <w:color w:val="1F4E79"/>
+          <w:sz w:val="24"/>
+          <w:szCs w:val="24"/>
+        </w:rPr>
+        <w:t xml:space="preserve">5.1 Atraso e demora são problemas diferentes</w:t>
+      </w:r>
+    </w:p>
+    <w:p>
+      <w:pPr>
+        <w:spacing w:after="60" w:before="120"/>
+        <w:jc w:val="center"/>
+      </w:pPr>
+      <w:r>
+        <w:drawing>
+          <wp:inline distT="0" distB="0" distL="0" distR="0">
+            <wp:extent cx="4953000" cy="2476500"/>
+            <wp:effectExtent t="0" r="0" b="0" l="0"/>
+            <wp:docPr id="1" name="" descr="" title=""/>
+            <wp:cNvGraphicFramePr>
+              <a:graphicFrameLocks xmlns:a="http://schemas.openxmlformats.org/drawingml/2006/main" noChangeAspect="1"/>
+            </wp:cNvGraphicFramePr>
+            <a:graphic xmlns:a="http://schemas.openxmlformats.org/drawingml/2006/main">
+              <a:graphicData uri="http://schemas.openxmlformats.org/drawingml/2006/picture">
+                <pic:pic xmlns:pic="http://schemas.openxmlformats.org/drawingml/2006/picture">
+                  <pic:nvPicPr>
+                    <pic:cNvPr id="0" name="" descr=""/>
+                    <pic:cNvPicPr>
+                      <a:picLocks noChangeAspect="1" noChangeArrowheads="1"/>
+                    </pic:cNvPicPr>
+                  </pic:nvPicPr>
+                  <pic:blipFill>
+                    <a:blip r:embed="rId16" cstate="none"/>
+                    <a:srcRect/>
+                    <a:stretch>
+                      <a:fillRect/>
+                    </a:stretch>
+                  </pic:blipFill>
+                  <pic:spPr bwMode="auto">
+                    <a:xfrm>
+                      <a:off x="0" y="0"/>
+                      <a:ext cx="4953000" cy="2476500"/>
+                    </a:xfrm>
+                    <a:prstGeom prst="rect">
+                      <a:avLst/>
+                    </a:prstGeom>
+                  </pic:spPr>
+                </pic:pic>
+              </a:graphicData>
+            </a:graphic>
+          </wp:inline>
+        </w:drawing>
+      </w:r>
+    </w:p>
+    <w:p>
+      <w:pPr>
+        <w:spacing w:after="240"/>
+        <w:jc w:val="center"/>
+      </w:pPr>
+      <w:r>
+        <w:rPr>
+          <w:rFonts w:ascii="Calibri" w:cs="Calibri" w:eastAsia="Calibri" w:hAnsi="Calibri"/>
+          <w:i/>
+          <w:iCs/>
+          <w:color w:val="777777"/>
+          <w:sz w:val="18"/>
+          <w:szCs w:val="18"/>
+        </w:rPr>
+        <w:t xml:space="preserve">Figura 6. Percentual de pedidos entregues após a data prometida.</w:t>
+      </w:r>
+    </w:p>
+    <w:p>
+      <w:pPr>
+        <w:spacing w:after="160" w:line="300"/>
+        <w:jc w:val="both"/>
+      </w:pPr>
+      <w:r>
+        <w:rPr>
+          <w:rFonts w:ascii="Calibri" w:cs="Calibri" w:eastAsia="Calibri" w:hAnsi="Calibri"/>
+          <w:color w:val="444444"/>
+          <w:sz w:val="22"/>
+          <w:szCs w:val="22"/>
+        </w:rPr>
+        <w:t xml:space="preserve">Alagoas entrega em 24 dias e atrasa em 21,5% dos pedidos. Roraima demora mais, 29,5 dias, e atrasa em 12,5%. Amapá leva 26,7 dias e atrasa em apenas 3%.</w:t>
+      </w:r>
+    </w:p>
+    <w:p>
+      <w:pPr>
+        <w:spacing w:after="160" w:line="300"/>
+        <w:jc w:val="both"/>
+      </w:pPr>
+      <w:r>
+        <w:rPr>
+          <w:rFonts w:ascii="Calibri" w:cs="Calibri" w:eastAsia="Calibri" w:hAnsi="Calibri"/>
+          <w:color w:val="444444"/>
+          <w:sz w:val="22"/>
+          <w:szCs w:val="22"/>
+        </w:rPr>
+        <w:t xml:space="preserve">Atraso significa entregar depois do prazo informado ao cliente, não entregar devagar. Um estado distante pode apresentar atraso baixo se a promessa considerar a distância. Nos casos em que o atraso é elevado sem que o tempo seja o pior da base, o problema está na calibragem do prazo prometido, cuja correção é substancialmente mais rápida e barata do que reestruturar a operação.</w:t>
+      </w:r>
+    </w:p>
+    <w:p>
+      <w:pPr>
+        <w:keepNext/>
+        <w:spacing w:after="130" w:before="260"/>
+      </w:pPr>
+      <w:r>
+        <w:rPr>
+          <w:rFonts w:ascii="Calibri" w:cs="Calibri" w:eastAsia="Calibri" w:hAnsi="Calibri"/>
+          <w:b/>
+          <w:bCs/>
+          <w:color w:val="1F4E79"/>
+          <w:sz w:val="24"/>
+          <w:szCs w:val="24"/>
+        </w:rPr>
+        <w:t xml:space="preserve">5.2 O efeito do atraso sobre o retorno do cliente</w:t>
+      </w:r>
+    </w:p>
+    <w:p>
+      <w:pPr>
+        <w:spacing w:after="160" w:line="300"/>
+        <w:jc w:val="both"/>
+      </w:pPr>
+      <w:r>
+        <w:rPr>
+          <w:rFonts w:ascii="Calibri" w:cs="Calibri" w:eastAsia="Calibri" w:hAnsi="Calibri"/>
+          <w:color w:val="444444"/>
+          <w:sz w:val="22"/>
+          <w:szCs w:val="22"/>
+        </w:rPr>
+        <w:t xml:space="preserve">Se a experiência de entrega afasta o comprador, a logística deixa de ser um tema de satisfação e passa a ser um tema de receita. Para testar, os clientes foram separados pela primeira compra, entre os que receberam no prazo e os que receberam com atraso, considerando apenas quem comprou até fevereiro de 2018 para assegurar ao menos seis meses de janela de retorno.</w:t>
+      </w:r>
+    </w:p>
+    <w:p>
+      <w:pPr>
+        <w:spacing w:after="60" w:before="120"/>
+        <w:jc w:val="center"/>
+      </w:pPr>
+      <w:r>
+        <w:drawing>
+          <wp:inline distT="0" distB="0" distL="0" distR="0">
+            <wp:extent cx="3429000" cy="2857500"/>
+            <wp:effectExtent t="0" r="0" b="0" l="0"/>
+            <wp:docPr id="1" name="" descr="" title=""/>
+            <wp:cNvGraphicFramePr>
+              <a:graphicFrameLocks xmlns:a="http://schemas.openxmlformats.org/drawingml/2006/main" noChangeAspect="1"/>
+            </wp:cNvGraphicFramePr>
+            <a:graphic xmlns:a="http://schemas.openxmlformats.org/drawingml/2006/main">
+              <a:graphicData uri="http://schemas.openxmlformats.org/drawingml/2006/picture">
+                <pic:pic xmlns:pic="http://schemas.openxmlformats.org/drawingml/2006/picture">
+                  <pic:nvPicPr>
+                    <pic:cNvPr id="0" name="" descr=""/>
+                    <pic:cNvPicPr>
+                      <a:picLocks noChangeAspect="1" noChangeArrowheads="1"/>
+                    </pic:cNvPicPr>
+                  </pic:nvPicPr>
+                  <pic:blipFill>
+                    <a:blip r:embed="rId17" cstate="none"/>
+                    <a:srcRect/>
+                    <a:stretch>
+                      <a:fillRect/>
+                    </a:stretch>
+                  </pic:blipFill>
+                  <pic:spPr bwMode="auto">
+                    <a:xfrm>
+                      <a:off x="0" y="0"/>
+                      <a:ext cx="3429000" cy="2857500"/>
+                    </a:xfrm>
+                    <a:prstGeom prst="rect">
+                      <a:avLst/>
+                    </a:prstGeom>
+                  </pic:spPr>
+                </pic:pic>
+              </a:graphicData>
+            </a:graphic>
+          </wp:inline>
+        </w:drawing>
+      </w:r>
+    </w:p>
+    <w:p>
+      <w:pPr>
+        <w:spacing w:after="240"/>
+        <w:jc w:val="center"/>
+      </w:pPr>
+      <w:r>
+        <w:rPr>
+          <w:rFonts w:ascii="Calibri" w:cs="Calibri" w:eastAsia="Calibri" w:hAnsi="Calibri"/>
+          <w:i/>
+          <w:iCs/>
+          <w:color w:val="777777"/>
+          <w:sz w:val="18"/>
+          <w:szCs w:val="18"/>
+        </w:rPr>
+        <w:t xml:space="preserve">Figura 7. Percentual de clientes que voltaram a comprar, conforme a primeira entrega.</w:t>
+      </w:r>
+    </w:p>
+    <w:p>
+      <w:pPr>
+        <w:spacing w:after="160" w:line="300"/>
+        <w:jc w:val="both"/>
+      </w:pPr>
+      <w:r>
+        <w:rPr>
+          <w:rFonts w:ascii="Calibri" w:cs="Calibri" w:eastAsia="Calibri" w:hAnsi="Calibri"/>
+          <w:color w:val="444444"/>
+          <w:sz w:val="22"/>
+          <w:szCs w:val="22"/>
+        </w:rPr>
+        <w:t xml:space="preserve">Entre os clientes atendidos no prazo, 4,08% voltaram a comprar. Entre os que sofreram atraso, 3,16%. A queda é de 22,6% em termos relativos e o teste de qui-quadrado devolve p-valor de 0,007, o que descarta a hipótese de acaso.</w:t>
+      </w:r>
+    </w:p>
+    <w:p>
+      <w:pPr>
+        <w:spacing w:after="160" w:line="300"/>
+        <w:jc w:val="both"/>
+      </w:pPr>
+      <w:r>
+        <w:rPr>
+          <w:rFonts w:ascii="Calibri" w:cs="Calibri" w:eastAsia="Calibri" w:hAnsi="Calibri"/>
+          <w:color w:val="444444"/>
+          <w:sz w:val="22"/>
+          <w:szCs w:val="22"/>
+        </w:rPr>
+        <w:t xml:space="preserve">A magnitude, entretanto, exige precisão. A diferença absoluta é de 0,92 ponto percentual, porque mesmo com entrega pontual cerca de 96% dos clientes não retornam. O atraso agrava um problema de retenção que já existe por outra razão.</w:t>
+      </w:r>
+    </w:p>
+    <w:p>
+      <w:pPr>
+        <w:spacing w:after="160" w:line="300"/>
+        <w:jc w:val="both"/>
+      </w:pPr>
+      <w:r>
+        <w:rPr>
+          <w:rFonts w:ascii="Calibri" w:cs="Calibri" w:eastAsia="Calibri" w:hAnsi="Calibri"/>
+          <w:color w:val="444444"/>
+          <w:sz w:val="22"/>
+          <w:szCs w:val="22"/>
+        </w:rPr>
+        <w:t xml:space="preserve">Esse ponto tem consequência direta sobre estimativas de perda. Multiplicar o número de clientes insatisfeitos pelo ticket médio integral pressupõe que todos retornariam, premissa que os dados não sustentam. A estimativa correta utiliza a diferença entre os dois grupos.</w:t>
+      </w:r>
+    </w:p>
+    <w:p>
+      <w:r>
+        <w:br w:type="page"/>
+      </w:r>
+    </w:p>
+    <w:p>
+      <w:pPr>
+        <w:keepNext/>
+        <w:pBdr>
+          <w:bottom w:val="single" w:color="D9D9D9" w:sz="6" w:space="6"/>
+        </w:pBdr>
+        <w:spacing w:after="180" w:before="360"/>
+      </w:pPr>
+      <w:r>
+        <w:rPr>
+          <w:rFonts w:ascii="Calibri" w:cs="Calibri" w:eastAsia="Calibri" w:hAnsi="Calibri"/>
+          <w:b/>
+          <w:bCs/>
+          <w:color w:val="1F4E79"/>
+          <w:sz w:val="30"/>
+          <w:szCs w:val="30"/>
+        </w:rPr>
+        <w:t xml:space="preserve">6. Projeção para os próximos meses</w:t>
+      </w:r>
+    </w:p>
+    <w:p>
+      <w:pPr>
+        <w:spacing w:after="160" w:line="300"/>
+        <w:jc w:val="both"/>
+      </w:pPr>
+      <w:r>
+        <w:rPr>
+          <w:rFonts w:ascii="Calibri" w:cs="Calibri" w:eastAsia="Calibri" w:hAnsi="Calibri"/>
+          <w:color w:val="444444"/>
+          <w:sz w:val="22"/>
+          <w:szCs w:val="22"/>
+        </w:rPr>
+        <w:t xml:space="preserve">Com a receita estabilizada, a média dos últimos três meses é o método adequado para estimar o período seguinte. Caso a série ainda apresentasse crescimento acelerado, essa escolha seria inadequada e exigiria um modelo de tendência.</w:t>
+      </w:r>
+    </w:p>
+    <w:p>
+      <w:pPr>
+        <w:spacing w:after="60" w:before="120"/>
+        <w:jc w:val="center"/>
+      </w:pPr>
+      <w:r>
+        <w:drawing>
+          <wp:inline distT="0" distB="0" distL="0" distR="0">
+            <wp:extent cx="5143500" cy="2333625"/>
+            <wp:effectExtent t="0" r="0" b="0" l="0"/>
+            <wp:docPr id="1" name="" descr="" title=""/>
+            <wp:cNvGraphicFramePr>
+              <a:graphicFrameLocks xmlns:a="http://schemas.openxmlformats.org/drawingml/2006/main" noChangeAspect="1"/>
+            </wp:cNvGraphicFramePr>
+            <a:graphic xmlns:a="http://schemas.openxmlformats.org/drawingml/2006/main">
+              <a:graphicData uri="http://schemas.openxmlformats.org/drawingml/2006/picture">
+                <pic:pic xmlns:pic="http://schemas.openxmlformats.org/drawingml/2006/picture">
+                  <pic:nvPicPr>
+                    <pic:cNvPr id="0" name="" descr=""/>
+                    <pic:cNvPicPr>
+                      <a:picLocks noChangeAspect="1" noChangeArrowheads="1"/>
+                    </pic:cNvPicPr>
+                  </pic:nvPicPr>
+                  <pic:blipFill>
+                    <a:blip r:embed="rId18" cstate="none"/>
+                    <a:srcRect/>
+                    <a:stretch>
+                      <a:fillRect/>
+                    </a:stretch>
+                  </pic:blipFill>
+                  <pic:spPr bwMode="auto">
+                    <a:xfrm>
+                      <a:off x="0" y="0"/>
                       <a:ext cx="5143500" cy="2333625"/>
                     </a:xfrm>
                     <a:prstGeom prst="rect">
@@ -3062,6 +3984,10 @@
     </w:p>
     <w:p>
       <w:pPr>
+        <w:keepNext/>
+        <w:pBdr>
+          <w:bottom w:val="single" w:color="D9D9D9" w:sz="6" w:space="6"/>
+        </w:pBdr>
         <w:spacing w:after="180" w:before="360"/>
       </w:pPr>
       <w:r>
@@ -3247,6 +4173,7 @@
     </w:p>
     <w:p>
       <w:pPr>
+        <w:keepNext/>
         <w:spacing w:after="130" w:before="260"/>
       </w:pPr>
       <w:r>
@@ -3307,10 +4234,14 @@
       </w:r>
     </w:p>
     <w:sectPr>
-      <w:footerReference w:type="default" r:id="rId7"/>
+      <w:headerReference w:type="default" r:id="rId7"/>
+      <w:headerReference w:type="first" r:id="rId8"/>
+      <w:footerReference w:type="default" r:id="rId9"/>
+      <w:footerReference w:type="first" r:id="rId10"/>
       <w:pgSz w:w="11906" w:h="16838" w:orient="portrait"/>
-      <w:pgMar w:top="1100" w:right="1100" w:bottom="1100" w:left="1100" w:header="708" w:footer="708" w:gutter="0"/>
+      <w:pgMar w:top="1300" w:right="1100" w:bottom="1200" w:left="1100" w:header="708" w:footer="708" w:gutter="0"/>
       <w:pgNumType/>
+      <w:titlePg/>
       <w:docGrid w:linePitch="360"/>
     </w:sectPr>
   </w:body>
@@ -3366,11 +4297,11 @@
     </w:pPr>
     <w:r>
       <w:rPr>
+        <w:rFonts w:ascii="Calibri" w:cs="Calibri" w:eastAsia="Calibri" w:hAnsi="Calibri"/>
         <w:color w:val="999999"/>
         <w:sz w:val="18"/>
         <w:szCs w:val="18"/>
       </w:rPr>
-      <w:t xml:space="preserve"/>
       <w:fldChar w:fldCharType="begin"/>
       <w:instrText xml:space="preserve">PAGE</w:instrText>
       <w:fldChar w:fldCharType="separate"/>
@@ -3380,6 +4311,16 @@
 </w:ftr>
 </file>
 
+<file path=word/footer2.xml><?xml version="1.0" encoding="utf-8"?>
+<w:ftr xmlns:wpc="http://schemas.microsoft.com/office/word/2010/wordprocessingCanvas" xmlns:mc="http://schemas.openxmlformats.org/markup-compatibility/2006" xmlns:o="urn:schemas-microsoft-com:office:office" xmlns:r="http://schemas.openxmlformats.org/officeDocument/2006/relationships" xmlns:m="http://schemas.openxmlformats.org/officeDocument/2006/math" xmlns:v="urn:schemas-microsoft-com:vml" xmlns:wp14="http://schemas.microsoft.com/office/word/2010/wordprocessingDrawing" xmlns:wp="http://schemas.openxmlformats.org/drawingml/2006/wordprocessingDrawing" xmlns:w10="urn:schemas-microsoft-com:office:word" xmlns:w="http://schemas.openxmlformats.org/wordprocessingml/2006/main" xmlns:w14="http://schemas.microsoft.com/office/word/2010/wordml" xmlns:w15="http://schemas.microsoft.com/office/word/2012/wordml" xmlns:wpg="http://schemas.microsoft.com/office/word/2010/wordprocessingGroup" xmlns:wpi="http://schemas.microsoft.com/office/word/2010/wordprocessingInk" xmlns:wne="http://schemas.microsoft.com/office/word/2006/wordml" xmlns:wps="http://schemas.microsoft.com/office/word/2010/wordprocessingShape">
+  <w:p>
+    <w:r>
+      <w:t xml:space="preserve"/>
+    </w:r>
+  </w:p>
+</w:ftr>
+</file>
+
 <file path=word/footnotes.xml><?xml version="1.0" encoding="utf-8"?>
 <w:footnotes xmlns:wpc="http://schemas.microsoft.com/office/word/2010/wordprocessingCanvas" xmlns:mc="http://schemas.openxmlformats.org/markup-compatibility/2006" xmlns:o="urn:schemas-microsoft-com:office:office" xmlns:r="http://schemas.openxmlformats.org/officeDocument/2006/relationships" xmlns:m="http://schemas.openxmlformats.org/officeDocument/2006/math" xmlns:v="urn:schemas-microsoft-com:vml" xmlns:wp14="http://schemas.microsoft.com/office/word/2010/wordprocessingDrawing" xmlns:wp="http://schemas.openxmlformats.org/drawingml/2006/wordprocessingDrawing" xmlns:w10="urn:schemas-microsoft-com:office:word" xmlns:w="http://schemas.openxmlformats.org/wordprocessingml/2006/main" xmlns:w14="http://schemas.microsoft.com/office/word/2010/wordml" xmlns:w15="http://schemas.microsoft.com/office/word/2012/wordml" xmlns:wpg="http://schemas.microsoft.com/office/word/2010/wordprocessingGroup" xmlns:wpi="http://schemas.microsoft.com/office/word/2010/wordprocessingInk" xmlns:wne="http://schemas.microsoft.com/office/word/2006/wordml" xmlns:wps="http://schemas.microsoft.com/office/word/2010/wordprocessingShape" mc:Ignorable="w14 w15 wp14">
   <w:footnote w:type="separator" w:id="-1">
@@ -3415,6 +4356,39 @@
     </w:p>
   </w:footnote>
 </w:footnotes>
+</file>
+
+<file path=word/header1.xml><?xml version="1.0" encoding="utf-8"?>
+<w:hdr xmlns:wpc="http://schemas.microsoft.com/office/word/2010/wordprocessingCanvas" xmlns:mc="http://schemas.openxmlformats.org/markup-compatibility/2006" xmlns:o="urn:schemas-microsoft-com:office:office" xmlns:r="http://schemas.openxmlformats.org/officeDocument/2006/relationships" xmlns:m="http://schemas.openxmlformats.org/officeDocument/2006/math" xmlns:v="urn:schemas-microsoft-com:vml" xmlns:wp14="http://schemas.microsoft.com/office/word/2010/wordprocessingDrawing" xmlns:wp="http://schemas.openxmlformats.org/drawingml/2006/wordprocessingDrawing" xmlns:w10="urn:schemas-microsoft-com:office:word" xmlns:w="http://schemas.openxmlformats.org/wordprocessingml/2006/main" xmlns:w14="http://schemas.microsoft.com/office/word/2010/wordml" xmlns:w15="http://schemas.microsoft.com/office/word/2012/wordml" xmlns:wpg="http://schemas.microsoft.com/office/word/2010/wordprocessingGroup" xmlns:wpi="http://schemas.microsoft.com/office/word/2010/wordprocessingInk" xmlns:wne="http://schemas.microsoft.com/office/word/2006/wordml" xmlns:wps="http://schemas.microsoft.com/office/word/2010/wordprocessingShape" xmlns:cx="http://schemas.microsoft.com/office/drawing/2014/chartex" xmlns:cx1="http://schemas.microsoft.com/office/drawing/2015/9/8/chartex" xmlns:cx2="http://schemas.microsoft.com/office/drawing/2015/10/21/chartex" xmlns:cx3="http://schemas.microsoft.com/office/drawing/2016/5/9/chartex" xmlns:cx4="http://schemas.microsoft.com/office/drawing/2016/5/10/chartex" xmlns:cx5="http://schemas.microsoft.com/office/drawing/2016/5/11/chartex" xmlns:cx6="http://schemas.microsoft.com/office/drawing/2016/5/12/chartex" xmlns:cx7="http://schemas.microsoft.com/office/drawing/2016/5/13/chartex" xmlns:cx8="http://schemas.microsoft.com/office/drawing/2016/5/14/chartex" xmlns:w16cid="http://schemas.microsoft.com/office/word/2016/wordml/cid" xmlns:w16se="http://schemas.microsoft.com/office/word/2015/wordml/symex">
+  <w:p>
+    <w:pPr>
+      <w:pBdr>
+        <w:bottom w:val="single" w:color="D9D9D9" w:sz="4" w:space="8"/>
+      </w:pBdr>
+      <w:spacing w:after="200"/>
+      <w:jc w:val="right"/>
+    </w:pPr>
+    <w:r>
+      <w:rPr>
+        <w:rFonts w:ascii="Calibri" w:cs="Calibri" w:eastAsia="Calibri" w:hAnsi="Calibri"/>
+        <w:color w:val="999999"/>
+        <w:sz w:val="17"/>
+        <w:szCs w:val="17"/>
+      </w:rPr>
+      <w:t xml:space="preserve">Relatório Executivo  |  Case E-commerce Olist</w:t>
+    </w:r>
+  </w:p>
+</w:hdr>
+</file>
+
+<file path=word/header2.xml><?xml version="1.0" encoding="utf-8"?>
+<w:hdr xmlns:wpc="http://schemas.microsoft.com/office/word/2010/wordprocessingCanvas" xmlns:mc="http://schemas.openxmlformats.org/markup-compatibility/2006" xmlns:o="urn:schemas-microsoft-com:office:office" xmlns:r="http://schemas.openxmlformats.org/officeDocument/2006/relationships" xmlns:m="http://schemas.openxmlformats.org/officeDocument/2006/math" xmlns:v="urn:schemas-microsoft-com:vml" xmlns:wp14="http://schemas.microsoft.com/office/word/2010/wordprocessingDrawing" xmlns:wp="http://schemas.openxmlformats.org/drawingml/2006/wordprocessingDrawing" xmlns:w10="urn:schemas-microsoft-com:office:word" xmlns:w="http://schemas.openxmlformats.org/wordprocessingml/2006/main" xmlns:w14="http://schemas.microsoft.com/office/word/2010/wordml" xmlns:w15="http://schemas.microsoft.com/office/word/2012/wordml" xmlns:wpg="http://schemas.microsoft.com/office/word/2010/wordprocessingGroup" xmlns:wpi="http://schemas.microsoft.com/office/word/2010/wordprocessingInk" xmlns:wne="http://schemas.microsoft.com/office/word/2006/wordml" xmlns:wps="http://schemas.microsoft.com/office/word/2010/wordprocessingShape" xmlns:cx="http://schemas.microsoft.com/office/drawing/2014/chartex" xmlns:cx1="http://schemas.microsoft.com/office/drawing/2015/9/8/chartex" xmlns:cx2="http://schemas.microsoft.com/office/drawing/2015/10/21/chartex" xmlns:cx3="http://schemas.microsoft.com/office/drawing/2016/5/9/chartex" xmlns:cx4="http://schemas.microsoft.com/office/drawing/2016/5/10/chartex" xmlns:cx5="http://schemas.microsoft.com/office/drawing/2016/5/11/chartex" xmlns:cx6="http://schemas.microsoft.com/office/drawing/2016/5/12/chartex" xmlns:cx7="http://schemas.microsoft.com/office/drawing/2016/5/13/chartex" xmlns:cx8="http://schemas.microsoft.com/office/drawing/2016/5/14/chartex" xmlns:w16cid="http://schemas.microsoft.com/office/word/2016/wordml/cid" xmlns:w16se="http://schemas.microsoft.com/office/word/2015/wordml/symex">
+  <w:p>
+    <w:r>
+      <w:t xml:space="preserve"/>
+    </w:r>
+  </w:p>
+</w:hdr>
 </file>
 
 <file path=word/numbering.xml><?xml version="1.0" encoding="utf-8"?>

</xml_diff>

<commit_message>
Corrige pagina em branco, separa cobertura da base do recorte e inclui os integrantes
</commit_message>
<xml_diff>
--- a/reports/relatorio_executivo_olist.docx
+++ b/reports/relatorio_executivo_olist.docx
@@ -4,7 +4,7 @@
   <w:body>
     <w:p>
       <w:pPr>
-        <w:spacing w:after="2000"/>
+        <w:spacing w:after="1100"/>
       </w:pPr>
       <w:r>
         <w:t xml:space="preserve"/>
@@ -60,7 +60,7 @@
     </w:p>
     <w:p>
       <w:pPr>
-        <w:spacing w:after="1400"/>
+        <w:spacing w:after="800"/>
         <w:jc w:val="center"/>
       </w:pPr>
       <w:r>
@@ -159,7 +159,7 @@
                 <w:sz w:val="19"/>
                 <w:szCs w:val="19"/>
               </w:rPr>
-              <w:t xml:space="preserve">Período analisado</w:t>
+              <w:t xml:space="preserve">Cobertura da base</w:t>
             </w:r>
           </w:p>
         </w:tc>
@@ -183,7 +183,7 @@
                 <w:sz w:val="19"/>
                 <w:szCs w:val="19"/>
               </w:rPr>
-              <w:t xml:space="preserve">Janeiro de 2017 a agosto de 2018</w:t>
+              <w:t xml:space="preserve">Setembro de 2016 a outubro de 2018, 99.441 pedidos</w:t>
             </w:r>
           </w:p>
         </w:tc>
@@ -207,7 +207,7 @@
                 <w:sz w:val="19"/>
                 <w:szCs w:val="19"/>
               </w:rPr>
-              <w:t xml:space="preserve">Volume</w:t>
+              <w:t xml:space="preserve">Recorte analisado</w:t>
             </w:r>
           </w:p>
         </w:tc>
@@ -231,7 +231,7 @@
                 <w:sz w:val="19"/>
                 <w:szCs w:val="19"/>
               </w:rPr>
-              <w:t xml:space="preserve">97.905 pedidos e R$ 15,68 milhões</w:t>
+              <w:t xml:space="preserve">Janeiro de 2017 a agosto de 2018, 97.905 pedidos</w:t>
             </w:r>
           </w:p>
         </w:tc>
@@ -334,17 +334,104 @@
       </w:tr>
     </w:tbl>
     <w:p>
-      <w:r>
-        <w:br w:type="page"/>
+      <w:pPr>
+        <w:spacing w:after="200"/>
+      </w:pPr>
+      <w:r>
+        <w:t xml:space="preserve"/>
+      </w:r>
+    </w:p>
+    <w:p>
+      <w:pPr>
+        <w:spacing w:after="200"/>
+      </w:pPr>
+      <w:r>
+        <w:t xml:space="preserve"/>
+      </w:r>
+    </w:p>
+    <w:p>
+      <w:pPr>
+        <w:spacing w:after="130"/>
+        <w:jc w:val="center"/>
+      </w:pPr>
+      <w:r>
+        <w:rPr>
+          <w:rFonts w:ascii="Calibri" w:cs="Calibri" w:eastAsia="Calibri" w:hAnsi="Calibri"/>
+          <w:color w:val="888888"/>
+          <w:sz w:val="19"/>
+          <w:szCs w:val="19"/>
+        </w:rPr>
+        <w:t xml:space="preserve">Grupo</w:t>
+      </w:r>
+    </w:p>
+    <w:p>
+      <w:pPr>
+        <w:spacing w:after="60"/>
+        <w:jc w:val="center"/>
+      </w:pPr>
+      <w:r>
+        <w:rPr>
+          <w:rFonts w:ascii="Calibri" w:cs="Calibri" w:eastAsia="Calibri" w:hAnsi="Calibri"/>
+          <w:color w:val="444444"/>
+          <w:sz w:val="21"/>
+          <w:szCs w:val="21"/>
+        </w:rPr>
+        <w:t xml:space="preserve">Eduardo Zancanaro Vilela</w:t>
+      </w:r>
+    </w:p>
+    <w:p>
+      <w:pPr>
+        <w:spacing w:after="60"/>
+        <w:jc w:val="center"/>
+      </w:pPr>
+      <w:r>
+        <w:rPr>
+          <w:rFonts w:ascii="Calibri" w:cs="Calibri" w:eastAsia="Calibri" w:hAnsi="Calibri"/>
+          <w:color w:val="444444"/>
+          <w:sz w:val="21"/>
+          <w:szCs w:val="21"/>
+        </w:rPr>
+        <w:t xml:space="preserve">Evanio Alves Carvalho</w:t>
+      </w:r>
+    </w:p>
+    <w:p>
+      <w:pPr>
+        <w:spacing w:after="60"/>
+        <w:jc w:val="center"/>
+      </w:pPr>
+      <w:r>
+        <w:rPr>
+          <w:rFonts w:ascii="Calibri" w:cs="Calibri" w:eastAsia="Calibri" w:hAnsi="Calibri"/>
+          <w:color w:val="444444"/>
+          <w:sz w:val="21"/>
+          <w:szCs w:val="21"/>
+        </w:rPr>
+        <w:t xml:space="preserve">Marcela Morillas de Souza</w:t>
+      </w:r>
+    </w:p>
+    <w:p>
+      <w:pPr>
+        <w:spacing w:after="60"/>
+        <w:jc w:val="center"/>
+      </w:pPr>
+      <w:r>
+        <w:rPr>
+          <w:rFonts w:ascii="Calibri" w:cs="Calibri" w:eastAsia="Calibri" w:hAnsi="Calibri"/>
+          <w:color w:val="444444"/>
+          <w:sz w:val="21"/>
+          <w:szCs w:val="21"/>
+        </w:rPr>
+        <w:t xml:space="preserve">Mateus Araujo</w:t>
       </w:r>
     </w:p>
     <w:p>
       <w:pPr>
         <w:keepNext/>
+        <w:pageBreakBefore/>
         <w:pBdr>
           <w:bottom w:val="single" w:color="D9D9D9" w:sz="6" w:space="6"/>
         </w:pBdr>
-        <w:spacing w:after="180" w:before="360"/>
+        <w:spacing w:after="180" w:before="0"/>
       </w:pPr>
       <w:r>
         <w:rPr>
@@ -413,7 +500,7 @@
           <w:sz w:val="20"/>
           <w:szCs w:val="20"/>
         </w:rPr>
-        <w:t xml:space="preserve">	5</w:t>
+        <w:t xml:space="preserve">	4</w:t>
       </w:r>
     </w:p>
     <w:p>
@@ -442,7 +529,7 @@
           <w:sz w:val="20"/>
           <w:szCs w:val="20"/>
         </w:rPr>
-        <w:t xml:space="preserve">	5</w:t>
+        <w:t xml:space="preserve">	4</w:t>
       </w:r>
     </w:p>
     <w:p>
@@ -471,7 +558,7 @@
           <w:sz w:val="20"/>
           <w:szCs w:val="20"/>
         </w:rPr>
-        <w:t xml:space="preserve">	5</w:t>
+        <w:t xml:space="preserve">	4</w:t>
       </w:r>
     </w:p>
     <w:p>
@@ -500,7 +587,7 @@
           <w:sz w:val="20"/>
           <w:szCs w:val="20"/>
         </w:rPr>
-        <w:t xml:space="preserve">	6</w:t>
+        <w:t xml:space="preserve">	5</w:t>
       </w:r>
     </w:p>
     <w:p>
@@ -529,7 +616,7 @@
           <w:sz w:val="20"/>
           <w:szCs w:val="20"/>
         </w:rPr>
-        <w:t xml:space="preserve">	7</w:t>
+        <w:t xml:space="preserve">	6</w:t>
       </w:r>
     </w:p>
     <w:p>
@@ -558,7 +645,7 @@
           <w:sz w:val="20"/>
           <w:szCs w:val="20"/>
         </w:rPr>
-        <w:t xml:space="preserve">	7</w:t>
+        <w:t xml:space="preserve">	6</w:t>
       </w:r>
     </w:p>
     <w:p>
@@ -587,7 +674,7 @@
           <w:sz w:val="20"/>
           <w:szCs w:val="20"/>
         </w:rPr>
-        <w:t xml:space="preserve">	7</w:t>
+        <w:t xml:space="preserve">	6</w:t>
       </w:r>
     </w:p>
     <w:p>
@@ -616,7 +703,7 @@
           <w:sz w:val="20"/>
           <w:szCs w:val="20"/>
         </w:rPr>
-        <w:t xml:space="preserve">	9</w:t>
+        <w:t xml:space="preserve">	8</w:t>
       </w:r>
     </w:p>
     <w:p>
@@ -645,7 +732,7 @@
           <w:sz w:val="20"/>
           <w:szCs w:val="20"/>
         </w:rPr>
-        <w:t xml:space="preserve">	9</w:t>
+        <w:t xml:space="preserve">	8</w:t>
       </w:r>
     </w:p>
     <w:p>
@@ -674,7 +761,7 @@
           <w:sz w:val="20"/>
           <w:szCs w:val="20"/>
         </w:rPr>
-        <w:t xml:space="preserve">	11</w:t>
+        <w:t xml:space="preserve">	10</w:t>
       </w:r>
     </w:p>
     <w:p>
@@ -703,7 +790,7 @@
           <w:sz w:val="20"/>
           <w:szCs w:val="20"/>
         </w:rPr>
-        <w:t xml:space="preserve">	12</w:t>
+        <w:t xml:space="preserve">	11</w:t>
       </w:r>
     </w:p>
     <w:p>
@@ -732,7 +819,7 @@
           <w:sz w:val="20"/>
           <w:szCs w:val="20"/>
         </w:rPr>
-        <w:t xml:space="preserve">	12</w:t>
+        <w:t xml:space="preserve">	11</w:t>
       </w:r>
     </w:p>
     <w:p>
@@ -761,7 +848,7 @@
           <w:sz w:val="20"/>
           <w:szCs w:val="20"/>
         </w:rPr>
-        <w:t xml:space="preserve">	14</w:t>
+        <w:t xml:space="preserve">	13</w:t>
       </w:r>
     </w:p>
     <w:p>
@@ -790,7 +877,7 @@
           <w:sz w:val="20"/>
           <w:szCs w:val="20"/>
         </w:rPr>
-        <w:t xml:space="preserve">	14</w:t>
+        <w:t xml:space="preserve">	13</w:t>
       </w:r>
     </w:p>
     <w:p>
@@ -819,7 +906,7 @@
           <w:sz w:val="20"/>
           <w:szCs w:val="20"/>
         </w:rPr>
-        <w:t xml:space="preserve">	15</w:t>
+        <w:t xml:space="preserve">	14</w:t>
       </w:r>
     </w:p>
     <w:p>
@@ -975,17 +1062,13 @@
       </w:r>
     </w:p>
     <w:p>
-      <w:r>
-        <w:br w:type="page"/>
-      </w:r>
-    </w:p>
-    <w:p>
       <w:pPr>
         <w:keepNext/>
+        <w:pageBreakBefore/>
         <w:pBdr>
           <w:bottom w:val="single" w:color="D9D9D9" w:sz="6" w:space="6"/>
         </w:pBdr>
-        <w:spacing w:after="180" w:before="360"/>
+        <w:spacing w:after="180" w:before="0"/>
       </w:pPr>
       <w:r>
         <w:rPr>
@@ -1773,17 +1856,13 @@
       </w:r>
     </w:p>
     <w:p>
-      <w:r>
-        <w:br w:type="page"/>
-      </w:r>
-    </w:p>
-    <w:p>
       <w:pPr>
         <w:keepNext/>
+        <w:pageBreakBefore/>
         <w:pBdr>
           <w:bottom w:val="single" w:color="D9D9D9" w:sz="6" w:space="6"/>
         </w:pBdr>
-        <w:spacing w:after="180" w:before="360"/>
+        <w:spacing w:after="180" w:before="0"/>
       </w:pPr>
       <w:r>
         <w:rPr>
@@ -2400,17 +2479,13 @@
       </w:r>
     </w:p>
     <w:p>
-      <w:r>
-        <w:br w:type="page"/>
-      </w:r>
-    </w:p>
-    <w:p>
       <w:pPr>
         <w:keepNext/>
+        <w:pageBreakBefore/>
         <w:pBdr>
           <w:bottom w:val="single" w:color="D9D9D9" w:sz="6" w:space="6"/>
         </w:pBdr>
-        <w:spacing w:after="180" w:before="360"/>
+        <w:spacing w:after="180" w:before="0"/>
       </w:pPr>
       <w:r>
         <w:rPr>
@@ -2690,17 +2765,13 @@
       </w:r>
     </w:p>
     <w:p>
-      <w:r>
-        <w:br w:type="page"/>
-      </w:r>
-    </w:p>
-    <w:p>
       <w:pPr>
         <w:keepNext/>
+        <w:pageBreakBefore/>
         <w:pBdr>
           <w:bottom w:val="single" w:color="D9D9D9" w:sz="6" w:space="6"/>
         </w:pBdr>
-        <w:spacing w:after="180" w:before="360"/>
+        <w:spacing w:after="180" w:before="0"/>
       </w:pPr>
       <w:r>
         <w:rPr>
@@ -3396,17 +3467,13 @@
       </w:r>
     </w:p>
     <w:p>
-      <w:r>
-        <w:br w:type="page"/>
-      </w:r>
-    </w:p>
-    <w:p>
       <w:pPr>
         <w:keepNext/>
+        <w:pageBreakBefore/>
         <w:pBdr>
           <w:bottom w:val="single" w:color="D9D9D9" w:sz="6" w:space="6"/>
         </w:pBdr>
-        <w:spacing w:after="180" w:before="360"/>
+        <w:spacing w:after="180" w:before="0"/>
       </w:pPr>
       <w:r>
         <w:rPr>
@@ -3794,17 +3861,13 @@
       </w:r>
     </w:p>
     <w:p>
-      <w:r>
-        <w:br w:type="page"/>
-      </w:r>
-    </w:p>
-    <w:p>
       <w:pPr>
         <w:keepNext/>
+        <w:pageBreakBefore/>
         <w:pBdr>
           <w:bottom w:val="single" w:color="D9D9D9" w:sz="6" w:space="6"/>
         </w:pBdr>
-        <w:spacing w:after="180" w:before="360"/>
+        <w:spacing w:after="180" w:before="0"/>
       </w:pPr>
       <w:r>
         <w:rPr>

</xml_diff>

<commit_message>
Corrige referencia de secao, acento e criterio da media de novembro
</commit_message>
<xml_diff>
--- a/reports/relatorio_executivo_olist.docx
+++ b/reports/relatorio_executivo_olist.docx
@@ -421,7 +421,7 @@
           <w:sz w:val="21"/>
           <w:szCs w:val="21"/>
         </w:rPr>
-        <w:t xml:space="preserve">Mateus Araujo</w:t>
+        <w:t xml:space="preserve">Mateus Araújo</w:t>
       </w:r>
     </w:p>
     <w:p>
@@ -1852,7 +1852,7 @@
           <w:sz w:val="22"/>
           <w:szCs w:val="22"/>
         </w:rPr>
-        <w:t xml:space="preserve">As recomendações priorizadas estão na seção 6.</w:t>
+        <w:t xml:space="preserve">As recomendações priorizadas estão na seção 7.</w:t>
       </w:r>
     </w:p>
     <w:p>
@@ -2746,7 +2746,7 @@
           <w:sz w:val="22"/>
           <w:szCs w:val="22"/>
         </w:rPr>
-        <w:t xml:space="preserve">O resultado se concentra em uma única data. Em 24 de novembro, dia da Black Friday, foram registrados 1.166 pedidos, contra uma média de 191 nos demais dias do mês, seis vezes o volume habitual. Dezembro retorna ao patamar anterior.</w:t>
+        <w:t xml:space="preserve">O resultado se concentra em uma única data. Em 24 de novembro, dia da Black Friday, foram registrados 1.166 pedidos, contra uma média de 191 nos dias fora do fim de semana promocional, seis vezes o volume habitual. Dezembro retorna ao patamar anterior.</w:t>
       </w:r>
     </w:p>
     <w:p>

</xml_diff>

<commit_message>
Ajusta arredondamento da receita por vendedor para R$ 787
</commit_message>
<xml_diff>
--- a/reports/relatorio_executivo_olist.docx
+++ b/reports/relatorio_executivo_olist.docx
@@ -1826,7 +1826,7 @@
                 <w:sz w:val="20"/>
                 <w:szCs w:val="20"/>
               </w:rPr>
-              <w:t xml:space="preserve">R$ 1.138 para R$ 788 (-30,8%)</w:t>
+              <w:t xml:space="preserve">R$ 1.138 para R$ 787 (-30,8%)</w:t>
             </w:r>
           </w:p>
         </w:tc>
@@ -3340,7 +3340,7 @@
                 <w:sz w:val="20"/>
                 <w:szCs w:val="20"/>
               </w:rPr>
-              <w:t xml:space="preserve">R$ 788</w:t>
+              <w:t xml:space="preserve">R$ 787</w:t>
             </w:r>
           </w:p>
         </w:tc>

</xml_diff>

<commit_message>
Corrige status dos pedidos, contagem de categorias e caminhos dos notebooks
</commit_message>
<xml_diff>
--- a/reports/relatorio_executivo_olist.docx
+++ b/reports/relatorio_executivo_olist.docx
@@ -2482,7 +2482,7 @@
           <w:sz w:val="22"/>
           <w:szCs w:val="22"/>
         </w:rPr>
-        <w:t xml:space="preserve">A exclusão de pedidos cancelados e indisponíveis também foi verificada antes de aplicada. Nenhum pedido com status unavailable possui produto associado e apenas 77,2% dos canceled possuem, enquanto os demais status apresentam 100%. Vendas que não se concretizaram não compõem receita.</w:t>
+        <w:t xml:space="preserve">A exclusão de pedidos cancelados e indisponíveis também foi verificada antes de aplicada. Quase nenhum pedido com status unavailable possui produto associado, apenas 1,0% deles, e nos canceled o índice é de 73,8%, enquanto nos demais status o índice fica em 99% ou mais. Vendas que não se concretizaram não compõem receita.</w:t>
       </w:r>
     </w:p>
     <w:p>
@@ -3439,7 +3439,7 @@
           <w:sz w:val="22"/>
           <w:szCs w:val="22"/>
         </w:rPr>
-        <w:t xml:space="preserve">A receita está distribuída de forma saudável em dois eixos e concentrada em um terceiro. São 72 categorias de produto, com as cinco maiores somando 39,3%, e 3.029 vendedores, com os dez maiores somando apenas 12,9%. Não há dependência de produto-âncora nem de fornecedor específico.</w:t>
+        <w:t xml:space="preserve">A receita está distribuída de forma saudável em dois eixos e concentrada em um terceiro. São 73 categorias de produto, com as cinco maiores somando 39,3%, e 3.029 vendedores, com os dez maiores somando apenas 12,9%. Não há dependência de produto-âncora nem de fornecedor específico.</w:t>
       </w:r>
     </w:p>
     <w:p>

</xml_diff>

<commit_message>
Documenta as escolhas de projecao, ponderacao e marco do tempo de entrega
</commit_message>
<xml_diff>
--- a/reports/relatorio_executivo_olist.docx
+++ b/reports/relatorio_executivo_olist.docx
@@ -4101,95 +4101,6 @@
     </w:p>
     <w:p>
       <w:pPr>
-        <w:keepNext/>
-        <w:pBdr>
-          <w:bottom w:val="single" w:color="D9D9D9" w:sz="6" w:space="6"/>
-        </w:pBdr>
-        <w:spacing w:after="180" w:before="360"/>
-      </w:pPr>
-      <w:r>
-        <w:rPr>
-          <w:rFonts w:ascii="Calibri" w:cs="Calibri" w:eastAsia="Calibri" w:hAnsi="Calibri"/>
-          <w:b/>
-          <w:bCs/>
-          <w:color w:val="ED1064"/>
-          <w:sz w:val="30"/>
-          <w:szCs w:val="30"/>
-        </w:rPr>
-        <w:t xml:space="preserve">7. Conclusões e recomendações</w:t>
-      </w:r>
-    </w:p>
-    <w:p>
-      <w:pPr>
-        <w:spacing w:after="160" w:line="300"/>
-        <w:jc w:val="both"/>
-      </w:pPr>
-      <w:r>
-        <w:rPr>
-          <w:rFonts w:ascii="Calibri" w:cs="Calibri" w:eastAsia="Calibri" w:hAnsi="Calibri"/>
-          <w:color w:val="444444"/>
-          <w:sz w:val="22"/>
-          <w:szCs w:val="22"/>
-        </w:rPr>
-        <w:t xml:space="preserve">A Olist demonstrou capacidade de crescer rapidamente e construiu uma base diversificada de produtos e vendedores, sem dependência de fornecedor ou categoria específica. Absorveu um pico de demanda seis vezes superior ao normal sem ruptura operacional.</w:t>
-      </w:r>
-    </w:p>
-    <w:p>
-      <w:pPr>
-        <w:spacing w:after="160" w:line="300"/>
-        <w:jc w:val="both"/>
-      </w:pPr>
-      <w:r>
-        <w:rPr>
-          <w:rFonts w:ascii="Calibri" w:cs="Calibri" w:eastAsia="Calibri" w:hAnsi="Calibri"/>
-          <w:color w:val="444444"/>
-          <w:sz w:val="22"/>
-          <w:szCs w:val="22"/>
-        </w:rPr>
-        <w:t xml:space="preserve">O crescimento, porém, encontrou um limite claro em 2018, e esse limite está na demanda. A empresa continua atraindo vendedores em ritmo elevado enquanto perde compradores, o que deteriora o resultado por vendedor e torna a expansão da oferta contraproducente no curto prazo.</w:t>
-      </w:r>
-    </w:p>
-    <w:p>
-      <w:pPr>
-        <w:spacing w:after="160" w:line="300"/>
-        <w:jc w:val="both"/>
-      </w:pPr>
-      <w:r>
-        <w:rPr>
-          <w:rFonts w:ascii="Calibri" w:cs="Calibri" w:eastAsia="Calibri" w:hAnsi="Calibri"/>
-          <w:color w:val="444444"/>
-          <w:sz w:val="22"/>
-          <w:szCs w:val="22"/>
-        </w:rPr>
-        <w:t xml:space="preserve">A dimensão geográfica concentra simultaneamente o principal risco e a principal oportunidade. A dependência de São Paulo expõe a receita, e os 22 estados de menor participação enfrentam prazos e custos de frete substancialmente piores, o que sugere que parte relevante desse mercado é endereçável por investimento em operação.</w:t>
-      </w:r>
-    </w:p>
-    <w:p>
-      <w:pPr>
-        <w:spacing w:after="200"/>
-      </w:pPr>
-      <w:r>
-        <w:t xml:space="preserve"/>
-      </w:r>
-    </w:p>
-    <w:p>
-      <w:pPr>
-        <w:spacing w:after="140"/>
-      </w:pPr>
-      <w:r>
-        <w:rPr>
-          <w:rFonts w:ascii="Calibri" w:cs="Calibri" w:eastAsia="Calibri" w:hAnsi="Calibri"/>
-          <w:b/>
-          <w:bCs/>
-          <w:color w:val="444444"/>
-          <w:sz w:val="22"/>
-          <w:szCs w:val="22"/>
-        </w:rPr>
-        <w:t xml:space="preserve">Recomendações, em ordem de prioridade:</w:t>
-      </w:r>
-    </w:p>
-    <w:p>
-      <w:pPr>
         <w:pStyle w:val="ListParagraph"/>
         <w:numPr>
           <w:ilvl w:val="0"/>
@@ -4205,7 +4116,96 @@
           <w:sz w:val="22"/>
           <w:szCs w:val="22"/>
         </w:rPr>
-        <w:t xml:space="preserve">Priorizar aquisição e retenção de clientes antes de ampliar a base de vendedores. A demanda é o fator limitante, e investir em oferta sem resolver esse ponto reduz ainda mais a receita por vendedor.</w:t>
+        <w:t xml:space="preserve">Não foi aplicado modelo de tendência nem decomposição sazonal. O recorte tem vinte meses e um único novembro, e sem ao menos dois ciclos completos não há como estimar componente sazonal.</w:t>
+      </w:r>
+    </w:p>
+    <w:p>
+      <w:pPr>
+        <w:keepNext/>
+        <w:pBdr>
+          <w:bottom w:val="single" w:color="D9D9D9" w:sz="6" w:space="6"/>
+        </w:pBdr>
+        <w:spacing w:after="180" w:before="360"/>
+      </w:pPr>
+      <w:r>
+        <w:rPr>
+          <w:rFonts w:ascii="Calibri" w:cs="Calibri" w:eastAsia="Calibri" w:hAnsi="Calibri"/>
+          <w:b/>
+          <w:bCs/>
+          <w:color w:val="ED1064"/>
+          <w:sz w:val="30"/>
+          <w:szCs w:val="30"/>
+        </w:rPr>
+        <w:t xml:space="preserve">7. Conclusões e recomendações</w:t>
+      </w:r>
+    </w:p>
+    <w:p>
+      <w:pPr>
+        <w:spacing w:after="160" w:line="300"/>
+        <w:jc w:val="both"/>
+      </w:pPr>
+      <w:r>
+        <w:rPr>
+          <w:rFonts w:ascii="Calibri" w:cs="Calibri" w:eastAsia="Calibri" w:hAnsi="Calibri"/>
+          <w:color w:val="444444"/>
+          <w:sz w:val="22"/>
+          <w:szCs w:val="22"/>
+        </w:rPr>
+        <w:t xml:space="preserve">A Olist demonstrou capacidade de crescer rapidamente e construiu uma base diversificada de produtos e vendedores, sem dependência de fornecedor ou categoria específica. Absorveu um pico de demanda seis vezes superior ao normal sem ruptura operacional.</w:t>
+      </w:r>
+    </w:p>
+    <w:p>
+      <w:pPr>
+        <w:spacing w:after="160" w:line="300"/>
+        <w:jc w:val="both"/>
+      </w:pPr>
+      <w:r>
+        <w:rPr>
+          <w:rFonts w:ascii="Calibri" w:cs="Calibri" w:eastAsia="Calibri" w:hAnsi="Calibri"/>
+          <w:color w:val="444444"/>
+          <w:sz w:val="22"/>
+          <w:szCs w:val="22"/>
+        </w:rPr>
+        <w:t xml:space="preserve">O crescimento, porém, encontrou um limite claro em 2018, e esse limite está na demanda. A empresa continua atraindo vendedores em ritmo elevado enquanto perde compradores, o que deteriora o resultado por vendedor e torna a expansão da oferta contraproducente no curto prazo.</w:t>
+      </w:r>
+    </w:p>
+    <w:p>
+      <w:pPr>
+        <w:spacing w:after="160" w:line="300"/>
+        <w:jc w:val="both"/>
+      </w:pPr>
+      <w:r>
+        <w:rPr>
+          <w:rFonts w:ascii="Calibri" w:cs="Calibri" w:eastAsia="Calibri" w:hAnsi="Calibri"/>
+          <w:color w:val="444444"/>
+          <w:sz w:val="22"/>
+          <w:szCs w:val="22"/>
+        </w:rPr>
+        <w:t xml:space="preserve">A dimensão geográfica concentra simultaneamente o principal risco e a principal oportunidade. A dependência de São Paulo expõe a receita, e os 22 estados de menor participação enfrentam prazos e custos de frete substancialmente piores, o que sugere que parte relevante desse mercado é endereçável por investimento em operação.</w:t>
+      </w:r>
+    </w:p>
+    <w:p>
+      <w:pPr>
+        <w:spacing w:after="200"/>
+      </w:pPr>
+      <w:r>
+        <w:t xml:space="preserve"/>
+      </w:r>
+    </w:p>
+    <w:p>
+      <w:pPr>
+        <w:spacing w:after="140"/>
+      </w:pPr>
+      <w:r>
+        <w:rPr>
+          <w:rFonts w:ascii="Calibri" w:cs="Calibri" w:eastAsia="Calibri" w:hAnsi="Calibri"/>
+          <w:b/>
+          <w:bCs/>
+          <w:color w:val="444444"/>
+          <w:sz w:val="22"/>
+          <w:szCs w:val="22"/>
+        </w:rPr>
+        <w:t xml:space="preserve">Recomendações, em ordem de prioridade:</w:t>
       </w:r>
     </w:p>
     <w:p>
@@ -4225,7 +4225,7 @@
           <w:sz w:val="22"/>
           <w:szCs w:val="22"/>
         </w:rPr>
-        <w:t xml:space="preserve">Tratar a expansão fora do Sudeste como problema logístico, não apenas comercial. Reduzir prazo e custo de frete nas regiões com pior desempenho ataca a causa, enquanto ação comercial isolada esbarra na mesma barreira de experiência.</w:t>
+        <w:t xml:space="preserve">Priorizar aquisição e retenção de clientes antes de ampliar a base de vendedores. A demanda é o fator limitante, e investir em oferta sem resolver esse ponto reduz ainda mais a receita por vendedor.</w:t>
       </w:r>
     </w:p>
     <w:p>
@@ -4245,7 +4245,7 @@
           <w:sz w:val="22"/>
           <w:szCs w:val="22"/>
         </w:rPr>
-        <w:t xml:space="preserve">Recalibrar o prazo prometido nos estados em que ele está descolado da operação, como Alagoas. É a medida de maior retorno imediato por unidade de esforço, pois melhora a experiência sem exigir mudança estrutural.</w:t>
+        <w:t xml:space="preserve">Tratar a expansão fora do Sudeste como problema logístico, não apenas comercial. Reduzir prazo e custo de frete nas regiões com pior desempenho ataca a causa, enquanto ação comercial isolada esbarra na mesma barreira de experiência.</w:t>
       </w:r>
     </w:p>
     <w:p>
@@ -4265,7 +4265,7 @@
           <w:sz w:val="22"/>
           <w:szCs w:val="22"/>
         </w:rPr>
-        <w:t xml:space="preserve">Monitorar a receita por vendedor como indicador de saúde da plataforma. A queda de quase um terço em oito meses é o sinal mais direto de desequilíbrio entre oferta e demanda.</w:t>
+        <w:t xml:space="preserve">Recalibrar o prazo prometido nos estados em que ele está descolado da operação, como Alagoas. É a medida de maior retorno imediato por unidade de esforço, pois melhora a experiência sem exigir mudança estrutural.</w:t>
       </w:r>
     </w:p>
     <w:p>
@@ -4285,6 +4285,26 @@
           <w:sz w:val="22"/>
           <w:szCs w:val="22"/>
         </w:rPr>
+        <w:t xml:space="preserve">Monitorar a receita por vendedor como indicador de saúde da plataforma. A queda de quase um terço em oito meses é o sinal mais direto de desequilíbrio entre oferta e demanda.</w:t>
+      </w:r>
+    </w:p>
+    <w:p>
+      <w:pPr>
+        <w:pStyle w:val="ListParagraph"/>
+        <w:numPr>
+          <w:ilvl w:val="0"/>
+          <w:numId w:val="1"/>
+        </w:numPr>
+        <w:spacing w:after="110" w:line="300"/>
+        <w:jc w:val="both"/>
+      </w:pPr>
+      <w:r>
+        <w:rPr>
+          <w:rFonts w:ascii="Calibri" w:cs="Calibri" w:eastAsia="Calibri" w:hAnsi="Calibri"/>
+          <w:color w:val="444444"/>
+          <w:sz w:val="22"/>
+          <w:szCs w:val="22"/>
+        </w:rPr>
         <w:t xml:space="preserve">Estruturar uma frente própria de retenção. O atraso responde por menos de um ponto percentual da recompra, o que significa que a melhoria logística, embora necessária, não constrói sozinha uma base recorrente.</w:t>
       </w:r>
     </w:p>
@@ -4333,6 +4353,36 @@
           <w:szCs w:val="22"/>
         </w:rPr>
         <w:t xml:space="preserve">A relação entre tempo de entrega e receita por estado é uma correlação. São Paulo concentra também população e renda, fatores que explicam parcela da diferença observada e que esta base não permite isolar.</w:t>
+      </w:r>
+    </w:p>
+    <w:p>
+      <w:pPr>
+        <w:spacing w:after="160" w:line="300"/>
+        <w:jc w:val="both"/>
+      </w:pPr>
+      <w:r>
+        <w:rPr>
+          <w:rFonts w:ascii="Calibri" w:cs="Calibri" w:eastAsia="Calibri" w:hAnsi="Calibri"/>
+          <w:color w:val="444444"/>
+          <w:sz w:val="22"/>
+          <w:szCs w:val="22"/>
+        </w:rPr>
+        <w:t xml:space="preserve">Essa correlação atribui o mesmo peso a cada estado, embora os volumes sejam muito diferentes. São Paulo registra 40.399 pedidos no período e Roraima registra 40. Ponderando pelo volume, a relação fica mais forte, em -0,86, de modo que o valor adotado no relatório é a leitura conservadora.</w:t>
+      </w:r>
+    </w:p>
+    <w:p>
+      <w:pPr>
+        <w:spacing w:after="160" w:line="300"/>
+        <w:jc w:val="both"/>
+      </w:pPr>
+      <w:r>
+        <w:rPr>
+          <w:rFonts w:ascii="Calibri" w:cs="Calibri" w:eastAsia="Calibri" w:hAnsi="Calibri"/>
+          <w:color w:val="444444"/>
+          <w:sz w:val="22"/>
+          <w:szCs w:val="22"/>
+        </w:rPr>
+        <w:t xml:space="preserve">O tempo de entrega é medido da compra até o recebimento. Ele representa a espera do cliente e inclui o prazo de aprovação do pagamento, não apenas o transporte, o que deve ser considerado ao dimensionar ações sobre a operação logística.</w:t>
       </w:r>
     </w:p>
     <w:p>

</xml_diff>

<commit_message>
Corrige o uso de agosto de 2018, a afirmacao sobre a Black Friday e os pontos da revisao tecnica
</commit_message>
<xml_diff>
--- a/reports/relatorio_executivo_olist.docx
+++ b/reports/relatorio_executivo_olist.docx
@@ -554,7 +554,7 @@
           <w:sz w:val="20"/>
           <w:szCs w:val="20"/>
         </w:rPr>
-        <w:t xml:space="preserve">	4</w:t>
+        <w:t xml:space="preserve">	5</w:t>
       </w:r>
     </w:p>
     <w:p>
@@ -583,7 +583,7 @@
           <w:sz w:val="20"/>
           <w:szCs w:val="20"/>
         </w:rPr>
-        <w:t xml:space="preserve">	4</w:t>
+        <w:t xml:space="preserve">	5</w:t>
       </w:r>
     </w:p>
     <w:p>
@@ -612,7 +612,7 @@
           <w:sz w:val="20"/>
           <w:szCs w:val="20"/>
         </w:rPr>
-        <w:t xml:space="preserve">	4</w:t>
+        <w:t xml:space="preserve">	5</w:t>
       </w:r>
     </w:p>
     <w:p>
@@ -641,7 +641,7 @@
           <w:sz w:val="20"/>
           <w:szCs w:val="20"/>
         </w:rPr>
-        <w:t xml:space="preserve">	5</w:t>
+        <w:t xml:space="preserve">	6</w:t>
       </w:r>
     </w:p>
     <w:p>
@@ -670,7 +670,7 @@
           <w:sz w:val="20"/>
           <w:szCs w:val="20"/>
         </w:rPr>
-        <w:t xml:space="preserve">	6</w:t>
+        <w:t xml:space="preserve">	7</w:t>
       </w:r>
     </w:p>
     <w:p>
@@ -699,7 +699,7 @@
           <w:sz w:val="20"/>
           <w:szCs w:val="20"/>
         </w:rPr>
-        <w:t xml:space="preserve">	6</w:t>
+        <w:t xml:space="preserve">	7</w:t>
       </w:r>
     </w:p>
     <w:p>
@@ -728,7 +728,7 @@
           <w:sz w:val="20"/>
           <w:szCs w:val="20"/>
         </w:rPr>
-        <w:t xml:space="preserve">	6</w:t>
+        <w:t xml:space="preserve">	7</w:t>
       </w:r>
     </w:p>
     <w:p>
@@ -757,7 +757,7 @@
           <w:sz w:val="20"/>
           <w:szCs w:val="20"/>
         </w:rPr>
-        <w:t xml:space="preserve">	8</w:t>
+        <w:t xml:space="preserve">	9</w:t>
       </w:r>
     </w:p>
     <w:p>
@@ -786,7 +786,7 @@
           <w:sz w:val="20"/>
           <w:szCs w:val="20"/>
         </w:rPr>
-        <w:t xml:space="preserve">	8</w:t>
+        <w:t xml:space="preserve">	9</w:t>
       </w:r>
     </w:p>
     <w:p>
@@ -815,7 +815,7 @@
           <w:sz w:val="20"/>
           <w:szCs w:val="20"/>
         </w:rPr>
-        <w:t xml:space="preserve">	10</w:t>
+        <w:t xml:space="preserve">	11</w:t>
       </w:r>
     </w:p>
     <w:p>
@@ -844,7 +844,7 @@
           <w:sz w:val="20"/>
           <w:szCs w:val="20"/>
         </w:rPr>
-        <w:t xml:space="preserve">	11</w:t>
+        <w:t xml:space="preserve">	12</w:t>
       </w:r>
     </w:p>
     <w:p>
@@ -873,7 +873,7 @@
           <w:sz w:val="20"/>
           <w:szCs w:val="20"/>
         </w:rPr>
-        <w:t xml:space="preserve">	11</w:t>
+        <w:t xml:space="preserve">	12</w:t>
       </w:r>
     </w:p>
     <w:p>
@@ -902,7 +902,7 @@
           <w:sz w:val="20"/>
           <w:szCs w:val="20"/>
         </w:rPr>
-        <w:t xml:space="preserve">	13</w:t>
+        <w:t xml:space="preserve">	14</w:t>
       </w:r>
     </w:p>
     <w:p>
@@ -931,7 +931,7 @@
           <w:sz w:val="20"/>
           <w:szCs w:val="20"/>
         </w:rPr>
-        <w:t xml:space="preserve">	13</w:t>
+        <w:t xml:space="preserve">	14</w:t>
       </w:r>
     </w:p>
     <w:p>
@@ -960,7 +960,7 @@
           <w:sz w:val="20"/>
           <w:szCs w:val="20"/>
         </w:rPr>
-        <w:t xml:space="preserve">	14</w:t>
+        <w:t xml:space="preserve">	15</w:t>
       </w:r>
     </w:p>
     <w:p>
@@ -1148,7 +1148,7 @@
           <w:sz w:val="22"/>
           <w:szCs w:val="22"/>
         </w:rPr>
-        <w:t xml:space="preserve">A Olist registrou R$ 15,68 milhões em receita e 97.905 pedidos entre janeiro de 2017 e agosto de 2018. No período, a receita mensal saiu de R$ 137 mil para cerca de R$ 1 milhão, um crescimento próximo de 628%.</w:t>
+        <w:t xml:space="preserve">Neste relatório, receita significa o valor transacionado nos pedidos, calculado como preço dos itens somado ao frete. Não é a receita líquida nem a comissão da Olist, que a base não informa. Todas as conclusões devem ser lidas sob essa definição.</w:t>
       </w:r>
     </w:p>
     <w:p>
@@ -1163,7 +1163,7 @@
           <w:sz w:val="22"/>
           <w:szCs w:val="22"/>
         </w:rPr>
-        <w:t xml:space="preserve">Esse número, isolado, conduz a uma conclusão errada. Ele descreve o desempenho de 2017. A partir do início de 2018 a receita deixa de crescer e passa a oscilar no mesmo patamar, e a média mensal do segundo quadrimestre é 4,3% inferior à do primeiro. Projetar o ritmo passado para frente seria o erro mais custoso que um investidor poderia cometer com estes dados.</w:t>
+        <w:t xml:space="preserve">A Olist transacionou R$ 15,68 milhões em 97.905 pedidos entre janeiro de 2017 e agosto de 2018. No período, o valor mensal saiu de R$ 137 mil para cerca de R$ 1 milhão, um crescimento próximo de 628%.</w:t>
       </w:r>
     </w:p>
     <w:p>
@@ -1178,7 +1178,22 @@
           <w:sz w:val="22"/>
           <w:szCs w:val="22"/>
         </w:rPr>
-        <w:t xml:space="preserve">A causa da estabilização foi identificada. Ao longo de 2018 a base de vendedores ativos cresceu 30,8%, enquanto o número de clientes recuou 10% e a receita por vendedor caiu 30,8%. A plataforma continuou atraindo quem vende sem atrair quem compra na mesma velocidade. O limite do crescimento está na demanda, não na oferta.</w:t>
+        <w:t xml:space="preserve">Esse número, isolado, conduz a uma conclusão errada. Ele descreve o desempenho de 2017. A partir do início de 2018 a receita deixa de crescer e passa a oscilar no mesmo patamar, e a média mensal recua 2,6% de janeiro-abril para maio-julho. Projetar o ritmo passado para frente seria o erro mais custoso que um investidor poderia cometer com estes dados.</w:t>
+      </w:r>
+    </w:p>
+    <w:p>
+      <w:pPr>
+        <w:spacing w:after="160" w:line="300"/>
+        <w:jc w:val="both"/>
+      </w:pPr>
+      <w:r>
+        <w:rPr>
+          <w:rFonts w:ascii="Calibri" w:cs="Calibri" w:eastAsia="Calibri" w:hAnsi="Calibri"/>
+          <w:color w:val="444444"/>
+          <w:sz w:val="22"/>
+          <w:szCs w:val="22"/>
+        </w:rPr>
+        <w:t xml:space="preserve">A causa da estabilização foi identificada. Entre janeiro e julho de 2018 a base de vendedores ativos cresceu 28,6%, enquanto o número de clientes recuou 12,9% e a receita por vendedor caiu 26,6%. A plataforma continuou atraindo quem vende sem atrair quem compra na mesma velocidade. O limite do crescimento está na demanda, não na oferta.</w:t>
       </w:r>
     </w:p>
     <w:p>
@@ -1314,7 +1329,7 @@
                 <w:sz w:val="20"/>
                 <w:szCs w:val="20"/>
               </w:rPr>
-              <w:t xml:space="preserve">Receita (jan/2017 a ago/2018)</w:t>
+              <w:t xml:space="preserve">Valor transacionado (jan/2017 a ago/2018)</w:t>
             </w:r>
           </w:p>
         </w:tc>
@@ -1476,7 +1491,7 @@
                 <w:sz w:val="20"/>
                 <w:szCs w:val="20"/>
               </w:rPr>
-              <w:t xml:space="preserve">Variação do 2º sobre o 1º quadrimestre de 2018</w:t>
+              <w:t xml:space="preserve">Variação de jan-abr para mai-jul de 2018</w:t>
             </w:r>
           </w:p>
         </w:tc>
@@ -1502,7 +1517,7 @@
                 <w:sz w:val="20"/>
                 <w:szCs w:val="20"/>
               </w:rPr>
-              <w:t xml:space="preserve">-4,3%</w:t>
+              <w:t xml:space="preserve">-2,6%</w:t>
             </w:r>
           </w:p>
         </w:tc>
@@ -1692,7 +1707,7 @@
                 <w:sz w:val="20"/>
                 <w:szCs w:val="20"/>
               </w:rPr>
-              <w:t xml:space="preserve">Vendedores ativos em 2018</w:t>
+              <w:t xml:space="preserve">Vendedores ativos (jan a jul/2018)</w:t>
             </w:r>
           </w:p>
         </w:tc>
@@ -1718,7 +1733,7 @@
                 <w:sz w:val="20"/>
                 <w:szCs w:val="20"/>
               </w:rPr>
-              <w:t xml:space="preserve">968 para 1.266 (+30,8%)</w:t>
+              <w:t xml:space="preserve">968 para 1.245 (+28,6%)</w:t>
             </w:r>
           </w:p>
         </w:tc>
@@ -1746,7 +1761,7 @@
                 <w:sz w:val="20"/>
                 <w:szCs w:val="20"/>
               </w:rPr>
-              <w:t xml:space="preserve">Clientes em 2018</w:t>
+              <w:t xml:space="preserve">Clientes (jan a jul/2018)</w:t>
             </w:r>
           </w:p>
         </w:tc>
@@ -1772,7 +1787,7 @@
                 <w:sz w:val="20"/>
                 <w:szCs w:val="20"/>
               </w:rPr>
-              <w:t xml:space="preserve">7.088 para 6.380 (-10,0%)</w:t>
+              <w:t xml:space="preserve">7.088 para 6.172 (-12,9%)</w:t>
             </w:r>
           </w:p>
         </w:tc>
@@ -1800,7 +1815,7 @@
                 <w:sz w:val="20"/>
                 <w:szCs w:val="20"/>
               </w:rPr>
-              <w:t xml:space="preserve">Receita por vendedor em 2018</w:t>
+              <w:t xml:space="preserve">Valor por vendedor (jan a jul/2018)</w:t>
             </w:r>
           </w:p>
         </w:tc>
@@ -1826,7 +1841,7 @@
                 <w:sz w:val="20"/>
                 <w:szCs w:val="20"/>
               </w:rPr>
-              <w:t xml:space="preserve">R$ 1.138 para R$ 787 (-30,8%)</w:t>
+              <w:t xml:space="preserve">R$ 1.138 para R$ 835 (-26,6%)</w:t>
             </w:r>
           </w:p>
         </w:tc>
@@ -2007,7 +2022,7 @@
           <w:sz w:val="22"/>
           <w:szCs w:val="22"/>
         </w:rPr>
-        <w:t xml:space="preserve">Os dados foram organizados em um modelo dimensional, com uma tabela fato no grão de item de pedido e tabelas dimensão de cliente, produto, vendedor e data. O tratamento está isolado em um notebook próprio, que não aplica nenhum filtro de análise, de modo que todas as frentes do projeto partem da mesma base.</w:t>
+        <w:t xml:space="preserve">Os dados foram organizados em um modelo dimensional, com uma tabela fato no grão de item de pedido e tabelas dimensão de cliente, produto e vendedor. O tratamento está isolado em um notebook próprio, que não aplica nenhum filtro de análise, de modo que todas as frentes do projeto partem da mesma base.</w:t>
       </w:r>
     </w:p>
     <w:p>
@@ -2483,6 +2498,21 @@
           <w:szCs w:val="22"/>
         </w:rPr>
         <w:t xml:space="preserve">A exclusão de pedidos cancelados e indisponíveis também foi verificada antes de aplicada. Quase nenhum pedido com status unavailable possui produto associado, apenas 1,0% deles, e nos canceled o índice é de 73,8%, enquanto nos demais status o índice fica em 99% ou mais. Vendas que não se concretizaram não compõem receita.</w:t>
+      </w:r>
+    </w:p>
+    <w:p>
+      <w:pPr>
+        <w:spacing w:after="160" w:line="300"/>
+        <w:jc w:val="both"/>
+      </w:pPr>
+      <w:r>
+        <w:rPr>
+          <w:rFonts w:ascii="Calibri" w:cs="Calibri" w:eastAsia="Calibri" w:hAnsi="Calibri"/>
+          <w:color w:val="444444"/>
+          <w:sz w:val="22"/>
+          <w:szCs w:val="22"/>
+        </w:rPr>
+        <w:t xml:space="preserve">A ponta final também foi verificada. Agosto de 2018 tem coleta apenas até o dia 29, e os últimos seis dias já vêm decaindo, contra uma média de 264 pedidos por dia nas três primeiras semanas. Falta perto de um quarto do mês. Agosto foi mantido no recorte por conter três semanas de venda real, ao contrário dos meses de 2016 que foram excluídos, mas não é utilizado como ponto final de comparação: as variações de 2018 apresentadas neste relatório usam janeiro e julho, os dois meses fechados que delimitam o ano na base.</w:t>
       </w:r>
     </w:p>
     <w:p>
@@ -2643,7 +2673,7 @@
           <w:sz w:val="22"/>
           <w:szCs w:val="22"/>
         </w:rPr>
-        <w:t xml:space="preserve">O gráfico revela duas fases distintas. Durante 2017 o crescimento é consistente. A partir do início de 2018 a curva se achata e passa a oscilar em torno de R$ 1 milhão mensais. Comparando os dois quadrimestres de 2018, a média mensal recua de R$ 1,10 milhão para R$ 1,05 milhão.</w:t>
+        <w:t xml:space="preserve">O gráfico revela duas fases distintas. Durante 2017 o crescimento é consistente. A partir do início de 2018 a curva se achata e passa a oscilar em torno de R$ 1 milhão mensais. Considerando apenas meses fechados, a média mensal recua de R$ 1,10 milhão em janeiro-abril para R$ 1,07 milhão em maio-julho, uma queda de 2,6%. O último ponto da série está abaixo do patamar real porque agosto está incompleto.</w:t>
       </w:r>
     </w:p>
     <w:p>
@@ -2815,7 +2845,7 @@
           <w:sz w:val="22"/>
           <w:szCs w:val="22"/>
         </w:rPr>
-        <w:t xml:space="preserve">O pico é sazonalidade de varejo e não um novo nível de operação. A capacidade de absorver uma demanda dessa magnitude, por outro lado, é um ponto positivo da plataforma.</w:t>
+        <w:t xml:space="preserve">O pico é sazonalidade de varejo e não um novo nível de operação. A plataforma absorveu o volume, mas com custo: os pedidos feitos naquele fim de semana atrasaram em 18,3% dos casos, contra 6,8% na média do período, o que indica que a operação opera perto do limite em data promocional.</w:t>
       </w:r>
     </w:p>
     <w:p>
@@ -3021,7 +3051,7 @@
                 <w:sz w:val="20"/>
                 <w:szCs w:val="20"/>
               </w:rPr>
-              <w:t xml:space="preserve">Agosto 2018</w:t>
+              <w:t xml:space="preserve">Julho 2018</w:t>
             </w:r>
           </w:p>
         </w:tc>
@@ -3128,7 +3158,7 @@
                 <w:sz w:val="20"/>
                 <w:szCs w:val="20"/>
               </w:rPr>
-              <w:t xml:space="preserve">1.266</w:t>
+              <w:t xml:space="preserve">1.245</w:t>
             </w:r>
           </w:p>
         </w:tc>
@@ -3154,7 +3184,7 @@
                 <w:sz w:val="20"/>
                 <w:szCs w:val="20"/>
               </w:rPr>
-              <w:t xml:space="preserve">+30,8%</w:t>
+              <w:t xml:space="preserve">+28,6%</w:t>
             </w:r>
           </w:p>
         </w:tc>
@@ -3234,7 +3264,7 @@
                 <w:sz w:val="20"/>
                 <w:szCs w:val="20"/>
               </w:rPr>
-              <w:t xml:space="preserve">6.380</w:t>
+              <w:t xml:space="preserve">6.172</w:t>
             </w:r>
           </w:p>
         </w:tc>
@@ -3260,7 +3290,7 @@
                 <w:sz w:val="20"/>
                 <w:szCs w:val="20"/>
               </w:rPr>
-              <w:t xml:space="preserve">-10,0%</w:t>
+              <w:t xml:space="preserve">-12,9%</w:t>
             </w:r>
           </w:p>
         </w:tc>
@@ -3288,7 +3318,7 @@
                 <w:sz w:val="20"/>
                 <w:szCs w:val="20"/>
               </w:rPr>
-              <w:t xml:space="preserve">Receita por vendedor</w:t>
+              <w:t xml:space="preserve">Valor por vendedor</w:t>
             </w:r>
           </w:p>
         </w:tc>
@@ -3340,7 +3370,7 @@
                 <w:sz w:val="20"/>
                 <w:szCs w:val="20"/>
               </w:rPr>
-              <w:t xml:space="preserve">R$ 787</w:t>
+              <w:t xml:space="preserve">R$ 835</w:t>
             </w:r>
           </w:p>
         </w:tc>
@@ -3366,7 +3396,7 @@
                 <w:sz w:val="20"/>
                 <w:szCs w:val="20"/>
               </w:rPr>
-              <w:t xml:space="preserve">-30,8%</w:t>
+              <w:t xml:space="preserve">-26,6%</w:t>
             </w:r>
           </w:p>
         </w:tc>
@@ -3392,7 +3422,7 @@
           <w:sz w:val="22"/>
           <w:szCs w:val="22"/>
         </w:rPr>
-        <w:t xml:space="preserve">A oferta continuou crescendo. A demanda recuou. Como consequência, o mesmo volume de vendas passou a ser distribuído entre um número maior de vendedores, e o resultado individual de cada um caiu quase um terço em oito meses.</w:t>
+        <w:t xml:space="preserve">A oferta continuou crescendo. A demanda recuou. Como consequência, o mesmo volume de vendas passou a ser distribuído entre um número maior de vendedores, e o resultado individual de cada um caiu mais de um quarto em sete meses.</w:t>
       </w:r>
     </w:p>
     <w:p>
@@ -4116,96 +4146,7 @@
           <w:sz w:val="22"/>
           <w:szCs w:val="22"/>
         </w:rPr>
-        <w:t xml:space="preserve">Não foi aplicado modelo de tendência nem decomposição sazonal. O recorte tem vinte meses e um único novembro, e sem ao menos dois ciclos completos não há como estimar componente sazonal.</w:t>
-      </w:r>
-    </w:p>
-    <w:p>
-      <w:pPr>
-        <w:keepNext/>
-        <w:pBdr>
-          <w:bottom w:val="single" w:color="D9D9D9" w:sz="6" w:space="6"/>
-        </w:pBdr>
-        <w:spacing w:after="180" w:before="360"/>
-      </w:pPr>
-      <w:r>
-        <w:rPr>
-          <w:rFonts w:ascii="Calibri" w:cs="Calibri" w:eastAsia="Calibri" w:hAnsi="Calibri"/>
-          <w:b/>
-          <w:bCs/>
-          <w:color w:val="ED1064"/>
-          <w:sz w:val="30"/>
-          <w:szCs w:val="30"/>
-        </w:rPr>
-        <w:t xml:space="preserve">7. Conclusões e recomendações</w:t>
-      </w:r>
-    </w:p>
-    <w:p>
-      <w:pPr>
-        <w:spacing w:after="160" w:line="300"/>
-        <w:jc w:val="both"/>
-      </w:pPr>
-      <w:r>
-        <w:rPr>
-          <w:rFonts w:ascii="Calibri" w:cs="Calibri" w:eastAsia="Calibri" w:hAnsi="Calibri"/>
-          <w:color w:val="444444"/>
-          <w:sz w:val="22"/>
-          <w:szCs w:val="22"/>
-        </w:rPr>
-        <w:t xml:space="preserve">A Olist demonstrou capacidade de crescer rapidamente e construiu uma base diversificada de produtos e vendedores, sem dependência de fornecedor ou categoria específica. Absorveu um pico de demanda seis vezes superior ao normal sem ruptura operacional.</w:t>
-      </w:r>
-    </w:p>
-    <w:p>
-      <w:pPr>
-        <w:spacing w:after="160" w:line="300"/>
-        <w:jc w:val="both"/>
-      </w:pPr>
-      <w:r>
-        <w:rPr>
-          <w:rFonts w:ascii="Calibri" w:cs="Calibri" w:eastAsia="Calibri" w:hAnsi="Calibri"/>
-          <w:color w:val="444444"/>
-          <w:sz w:val="22"/>
-          <w:szCs w:val="22"/>
-        </w:rPr>
-        <w:t xml:space="preserve">O crescimento, porém, encontrou um limite claro em 2018, e esse limite está na demanda. A empresa continua atraindo vendedores em ritmo elevado enquanto perde compradores, o que deteriora o resultado por vendedor e torna a expansão da oferta contraproducente no curto prazo.</w:t>
-      </w:r>
-    </w:p>
-    <w:p>
-      <w:pPr>
-        <w:spacing w:after="160" w:line="300"/>
-        <w:jc w:val="both"/>
-      </w:pPr>
-      <w:r>
-        <w:rPr>
-          <w:rFonts w:ascii="Calibri" w:cs="Calibri" w:eastAsia="Calibri" w:hAnsi="Calibri"/>
-          <w:color w:val="444444"/>
-          <w:sz w:val="22"/>
-          <w:szCs w:val="22"/>
-        </w:rPr>
-        <w:t xml:space="preserve">A dimensão geográfica concentra simultaneamente o principal risco e a principal oportunidade. A dependência de São Paulo expõe a receita, e os 22 estados de menor participação enfrentam prazos e custos de frete substancialmente piores, o que sugere que parte relevante desse mercado é endereçável por investimento em operação.</w:t>
-      </w:r>
-    </w:p>
-    <w:p>
-      <w:pPr>
-        <w:spacing w:after="200"/>
-      </w:pPr>
-      <w:r>
-        <w:t xml:space="preserve"/>
-      </w:r>
-    </w:p>
-    <w:p>
-      <w:pPr>
-        <w:spacing w:after="140"/>
-      </w:pPr>
-      <w:r>
-        <w:rPr>
-          <w:rFonts w:ascii="Calibri" w:cs="Calibri" w:eastAsia="Calibri" w:hAnsi="Calibri"/>
-          <w:b/>
-          <w:bCs/>
-          <w:color w:val="444444"/>
-          <w:sz w:val="22"/>
-          <w:szCs w:val="22"/>
-        </w:rPr>
-        <w:t xml:space="preserve">Recomendações, em ordem de prioridade:</w:t>
+        <w:t xml:space="preserve">Agosto de 2018 entra na média com o mês incompleto, o que puxa a projeção para baixo e a torna conservadora.</w:t>
       </w:r>
     </w:p>
     <w:p>
@@ -4225,7 +4166,96 @@
           <w:sz w:val="22"/>
           <w:szCs w:val="22"/>
         </w:rPr>
-        <w:t xml:space="preserve">Priorizar aquisição e retenção de clientes antes de ampliar a base de vendedores. A demanda é o fator limitante, e investir em oferta sem resolver esse ponto reduz ainda mais a receita por vendedor.</w:t>
+        <w:t xml:space="preserve">Não foi aplicado modelo de tendência nem decomposição sazonal. O recorte tem vinte meses e um único novembro, e sem ao menos dois ciclos completos não há como estimar componente sazonal.</w:t>
+      </w:r>
+    </w:p>
+    <w:p>
+      <w:pPr>
+        <w:keepNext/>
+        <w:pBdr>
+          <w:bottom w:val="single" w:color="D9D9D9" w:sz="6" w:space="6"/>
+        </w:pBdr>
+        <w:spacing w:after="180" w:before="360"/>
+      </w:pPr>
+      <w:r>
+        <w:rPr>
+          <w:rFonts w:ascii="Calibri" w:cs="Calibri" w:eastAsia="Calibri" w:hAnsi="Calibri"/>
+          <w:b/>
+          <w:bCs/>
+          <w:color w:val="ED1064"/>
+          <w:sz w:val="30"/>
+          <w:szCs w:val="30"/>
+        </w:rPr>
+        <w:t xml:space="preserve">7. Conclusões e recomendações</w:t>
+      </w:r>
+    </w:p>
+    <w:p>
+      <w:pPr>
+        <w:spacing w:after="160" w:line="300"/>
+        <w:jc w:val="both"/>
+      </w:pPr>
+      <w:r>
+        <w:rPr>
+          <w:rFonts w:ascii="Calibri" w:cs="Calibri" w:eastAsia="Calibri" w:hAnsi="Calibri"/>
+          <w:color w:val="444444"/>
+          <w:sz w:val="22"/>
+          <w:szCs w:val="22"/>
+        </w:rPr>
+        <w:t xml:space="preserve">A Olist demonstrou capacidade de crescer rapidamente e construiu uma base diversificada de produtos e vendedores, sem dependência de fornecedor ou categoria específica. Absorveu um pico de demanda seis vezes superior ao normal, ainda que com custo operacional visível: quem comprou no fim de semana da Black Friday esperou 16,9 dias contra 12,1 da média do período e sofreu atraso em 18,3% dos casos contra 6,8%, quase o triplo.</w:t>
+      </w:r>
+    </w:p>
+    <w:p>
+      <w:pPr>
+        <w:spacing w:after="160" w:line="300"/>
+        <w:jc w:val="both"/>
+      </w:pPr>
+      <w:r>
+        <w:rPr>
+          <w:rFonts w:ascii="Calibri" w:cs="Calibri" w:eastAsia="Calibri" w:hAnsi="Calibri"/>
+          <w:color w:val="444444"/>
+          <w:sz w:val="22"/>
+          <w:szCs w:val="22"/>
+        </w:rPr>
+        <w:t xml:space="preserve">O crescimento, porém, encontrou um limite claro em 2018, e esse limite está na demanda. A empresa continua atraindo vendedores em ritmo elevado enquanto perde compradores, o que deteriora o resultado por vendedor e torna a expansão da oferta contraproducente no curto prazo.</w:t>
+      </w:r>
+    </w:p>
+    <w:p>
+      <w:pPr>
+        <w:spacing w:after="160" w:line="300"/>
+        <w:jc w:val="both"/>
+      </w:pPr>
+      <w:r>
+        <w:rPr>
+          <w:rFonts w:ascii="Calibri" w:cs="Calibri" w:eastAsia="Calibri" w:hAnsi="Calibri"/>
+          <w:color w:val="444444"/>
+          <w:sz w:val="22"/>
+          <w:szCs w:val="22"/>
+        </w:rPr>
+        <w:t xml:space="preserve">A dimensão geográfica concentra simultaneamente o principal risco e a principal oportunidade. A dependência de São Paulo expõe a receita, e os 22 estados de menor participação enfrentam prazos e custos de frete substancialmente piores, o que sugere que parte relevante desse mercado é endereçável por investimento em operação.</w:t>
+      </w:r>
+    </w:p>
+    <w:p>
+      <w:pPr>
+        <w:spacing w:after="200"/>
+      </w:pPr>
+      <w:r>
+        <w:t xml:space="preserve"/>
+      </w:r>
+    </w:p>
+    <w:p>
+      <w:pPr>
+        <w:spacing w:after="140"/>
+      </w:pPr>
+      <w:r>
+        <w:rPr>
+          <w:rFonts w:ascii="Calibri" w:cs="Calibri" w:eastAsia="Calibri" w:hAnsi="Calibri"/>
+          <w:b/>
+          <w:bCs/>
+          <w:color w:val="444444"/>
+          <w:sz w:val="22"/>
+          <w:szCs w:val="22"/>
+        </w:rPr>
+        <w:t xml:space="preserve">Recomendações, em ordem de prioridade:</w:t>
       </w:r>
     </w:p>
     <w:p>
@@ -4245,7 +4275,7 @@
           <w:sz w:val="22"/>
           <w:szCs w:val="22"/>
         </w:rPr>
-        <w:t xml:space="preserve">Tratar a expansão fora do Sudeste como problema logístico, não apenas comercial. Reduzir prazo e custo de frete nas regiões com pior desempenho ataca a causa, enquanto ação comercial isolada esbarra na mesma barreira de experiência.</w:t>
+        <w:t xml:space="preserve">Priorizar aquisição e retenção de clientes antes de ampliar a base de vendedores. A demanda é o fator limitante, e investir em oferta sem resolver esse ponto reduz ainda mais a receita por vendedor.</w:t>
       </w:r>
     </w:p>
     <w:p>
@@ -4265,7 +4295,7 @@
           <w:sz w:val="22"/>
           <w:szCs w:val="22"/>
         </w:rPr>
-        <w:t xml:space="preserve">Recalibrar o prazo prometido nos estados em que ele está descolado da operação, como Alagoas. É a medida de maior retorno imediato por unidade de esforço, pois melhora a experiência sem exigir mudança estrutural.</w:t>
+        <w:t xml:space="preserve">Tratar a expansão fora do Sudeste como problema logístico, não apenas comercial. Reduzir prazo e custo de frete nas regiões com pior desempenho ataca a causa, enquanto ação comercial isolada esbarra na mesma barreira de experiência.</w:t>
       </w:r>
     </w:p>
     <w:p>
@@ -4285,7 +4315,47 @@
           <w:sz w:val="22"/>
           <w:szCs w:val="22"/>
         </w:rPr>
+        <w:t xml:space="preserve">Recalibrar o prazo prometido nos estados em que ele está descolado da operação, como Alagoas. É a medida de maior retorno imediato por unidade de esforço, pois melhora a experiência sem exigir mudança estrutural.</w:t>
+      </w:r>
+    </w:p>
+    <w:p>
+      <w:pPr>
+        <w:pStyle w:val="ListParagraph"/>
+        <w:numPr>
+          <w:ilvl w:val="0"/>
+          <w:numId w:val="1"/>
+        </w:numPr>
+        <w:spacing w:after="110" w:line="300"/>
+        <w:jc w:val="both"/>
+      </w:pPr>
+      <w:r>
+        <w:rPr>
+          <w:rFonts w:ascii="Calibri" w:cs="Calibri" w:eastAsia="Calibri" w:hAnsi="Calibri"/>
+          <w:color w:val="444444"/>
+          <w:sz w:val="22"/>
+          <w:szCs w:val="22"/>
+        </w:rPr>
         <w:t xml:space="preserve">Monitorar a receita por vendedor como indicador de saúde da plataforma. A queda de quase um terço em oito meses é o sinal mais direto de desequilíbrio entre oferta e demanda.</w:t>
+      </w:r>
+    </w:p>
+    <w:p>
+      <w:pPr>
+        <w:pStyle w:val="ListParagraph"/>
+        <w:numPr>
+          <w:ilvl w:val="0"/>
+          <w:numId w:val="1"/>
+        </w:numPr>
+        <w:spacing w:after="110" w:line="300"/>
+        <w:jc w:val="both"/>
+      </w:pPr>
+      <w:r>
+        <w:rPr>
+          <w:rFonts w:ascii="Calibri" w:cs="Calibri" w:eastAsia="Calibri" w:hAnsi="Calibri"/>
+          <w:color w:val="444444"/>
+          <w:sz w:val="22"/>
+          <w:szCs w:val="22"/>
+        </w:rPr>
+        <w:t xml:space="preserve">Não tratar o valor transacionado como receita da plataforma em nenhuma decisão de aporte. O que este relatório mede é o volume que passa pelo canal, e a remuneração da Olist é uma fração dele que a base não revela. Antes de qualquer avaliação de retorno, é preciso enriquecer a base com comissão, taxas e custo de aquisição.</w:t>
       </w:r>
     </w:p>
     <w:p>

</xml_diff>

<commit_message>
Ajusta o sumario executivo para nao deixar pagina orfa
</commit_message>
<xml_diff>
--- a/reports/relatorio_executivo_olist.docx
+++ b/reports/relatorio_executivo_olist.docx
@@ -554,7 +554,7 @@
           <w:sz w:val="20"/>
           <w:szCs w:val="20"/>
         </w:rPr>
-        <w:t xml:space="preserve">	5</w:t>
+        <w:t xml:space="preserve">	4</w:t>
       </w:r>
     </w:p>
     <w:p>
@@ -583,7 +583,7 @@
           <w:sz w:val="20"/>
           <w:szCs w:val="20"/>
         </w:rPr>
-        <w:t xml:space="preserve">	5</w:t>
+        <w:t xml:space="preserve">	4</w:t>
       </w:r>
     </w:p>
     <w:p>
@@ -612,7 +612,7 @@
           <w:sz w:val="20"/>
           <w:szCs w:val="20"/>
         </w:rPr>
-        <w:t xml:space="preserve">	5</w:t>
+        <w:t xml:space="preserve">	4</w:t>
       </w:r>
     </w:p>
     <w:p>
@@ -641,7 +641,7 @@
           <w:sz w:val="20"/>
           <w:szCs w:val="20"/>
         </w:rPr>
-        <w:t xml:space="preserve">	6</w:t>
+        <w:t xml:space="preserve">	5</w:t>
       </w:r>
     </w:p>
     <w:p>
@@ -670,7 +670,7 @@
           <w:sz w:val="20"/>
           <w:szCs w:val="20"/>
         </w:rPr>
-        <w:t xml:space="preserve">	7</w:t>
+        <w:t xml:space="preserve">	6</w:t>
       </w:r>
     </w:p>
     <w:p>
@@ -699,7 +699,7 @@
           <w:sz w:val="20"/>
           <w:szCs w:val="20"/>
         </w:rPr>
-        <w:t xml:space="preserve">	7</w:t>
+        <w:t xml:space="preserve">	6</w:t>
       </w:r>
     </w:p>
     <w:p>
@@ -728,7 +728,7 @@
           <w:sz w:val="20"/>
           <w:szCs w:val="20"/>
         </w:rPr>
-        <w:t xml:space="preserve">	7</w:t>
+        <w:t xml:space="preserve">	6</w:t>
       </w:r>
     </w:p>
     <w:p>
@@ -757,7 +757,7 @@
           <w:sz w:val="20"/>
           <w:szCs w:val="20"/>
         </w:rPr>
-        <w:t xml:space="preserve">	9</w:t>
+        <w:t xml:space="preserve">	8</w:t>
       </w:r>
     </w:p>
     <w:p>
@@ -786,7 +786,7 @@
           <w:sz w:val="20"/>
           <w:szCs w:val="20"/>
         </w:rPr>
-        <w:t xml:space="preserve">	9</w:t>
+        <w:t xml:space="preserve">	8</w:t>
       </w:r>
     </w:p>
     <w:p>
@@ -815,7 +815,7 @@
           <w:sz w:val="20"/>
           <w:szCs w:val="20"/>
         </w:rPr>
-        <w:t xml:space="preserve">	11</w:t>
+        <w:t xml:space="preserve">	10</w:t>
       </w:r>
     </w:p>
     <w:p>
@@ -844,7 +844,7 @@
           <w:sz w:val="20"/>
           <w:szCs w:val="20"/>
         </w:rPr>
-        <w:t xml:space="preserve">	12</w:t>
+        <w:t xml:space="preserve">	11</w:t>
       </w:r>
     </w:p>
     <w:p>
@@ -873,7 +873,7 @@
           <w:sz w:val="20"/>
           <w:szCs w:val="20"/>
         </w:rPr>
-        <w:t xml:space="preserve">	12</w:t>
+        <w:t xml:space="preserve">	11</w:t>
       </w:r>
     </w:p>
     <w:p>
@@ -902,7 +902,7 @@
           <w:sz w:val="20"/>
           <w:szCs w:val="20"/>
         </w:rPr>
-        <w:t xml:space="preserve">	14</w:t>
+        <w:t xml:space="preserve">	13</w:t>
       </w:r>
     </w:p>
     <w:p>
@@ -931,7 +931,7 @@
           <w:sz w:val="20"/>
           <w:szCs w:val="20"/>
         </w:rPr>
-        <w:t xml:space="preserve">	14</w:t>
+        <w:t xml:space="preserve">	13</w:t>
       </w:r>
     </w:p>
     <w:p>
@@ -960,7 +960,7 @@
           <w:sz w:val="20"/>
           <w:szCs w:val="20"/>
         </w:rPr>
-        <w:t xml:space="preserve">	15</w:t>
+        <w:t xml:space="preserve">	14</w:t>
       </w:r>
     </w:p>
     <w:p>
@@ -1148,7 +1148,7 @@
           <w:sz w:val="22"/>
           <w:szCs w:val="22"/>
         </w:rPr>
-        <w:t xml:space="preserve">Neste relatório, receita significa o valor transacionado nos pedidos, calculado como preço dos itens somado ao frete. Não é a receita líquida nem a comissão da Olist, que a base não informa. Todas as conclusões devem ser lidas sob essa definição.</w:t>
+        <w:t xml:space="preserve">Neste relatório, receita significa valor transacionado, o preço dos itens somado ao frete. Não é a receita líquida nem a comissão da Olist, que a base não informa.</w:t>
       </w:r>
     </w:p>
     <w:p>
@@ -1163,7 +1163,7 @@
           <w:sz w:val="22"/>
           <w:szCs w:val="22"/>
         </w:rPr>
-        <w:t xml:space="preserve">A Olist transacionou R$ 15,68 milhões em 97.905 pedidos entre janeiro de 2017 e agosto de 2018. No período, o valor mensal saiu de R$ 137 mil para cerca de R$ 1 milhão, um crescimento próximo de 628%.</w:t>
+        <w:t xml:space="preserve">A Olist transacionou R$ 15,68 milhões em 97.905 pedidos entre janeiro de 2017 e agosto de 2018. O valor mensal saiu de R$ 137 mil para cerca de R$ 1 milhão, um crescimento próximo de 628%.</w:t>
       </w:r>
     </w:p>
     <w:p>
@@ -1178,7 +1178,7 @@
           <w:sz w:val="22"/>
           <w:szCs w:val="22"/>
         </w:rPr>
-        <w:t xml:space="preserve">Esse número, isolado, conduz a uma conclusão errada. Ele descreve o desempenho de 2017. A partir do início de 2018 a receita deixa de crescer e passa a oscilar no mesmo patamar, e a média mensal recua 2,6% de janeiro-abril para maio-julho. Projetar o ritmo passado para frente seria o erro mais custoso que um investidor poderia cometer com estes dados.</w:t>
+        <w:t xml:space="preserve">Esse número, isolado, conduz a uma conclusão errada. Ele descreve o desempenho de 2017. A partir do início de 2018 a receita deixa de crescer e a média mensal recua 2,6% de janeiro-abril para maio-julho. Projetar o ritmo passado para frente seria o erro mais custoso possível com estes dados.</w:t>
       </w:r>
     </w:p>
     <w:p>
@@ -1193,7 +1193,7 @@
           <w:sz w:val="22"/>
           <w:szCs w:val="22"/>
         </w:rPr>
-        <w:t xml:space="preserve">A causa da estabilização foi identificada. Entre janeiro e julho de 2018 a base de vendedores ativos cresceu 28,6%, enquanto o número de clientes recuou 12,9% e a receita por vendedor caiu 26,6%. A plataforma continuou atraindo quem vende sem atrair quem compra na mesma velocidade. O limite do crescimento está na demanda, não na oferta.</w:t>
+        <w:t xml:space="preserve">A causa da estabilização foi identificada. Entre janeiro e julho de 2018 a base de vendedores ativos cresceu 28,6%, enquanto o número de clientes recuou 12,9% e o valor por vendedor caiu 26,6%. A plataforma continuou atraindo quem vende sem atrair quem compra na mesma velocidade. O limite do crescimento está na demanda, não na oferta.</w:t>
       </w:r>
     </w:p>
     <w:p>
@@ -1223,7 +1223,7 @@
           <w:sz w:val="22"/>
           <w:szCs w:val="22"/>
         </w:rPr>
-        <w:t xml:space="preserve">Essa distinção é decisiva para a tese de investimento. Um mercado que não compra é um problema sem solução simples. Uma operação que não entrega é um problema endereçável com capital.</w:t>
+        <w:t xml:space="preserve">Essa distinção é decisiva para a tese de investimento. Um mercado que não compra é um problema sem solução simples. Uma operação que não entrega é um problema endereçável com capital. As recomendações priorizadas estão na seção 7.</w:t>
       </w:r>
     </w:p>
     <w:p>
@@ -1901,29 +1901,6 @@
         </w:tc>
       </w:tr>
     </w:tbl>
-    <w:p>
-      <w:pPr>
-        <w:spacing w:after="200"/>
-      </w:pPr>
-      <w:r>
-        <w:t xml:space="preserve"/>
-      </w:r>
-    </w:p>
-    <w:p>
-      <w:pPr>
-        <w:spacing w:after="160" w:line="300"/>
-        <w:jc w:val="both"/>
-      </w:pPr>
-      <w:r>
-        <w:rPr>
-          <w:rFonts w:ascii="Calibri" w:cs="Calibri" w:eastAsia="Calibri" w:hAnsi="Calibri"/>
-          <w:color w:val="444444"/>
-          <w:sz w:val="22"/>
-          <w:szCs w:val="22"/>
-        </w:rPr>
-        <w:t xml:space="preserve">As recomendações priorizadas estão na seção 7.</w:t>
-      </w:r>
-    </w:p>
     <w:p>
       <w:pPr>
         <w:keepNext/>

</xml_diff>

<commit_message>
Corrige a generalizacao geografica de 'fora do Sudeste' para 'fora dos cinco estados lideres' no relatorio, apresentacao, notebook e achados
</commit_message>
<xml_diff>
--- a/reports/relatorio_executivo_olist.docx
+++ b/reports/relatorio_executivo_olist.docx
@@ -3560,7 +3560,7 @@
           <w:sz w:val="22"/>
           <w:szCs w:val="22"/>
         </w:rPr>
-        <w:t xml:space="preserve">Duas hipóteses explicariam a concentração geográfica. A primeira é que o mercado fora do Sudeste simplesmente compra menos, por população e renda. A segunda é que a experiência de compra é pior nessas regiões. As duas conduzem a decisões opostas, e por isso foram testadas.</w:t>
+        <w:t xml:space="preserve">Duas hipóteses explicariam a concentração geográfica. A primeira é que o mercado fora dos cinco estados líderes simplesmente compra menos, por população e renda. A segunda é que a experiência de compra é pior nessas regiões. As duas conduzem a decisões opostas, e por isso foram testadas.</w:t>
       </w:r>
     </w:p>
     <w:p>
@@ -3653,7 +3653,7 @@
           <w:sz w:val="22"/>
           <w:szCs w:val="22"/>
         </w:rPr>
-        <w:t xml:space="preserve">O custo acompanha o prazo. Em São Paulo o frete equivale a 13,8% do valor do produto, enquanto no Maranhão e em Roraima ultrapassa 26%. Fora do Sudeste, comprar demora quase o dobro e custa quase o dobro em frete.</w:t>
+        <w:t xml:space="preserve">O custo acompanha o prazo. Em São Paulo o frete equivale a 13,8% do valor do produto, enquanto no Maranhão e em Roraima ultrapassa 26%. Fora dos cinco estados líderes, comprar demora quase o dobro e custa quase o dobro em frete.</w:t>
       </w:r>
     </w:p>
     <w:p>
@@ -4272,7 +4272,7 @@
           <w:sz w:val="22"/>
           <w:szCs w:val="22"/>
         </w:rPr>
-        <w:t xml:space="preserve">Tratar a expansão fora do Sudeste como problema logístico, não apenas comercial. Reduzir prazo e custo de frete nas regiões com pior desempenho ataca a causa, enquanto ação comercial isolada esbarra na mesma barreira de experiência.</w:t>
+        <w:t xml:space="preserve">Tratar a expansão fora dos cinco estados líderes como problema logístico, não apenas comercial. Reduzir prazo e custo de frete nas regiões com pior desempenho ataca a causa, enquanto ação comercial isolada esbarra na mesma barreira de experiência.</w:t>
       </w:r>
     </w:p>
     <w:p>

</xml_diff>

<commit_message>
Ajusta precisao de linguagem: frete nos demais estados, escopo do crescimento de 628%, e significancia estatistica da recompra
</commit_message>
<xml_diff>
--- a/reports/relatorio_executivo_olist.docx
+++ b/reports/relatorio_executivo_olist.docx
@@ -1208,7 +1208,7 @@
           <w:sz w:val="22"/>
           <w:szCs w:val="22"/>
         </w:rPr>
-        <w:t xml:space="preserve">A operação ajuda a explicar onde essa demanda não se materializa. Os cinco estados que concentram 73,1% da receita recebem seus pedidos em 10,5 dias, enquanto os outros 22 esperam 17,3 dias e pagam quase o dobro de frete em proporção ao valor do produto. A correlação entre tempo de entrega e participação na receita é de -0,60.</w:t>
+        <w:t xml:space="preserve">A operação ajuda a explicar onde essa demanda não se materializa. Os cinco estados que concentram 73,1% da receita recebem seus pedidos em 10,5 dias, enquanto os outros 22 esperam 17,3 dias e pagam mais frete em proporção ao valor do produto, chegando a mais de 26% em Maranhão e Roraima. A correlação entre tempo de entrega e participação na receita é de -0,60.</w:t>
       </w:r>
     </w:p>
     <w:p>
@@ -3653,7 +3653,7 @@
           <w:sz w:val="22"/>
           <w:szCs w:val="22"/>
         </w:rPr>
-        <w:t xml:space="preserve">O custo acompanha o prazo. Em São Paulo o frete equivale a 13,8% do valor do produto, enquanto no Maranhão e em Roraima ultrapassa 26%. Fora dos cinco estados líderes, comprar demora quase o dobro e custa quase o dobro em frete.</w:t>
+        <w:t xml:space="preserve">O custo acompanha o prazo. Em São Paulo o frete equivale a 13,8% do valor do produto, enquanto no Maranhão e em Roraima ultrapassa 26%. Fora dos cinco estados líderes, comprar demora quase o dobro, e o frete pesa mais sobre o valor do produto.</w:t>
       </w:r>
     </w:p>
     <w:p>
@@ -3888,7 +3888,7 @@
           <w:sz w:val="22"/>
           <w:szCs w:val="22"/>
         </w:rPr>
-        <w:t xml:space="preserve">Entre os clientes atendidos no prazo, 4,08% voltaram a comprar. Entre os que sofreram atraso, 3,16%. A queda é de 22,6% em termos relativos e o teste de qui-quadrado devolve p-valor de 0,007, o que descarta a hipótese de acaso.</w:t>
+        <w:t xml:space="preserve">Entre os clientes atendidos no prazo, 4,08% voltaram a comprar. Entre os que sofreram atraso, 3,16%. A queda é de 22,6% em termos relativos e o teste de qui-quadrado devolve p-valor de 0,007, que indica associação estatisticamente significativa.</w:t>
       </w:r>
     </w:p>
     <w:p>

</xml_diff>